<commit_message>
Updated documentation user manual
</commit_message>
<xml_diff>
--- a/Python Script SMW200A Instructions.docx
+++ b/Python Script SMW200A Instructions.docx
@@ -2173,12 +2173,14 @@
           <w:numId w:val="33"/>
         </w:numPr>
       </w:pPr>
+      <w:proofErr w:type="spellStart"/>
       <w:r>
         <w:t>r</w:t>
       </w:r>
       <w:r>
         <w:t>sxdwstreaming</w:t>
       </w:r>
+      <w:proofErr w:type="spellEnd"/>
       <w:r>
         <w:t xml:space="preserve">: </w:t>
       </w:r>
@@ -2217,15 +2219,22 @@
           <w:numId w:val="33"/>
         </w:numPr>
       </w:pPr>
+      <w:proofErr w:type="spellStart"/>
       <w:r>
         <w:t>n</w:t>
       </w:r>
       <w:r>
-        <w:t xml:space="preserve">umpy version 1.26.3. It most likely will work with any version </w:t>
-      </w:r>
+        <w:t>umpy</w:t>
+      </w:r>
+      <w:proofErr w:type="spellEnd"/>
+      <w:r>
+        <w:t xml:space="preserve"> version 1.26.3. It most likely will work with any version </w:t>
+      </w:r>
+      <w:proofErr w:type="gramStart"/>
       <w:r>
         <w:t>previous to</w:t>
       </w:r>
+      <w:proofErr w:type="gramEnd"/>
       <w:r>
         <w:t xml:space="preserve"> 2.0, but </w:t>
       </w:r>
@@ -2286,11 +2295,16 @@
           <w:numId w:val="33"/>
         </w:numPr>
       </w:pPr>
+      <w:proofErr w:type="spellStart"/>
       <w:r>
         <w:t>r</w:t>
       </w:r>
       <w:r>
-        <w:t xml:space="preserve">skfd: </w:t>
+        <w:t>skfd</w:t>
+      </w:r>
+      <w:proofErr w:type="spellEnd"/>
+      <w:r>
+        <w:t xml:space="preserve">: </w:t>
       </w:r>
       <w:r>
         <w:t xml:space="preserve">This is a tool for instrument and data handling in R&amp;S formats. </w:t>
@@ -2338,7 +2352,15 @@
     </w:p>
     <w:p>
       <w:r>
-        <w:t>On the SMW200A:</w:t>
+        <w:t xml:space="preserve">On </w:t>
+      </w:r>
+      <w:proofErr w:type="gramStart"/>
+      <w:r>
+        <w:t>the SMW200A</w:t>
+      </w:r>
+      <w:proofErr w:type="gramEnd"/>
+      <w:r>
+        <w:t>:</w:t>
       </w:r>
     </w:p>
     <w:p>
@@ -2448,7 +2470,15 @@
         <w:t xml:space="preserve">PDWlist.csv </w:t>
       </w:r>
       <w:r>
-        <w:t>contains arb PDWs.</w:t>
+        <w:t xml:space="preserve">contains </w:t>
+      </w:r>
+      <w:proofErr w:type="gramStart"/>
+      <w:r>
+        <w:t>arb</w:t>
+      </w:r>
+      <w:proofErr w:type="gramEnd"/>
+      <w:r>
+        <w:t xml:space="preserve"> PDWs.</w:t>
       </w:r>
     </w:p>
     <w:p>
@@ -2481,7 +2511,7 @@
           <w:b/>
           <w:bCs/>
         </w:rPr>
-        <w:t>xdw_file_playback_v2.py</w:t>
+        <w:t>xdw_file_playback.py</w:t>
       </w:r>
       <w:r>
         <w:t xml:space="preserve"> – this is the script a user would run to generate the files needed for the import into the SMW200A</w:t>
@@ -2505,8 +2535,17 @@
           <w:b/>
           <w:bCs/>
         </w:rPr>
-        <w:t>*.ps_def</w:t>
-      </w:r>
+        <w:t>*.</w:t>
+      </w:r>
+      <w:proofErr w:type="spellStart"/>
+      <w:r>
+        <w:rPr>
+          <w:b/>
+          <w:bCs/>
+        </w:rPr>
+        <w:t>ps_def</w:t>
+      </w:r>
+      <w:proofErr w:type="spellEnd"/>
       <w:r>
         <w:t xml:space="preserve"> file contains the PDWs and </w:t>
       </w:r>
@@ -2532,8 +2571,17 @@
           <w:b/>
           <w:bCs/>
         </w:rPr>
-        <w:t>*.ps_adr</w:t>
-      </w:r>
+        <w:t>*.</w:t>
+      </w:r>
+      <w:proofErr w:type="spellStart"/>
+      <w:r>
+        <w:rPr>
+          <w:b/>
+          <w:bCs/>
+        </w:rPr>
+        <w:t>ps_adr</w:t>
+      </w:r>
+      <w:proofErr w:type="spellEnd"/>
       <w:r>
         <w:t xml:space="preserve"> file contains the addresses of the waveform segments (addressed by PDWs)</w:t>
       </w:r>
@@ -2568,6 +2616,7 @@
       <w:r>
         <w:t xml:space="preserve"> are example waveform files used in the csv file for use with the ‘xdw_file_playback_v2.py’ script to generate the container waveform ‘</w:t>
       </w:r>
+      <w:proofErr w:type="spellStart"/>
       <w:r>
         <w:rPr>
           <w:b/>
@@ -2575,6 +2624,7 @@
         </w:rPr>
         <w:t>IQ_expert.wv</w:t>
       </w:r>
+      <w:proofErr w:type="spellEnd"/>
       <w:r>
         <w:t>’</w:t>
       </w:r>
@@ -2622,7 +2672,15 @@
         <w:t xml:space="preserve">Doc </w:t>
       </w:r>
       <w:r>
-        <w:t>directory – Contains HTML formatted documentation for installation of the Rsxdwstreaming package</w:t>
+        <w:t xml:space="preserve">directory – Contains HTML formatted documentation for installation of the </w:t>
+      </w:r>
+      <w:proofErr w:type="spellStart"/>
+      <w:r>
+        <w:t>Rsxdwstreaming</w:t>
+      </w:r>
+      <w:proofErr w:type="spellEnd"/>
+      <w:r>
+        <w:t xml:space="preserve"> package</w:t>
       </w:r>
     </w:p>
     <w:p>
@@ -2675,20 +2733,35 @@
         <w:pStyle w:val="Heading3"/>
       </w:pPr>
       <w:bookmarkStart w:id="11" w:name="_Toc176525790"/>
+      <w:proofErr w:type="spellStart"/>
       <w:r>
         <w:t>Numpy</w:t>
       </w:r>
       <w:bookmarkEnd w:id="11"/>
+      <w:proofErr w:type="spellEnd"/>
       <w:r>
         <w:t xml:space="preserve"> </w:t>
       </w:r>
     </w:p>
     <w:p>
-      <w:r>
-        <w:t xml:space="preserve">Numpy is a package used by the script for numeric operations. </w:t>
-      </w:r>
-      <w:r>
-        <w:t xml:space="preserve">Install Numpy using the “pip” command. </w:t>
+      <w:proofErr w:type="spellStart"/>
+      <w:r>
+        <w:t>Numpy</w:t>
+      </w:r>
+      <w:proofErr w:type="spellEnd"/>
+      <w:r>
+        <w:t xml:space="preserve"> is a package used by the script for numeric operations. </w:t>
+      </w:r>
+      <w:r>
+        <w:t xml:space="preserve">Install </w:t>
+      </w:r>
+      <w:proofErr w:type="spellStart"/>
+      <w:r>
+        <w:t>Numpy</w:t>
+      </w:r>
+      <w:proofErr w:type="spellEnd"/>
+      <w:r>
+        <w:t xml:space="preserve"> using the “pip” command. </w:t>
       </w:r>
       <w:r>
         <w:rPr>
@@ -2728,7 +2801,15 @@
         <w:t xml:space="preserve">python -m </w:t>
       </w:r>
       <w:r>
-        <w:t>pip install numpy==1.26.3</w:t>
+        <w:t xml:space="preserve">pip install </w:t>
+      </w:r>
+      <w:proofErr w:type="spellStart"/>
+      <w:r>
+        <w:t>numpy</w:t>
+      </w:r>
+      <w:proofErr w:type="spellEnd"/>
+      <w:r>
+        <w:t>==1.26.3</w:t>
       </w:r>
     </w:p>
     <w:p>
@@ -2741,7 +2822,15 @@
     </w:p>
     <w:p>
       <w:r>
-        <w:t>PyQt6 is the package that enables the GUI.</w:t>
+        <w:t xml:space="preserve">PyQt6 is the package that enables </w:t>
+      </w:r>
+      <w:proofErr w:type="gramStart"/>
+      <w:r>
+        <w:t>the GUI</w:t>
+      </w:r>
+      <w:proofErr w:type="gramEnd"/>
+      <w:r>
+        <w:t>.</w:t>
       </w:r>
     </w:p>
     <w:p>
@@ -2755,10 +2844,7 @@
       </w:pPr>
       <w:r>
         <w:tab/>
-        <w:t xml:space="preserve">&gt;&gt; python -m pip install </w:t>
-      </w:r>
-      <w:r>
-        <w:t>PyQt6</w:t>
+        <w:t>&gt;&gt; python -m pip install PyQt6</w:t>
       </w:r>
     </w:p>
     <w:p>
@@ -2771,6 +2857,7 @@
         <w:pStyle w:val="Heading3"/>
       </w:pPr>
       <w:bookmarkStart w:id="12" w:name="_Toc176525791"/>
+      <w:proofErr w:type="spellStart"/>
       <w:r>
         <w:t>R</w:t>
       </w:r>
@@ -2778,6 +2865,7 @@
         <w:t>sxdwstreaming</w:t>
       </w:r>
       <w:bookmarkEnd w:id="12"/>
+      <w:proofErr w:type="spellEnd"/>
     </w:p>
     <w:p>
       <w:pPr>
@@ -2830,7 +2918,15 @@
         <w:spacing w:after="240"/>
       </w:pPr>
       <w:r>
-        <w:t>Save the rsxdwstreaming package on your computer, for example in c:\temp\</w:t>
+        <w:t xml:space="preserve">Save the </w:t>
+      </w:r>
+      <w:proofErr w:type="spellStart"/>
+      <w:r>
+        <w:t>rsxdwstreaming</w:t>
+      </w:r>
+      <w:proofErr w:type="spellEnd"/>
+      <w:r>
+        <w:t xml:space="preserve"> package on your computer, for example in c:\temp\</w:t>
       </w:r>
     </w:p>
     <w:p>
@@ -2843,7 +2939,23 @@
         <w:spacing w:after="240"/>
       </w:pPr>
       <w:r>
-        <w:t>Start the command line WinKey + R, type cmd and hit ENTER</w:t>
+        <w:t xml:space="preserve">Start the command line </w:t>
+      </w:r>
+      <w:proofErr w:type="spellStart"/>
+      <w:r>
+        <w:t>WinKey</w:t>
+      </w:r>
+      <w:proofErr w:type="spellEnd"/>
+      <w:r>
+        <w:t xml:space="preserve"> + R, type </w:t>
+      </w:r>
+      <w:proofErr w:type="spellStart"/>
+      <w:r>
+        <w:t>cmd</w:t>
+      </w:r>
+      <w:proofErr w:type="spellEnd"/>
+      <w:r>
+        <w:t xml:space="preserve"> and hit ENTER</w:t>
       </w:r>
     </w:p>
     <w:p>
@@ -2857,7 +2969,15 @@
       </w:pPr>
       <w:r>
         <w:lastRenderedPageBreak/>
-        <w:t>Change the working directory to the Python installation of your choice (adjust the user name and python version in the path):</w:t>
+        <w:t xml:space="preserve">Change the working directory to the Python installation of your choice (adjust the </w:t>
+      </w:r>
+      <w:proofErr w:type="gramStart"/>
+      <w:r>
+        <w:t>user name</w:t>
+      </w:r>
+      <w:proofErr w:type="gramEnd"/>
+      <w:r>
+        <w:t xml:space="preserve"> and python version in the path):</w:t>
       </w:r>
     </w:p>
     <w:p>
@@ -2923,14 +3043,32 @@
         <w:pStyle w:val="Heading3"/>
       </w:pPr>
       <w:bookmarkStart w:id="13" w:name="_Toc176525792"/>
+      <w:proofErr w:type="spellStart"/>
       <w:r>
         <w:t>Rsfkd</w:t>
       </w:r>
       <w:bookmarkEnd w:id="13"/>
-    </w:p>
-    <w:p>
-      <w:r>
-        <w:t xml:space="preserve">The package rskfd is for instrument and data handling. Data handling mainly focuses on reading writing I/Q files in publich R&amp;S formats. To install this, please use pip </w:t>
+      <w:proofErr w:type="spellEnd"/>
+    </w:p>
+    <w:p>
+      <w:r>
+        <w:t xml:space="preserve">The package </w:t>
+      </w:r>
+      <w:proofErr w:type="spellStart"/>
+      <w:r>
+        <w:t>rskfd</w:t>
+      </w:r>
+      <w:proofErr w:type="spellEnd"/>
+      <w:r>
+        <w:t xml:space="preserve"> is for instrument and data handling. Data handling mainly focuses on reading writing I/Q files in </w:t>
+      </w:r>
+      <w:proofErr w:type="spellStart"/>
+      <w:r>
+        <w:t>publich</w:t>
+      </w:r>
+      <w:proofErr w:type="spellEnd"/>
+      <w:r>
+        <w:t xml:space="preserve"> R&amp;S formats. To install this, please use pip </w:t>
       </w:r>
     </w:p>
     <w:p>
@@ -2941,8 +3079,13 @@
         <w:t xml:space="preserve">python -m </w:t>
       </w:r>
       <w:r>
-        <w:t>pip install rskfd</w:t>
-      </w:r>
+        <w:t xml:space="preserve">pip install </w:t>
+      </w:r>
+      <w:proofErr w:type="spellStart"/>
+      <w:r>
+        <w:t>rskfd</w:t>
+      </w:r>
+      <w:proofErr w:type="spellEnd"/>
     </w:p>
     <w:p>
       <w:pPr>
@@ -3166,7 +3309,21 @@
         <w:rPr>
           <w:rFonts w:ascii="Arial" w:hAnsi="Arial" w:cs="Arial"/>
         </w:rPr>
-        <w:t xml:space="preserve">The script searches for the following terms: Type, TOA, Mod, Arb, RF, Pulse Width, RF Freq, Level, Frequency Offset, Level Offset, Phase Offset, Freq Step, Chip Width, Bkr Code, Stuff, Burst PRI, Number of Pulses, Marker 1, Marker 2, and Marker 3. Columns that do not contain these terms will be ignored in the input file. </w:t>
+        <w:t xml:space="preserve">The script searches for the following terms: Type, TOA, Mod, Arb, RF, Pulse Width, RF Freq, Level, Frequency Offset, Level Offset, Phase Offset, Freq Step, Chip Width, </w:t>
+      </w:r>
+      <w:proofErr w:type="spellStart"/>
+      <w:r>
+        <w:rPr>
+          <w:rFonts w:ascii="Arial" w:hAnsi="Arial" w:cs="Arial"/>
+        </w:rPr>
+        <w:t>Bkr</w:t>
+      </w:r>
+      <w:proofErr w:type="spellEnd"/>
+      <w:r>
+        <w:rPr>
+          <w:rFonts w:ascii="Arial" w:hAnsi="Arial" w:cs="Arial"/>
+        </w:rPr>
+        <w:t xml:space="preserve"> Code, Stuff, Burst PRI, Number of Pulses, Marker 1, Marker 2, and Marker 3. Columns that do not contain these terms will be ignored in the input file. </w:t>
       </w:r>
       <w:r>
         <w:rPr>
@@ -3432,9 +3589,19 @@
             <w:hideMark/>
           </w:tcPr>
           <w:p>
-            <w:r>
-              <w:t>tdcw, pdw</w:t>
-            </w:r>
+            <w:proofErr w:type="spellStart"/>
+            <w:r>
+              <w:t>tdcw</w:t>
+            </w:r>
+            <w:proofErr w:type="spellEnd"/>
+            <w:r>
+              <w:t xml:space="preserve">, </w:t>
+            </w:r>
+            <w:proofErr w:type="spellStart"/>
+            <w:r>
+              <w:t>pdw</w:t>
+            </w:r>
+            <w:proofErr w:type="spellEnd"/>
           </w:p>
         </w:tc>
         <w:tc>
@@ -3663,8 +3830,29 @@
           </w:tcPr>
           <w:p>
             <w:r>
-              <w:t>Sets the desired RF path to configure TCDW types rffreq, rflevel, rffreqlevel</w:t>
-            </w:r>
+              <w:t xml:space="preserve">Sets the desired RF path to configure TCDW types </w:t>
+            </w:r>
+            <w:proofErr w:type="spellStart"/>
+            <w:r>
+              <w:t>rffreq</w:t>
+            </w:r>
+            <w:proofErr w:type="spellEnd"/>
+            <w:r>
+              <w:t xml:space="preserve">, </w:t>
+            </w:r>
+            <w:proofErr w:type="spellStart"/>
+            <w:r>
+              <w:t>rflevel</w:t>
+            </w:r>
+            <w:proofErr w:type="spellEnd"/>
+            <w:r>
+              <w:t xml:space="preserve">, </w:t>
+            </w:r>
+            <w:proofErr w:type="spellStart"/>
+            <w:r>
+              <w:t>rffreqlevel</w:t>
+            </w:r>
+            <w:proofErr w:type="spellEnd"/>
           </w:p>
           <w:p>
             <w:r>
@@ -3730,8 +3918,13 @@
             </w:r>
           </w:p>
           <w:p>
-            <w:r>
-              <w:t xml:space="preserve">Tchirp, </w:t>
+            <w:proofErr w:type="spellStart"/>
+            <w:r>
+              <w:t>Tchirp</w:t>
+            </w:r>
+            <w:proofErr w:type="spellEnd"/>
+            <w:r>
+              <w:t xml:space="preserve">, </w:t>
             </w:r>
           </w:p>
           <w:p>
@@ -3829,14 +4022,29 @@
             <w:hideMark/>
           </w:tcPr>
           <w:p>
-            <w:r>
-              <w:t>rffreq, rflevel</w:t>
-            </w:r>
+            <w:proofErr w:type="spellStart"/>
+            <w:r>
+              <w:t>rffreq</w:t>
+            </w:r>
+            <w:proofErr w:type="spellEnd"/>
             <w:r>
               <w:t xml:space="preserve">, </w:t>
             </w:r>
-            <w:r>
-              <w:t xml:space="preserve">rffreqlevel, </w:t>
+            <w:proofErr w:type="spellStart"/>
+            <w:r>
+              <w:t>rflevel</w:t>
+            </w:r>
+            <w:proofErr w:type="spellEnd"/>
+            <w:r>
+              <w:t xml:space="preserve">, </w:t>
+            </w:r>
+            <w:proofErr w:type="spellStart"/>
+            <w:r>
+              <w:t>rffreqlevel</w:t>
+            </w:r>
+            <w:proofErr w:type="spellEnd"/>
+            <w:r>
+              <w:t xml:space="preserve">, </w:t>
             </w:r>
             <w:r>
               <w:t>EOF</w:t>
@@ -3891,7 +4099,15 @@
               <w:t xml:space="preserve"> </w:t>
             </w:r>
             <w:r>
-              <w:t>If ‘rffreqlevel’ is used, adjusting the RF frequency &amp; level settings with a single TOA is possible. In this case, use ‘Level Offset (dB)’ column to enter the desired RF Level</w:t>
+              <w:t>If ‘</w:t>
+            </w:r>
+            <w:proofErr w:type="spellStart"/>
+            <w:r>
+              <w:t>rffreqlevel</w:t>
+            </w:r>
+            <w:proofErr w:type="spellEnd"/>
+            <w:r>
+              <w:t>’ is used, adjusting the RF frequency &amp; level settings with a single TOA is possible. In this case, use ‘Level Offset (dB)’ column to enter the desired RF Level</w:t>
             </w:r>
           </w:p>
         </w:tc>
@@ -4263,7 +4479,15 @@
           </w:tcPr>
           <w:p>
             <w:r>
-              <w:t>In PDW, the frequency offset is added to instrument RF frequency specified in the latest rffreq TCDW.</w:t>
+              <w:t xml:space="preserve">In PDW, the frequency offset is added to instrument RF frequency specified in the latest </w:t>
+            </w:r>
+            <w:proofErr w:type="spellStart"/>
+            <w:r>
+              <w:t>rffreq</w:t>
+            </w:r>
+            <w:proofErr w:type="spellEnd"/>
+            <w:r>
+              <w:t xml:space="preserve"> TCDW.</w:t>
             </w:r>
           </w:p>
         </w:tc>
@@ -4357,13 +4581,29 @@
           </w:tcPr>
           <w:p>
             <w:r>
-              <w:t>In PDW, the level offset is subtracted from instrument RF level specified in the latest rflevel TCDW.</w:t>
+              <w:t xml:space="preserve">In PDW, the level offset is subtracted from instrument RF level specified in the latest </w:t>
+            </w:r>
+            <w:proofErr w:type="spellStart"/>
+            <w:r>
+              <w:t>rflevel</w:t>
+            </w:r>
+            <w:proofErr w:type="spellEnd"/>
+            <w:r>
+              <w:t xml:space="preserve"> TCDW.</w:t>
             </w:r>
             <w:r>
               <w:t xml:space="preserve"> </w:t>
             </w:r>
             <w:r>
-              <w:t>If using ‘rffreqlevel’ TCDW type, this column can be used to set RF level (follows same settling time guidelines as ‘Level’ column)</w:t>
+              <w:t>If using ‘</w:t>
+            </w:r>
+            <w:proofErr w:type="spellStart"/>
+            <w:r>
+              <w:t>rffreqlevel</w:t>
+            </w:r>
+            <w:proofErr w:type="spellEnd"/>
+            <w:r>
+              <w:t>’ TCDW type, this column can be used to set RF level (follows same settling time guidelines as ‘Level’ column)</w:t>
             </w:r>
           </w:p>
         </w:tc>
@@ -4645,7 +4885,15 @@
           </w:tcPr>
           <w:p>
             <w:r>
-              <w:t>In Bkr Code PDW, this specifies the chip width of one Barker code chip</w:t>
+              <w:t xml:space="preserve">In </w:t>
+            </w:r>
+            <w:proofErr w:type="spellStart"/>
+            <w:r>
+              <w:t>Bkr</w:t>
+            </w:r>
+            <w:proofErr w:type="spellEnd"/>
+            <w:r>
+              <w:t xml:space="preserve"> Code PDW, this specifies the chip width of one Barker code chip</w:t>
             </w:r>
           </w:p>
         </w:tc>
@@ -4669,8 +4917,13 @@
             <w:hideMark/>
           </w:tcPr>
           <w:p>
-            <w:r>
-              <w:t>Bkr Code</w:t>
+            <w:proofErr w:type="spellStart"/>
+            <w:r>
+              <w:t>Bkr</w:t>
+            </w:r>
+            <w:proofErr w:type="spellEnd"/>
+            <w:r>
+              <w:t xml:space="preserve"> Code</w:t>
             </w:r>
           </w:p>
         </w:tc>
@@ -4739,7 +4992,15 @@
           </w:tcPr>
           <w:p>
             <w:r>
-              <w:t>In Bkr Code PDW, this is the code to select the type of Barker code.</w:t>
+              <w:t xml:space="preserve">In </w:t>
+            </w:r>
+            <w:proofErr w:type="spellStart"/>
+            <w:r>
+              <w:t>Bkr</w:t>
+            </w:r>
+            <w:proofErr w:type="spellEnd"/>
+            <w:r>
+              <w:t xml:space="preserve"> Code PDW, this is the code to select the type of Barker code.</w:t>
             </w:r>
           </w:p>
         </w:tc>
@@ -5465,7 +5726,15 @@
     </w:p>
     <w:p>
       <w:r>
-        <w:t xml:space="preserve">Each line in the .xlsx represents a pulse with a number of repetitions based on the “Number of Pulses” field. </w:t>
+        <w:t xml:space="preserve">Each line in the .xlsx represents a pulse with </w:t>
+      </w:r>
+      <w:proofErr w:type="gramStart"/>
+      <w:r>
+        <w:t>a number of</w:t>
+      </w:r>
+      <w:proofErr w:type="gramEnd"/>
+      <w:r>
+        <w:t xml:space="preserve"> repetitions based on the “Number of Pulses” field. </w:t>
       </w:r>
     </w:p>
     <w:p>
@@ -5478,7 +5747,15 @@
     </w:p>
     <w:p>
       <w:r>
-        <w:t xml:space="preserve">The last descriptor word in the file should be a EOF (End of File) TDCW. This ensures synchronization and terminates the list. </w:t>
+        <w:t xml:space="preserve">The last descriptor word in the file should be </w:t>
+      </w:r>
+      <w:proofErr w:type="gramStart"/>
+      <w:r>
+        <w:t>a EOF</w:t>
+      </w:r>
+      <w:proofErr w:type="gramEnd"/>
+      <w:r>
+        <w:t xml:space="preserve"> (End of File) TDCW. This ensures synchronization and terminates the list. </w:t>
       </w:r>
     </w:p>
     <w:p>
@@ -5493,7 +5770,23 @@
           <w:i/>
           <w:iCs/>
         </w:rPr>
-        <w:t xml:space="preserve">Note: If you do not have a EOF TCDW as your last descriptor word, one will be appended by the script. However, it is best practice to have this included in the file. </w:t>
+        <w:t xml:space="preserve">Note: If you do not have </w:t>
+      </w:r>
+      <w:proofErr w:type="gramStart"/>
+      <w:r>
+        <w:rPr>
+          <w:i/>
+          <w:iCs/>
+        </w:rPr>
+        <w:t>a EOF</w:t>
+      </w:r>
+      <w:proofErr w:type="gramEnd"/>
+      <w:r>
+        <w:rPr>
+          <w:i/>
+          <w:iCs/>
+        </w:rPr>
+        <w:t xml:space="preserve"> TCDW as your last descriptor word, one will be appended by the script. However, it is best practice to have this included in the file. </w:t>
       </w:r>
     </w:p>
     <w:p>
@@ -5607,22 +5900,23 @@
     <w:p>
       <w:r>
         <w:tab/>
-        <w:t xml:space="preserve">&gt;&gt; </w:t>
-      </w:r>
-      <w:r>
-        <w:t>python .\xdw_file_playback_v2.py</w:t>
-      </w:r>
-    </w:p>
-    <w:p>
-      <w:r>
-        <w:rPr>
-          <w:noProof/>
-        </w:rPr>
+        <w:t>&gt;&gt;</w:t>
+      </w:r>
+      <w:r>
+        <w:t xml:space="preserve"> </w:t>
+      </w:r>
+      <w:r>
+        <w:t>python xdw_file_playback.py</w:t>
+      </w:r>
+    </w:p>
+    <w:p>
+      <w:r>
+        <w:lastRenderedPageBreak/>
         <w:drawing>
-          <wp:inline distT="0" distB="0" distL="0" distR="0" wp14:anchorId="2F112F70" wp14:editId="3DDD6BBA">
-            <wp:extent cx="6138545" cy="1985645"/>
+          <wp:inline distT="0" distB="0" distL="0" distR="0" wp14:anchorId="657D8FFB" wp14:editId="382A2E0D">
+            <wp:extent cx="3528275" cy="4114800"/>
             <wp:effectExtent l="0" t="0" r="0" b="0"/>
-            <wp:docPr id="82487268" name="Picture 1" descr="A screenshot of a computer&#10;&#10;Description automatically generated"/>
+            <wp:docPr id="1380717451" name="Picture 1"/>
             <wp:cNvGraphicFramePr>
               <a:graphicFrameLocks xmlns:a="http://schemas.openxmlformats.org/drawingml/2006/main" noChangeAspect="1"/>
             </wp:cNvGraphicFramePr>
@@ -5630,7 +5924,7 @@
               <a:graphicData uri="http://schemas.openxmlformats.org/drawingml/2006/picture">
                 <pic:pic xmlns:pic="http://schemas.openxmlformats.org/drawingml/2006/picture">
                   <pic:nvPicPr>
-                    <pic:cNvPr id="82487268" name="Picture 1" descr="A screenshot of a computer&#10;&#10;Description automatically generated"/>
+                    <pic:cNvPr id="1380717451" name=""/>
                     <pic:cNvPicPr/>
                   </pic:nvPicPr>
                   <pic:blipFill>
@@ -5642,7 +5936,7 @@
                   <pic:spPr>
                     <a:xfrm>
                       <a:off x="0" y="0"/>
-                      <a:ext cx="6138545" cy="1985645"/>
+                      <a:ext cx="3531896" cy="4119023"/>
                     </a:xfrm>
                     <a:prstGeom prst="rect">
                       <a:avLst/>
@@ -5658,20 +5952,23 @@
     <w:p/>
     <w:p>
       <w:r>
-        <w:t>Enter the .csv file name when prompted and hit “Enter”</w:t>
-      </w:r>
-    </w:p>
-    <w:p>
-      <w:r>
-        <w:rPr>
-          <w:noProof/>
-        </w:rPr>
+        <w:t>Select</w:t>
+      </w:r>
+      <w:r>
+        <w:t xml:space="preserve"> the .csv fil</w:t>
+      </w:r>
+      <w:r>
+        <w:t xml:space="preserve">e using the path or Browse button. </w:t>
+      </w:r>
+    </w:p>
+    <w:p>
+      <w:r>
         <w:lastRenderedPageBreak/>
         <w:drawing>
-          <wp:inline distT="0" distB="0" distL="0" distR="0" wp14:anchorId="7A1119FD" wp14:editId="1263B58C">
-            <wp:extent cx="6138545" cy="2266950"/>
-            <wp:effectExtent l="0" t="0" r="0" b="0"/>
-            <wp:docPr id="1448968660" name="Picture 1" descr="A screenshot of a computer&#10;&#10;Description automatically generated"/>
+          <wp:inline distT="0" distB="0" distL="0" distR="0" wp14:anchorId="2C3F9546" wp14:editId="229AA639">
+            <wp:extent cx="6138545" cy="6457315"/>
+            <wp:effectExtent l="0" t="0" r="0" b="635"/>
+            <wp:docPr id="1077529063" name="Picture 1"/>
             <wp:cNvGraphicFramePr>
               <a:graphicFrameLocks xmlns:a="http://schemas.openxmlformats.org/drawingml/2006/main" noChangeAspect="1"/>
             </wp:cNvGraphicFramePr>
@@ -5679,7 +5976,7 @@
               <a:graphicData uri="http://schemas.openxmlformats.org/drawingml/2006/picture">
                 <pic:pic xmlns:pic="http://schemas.openxmlformats.org/drawingml/2006/picture">
                   <pic:nvPicPr>
-                    <pic:cNvPr id="1448968660" name="Picture 1" descr="A screenshot of a computer&#10;&#10;Description automatically generated"/>
+                    <pic:cNvPr id="1077529063" name=""/>
                     <pic:cNvPicPr/>
                   </pic:nvPicPr>
                   <pic:blipFill>
@@ -5691,7 +5988,7 @@
                   <pic:spPr>
                     <a:xfrm>
                       <a:off x="0" y="0"/>
-                      <a:ext cx="6138545" cy="2266950"/>
+                      <a:ext cx="6138545" cy="6457315"/>
                     </a:xfrm>
                     <a:prstGeom prst="rect">
                       <a:avLst/>
@@ -5706,23 +6003,53 @@
     </w:p>
     <w:p>
       <w:r>
-        <w:t>Enter your comments which will be displayed upon selection of this file in the SMW200A. Press ENTER</w:t>
-      </w:r>
-      <w:r>
-        <w:t>.</w:t>
-      </w:r>
-    </w:p>
-    <w:p>
-      <w:r>
-        <w:rPr>
-          <w:noProof/>
-        </w:rPr>
+        <w:t>The Preview Summary shows information about the PDWs/TCDWs contained in the .csv.</w:t>
+      </w:r>
+    </w:p>
+    <w:p>
+      <w:r>
+        <w:t>Data preview lets the user scroll through the PDWs/TCDWs to ensure the tool has parsed the data correctly.</w:t>
+      </w:r>
+    </w:p>
+    <w:p>
+      <w:r>
+        <w:t xml:space="preserve">Generate </w:t>
+      </w:r>
+      <w:proofErr w:type="spellStart"/>
+      <w:r>
+        <w:t>xDW</w:t>
+      </w:r>
+      <w:proofErr w:type="spellEnd"/>
+      <w:r>
+        <w:t xml:space="preserve"> Files determines the output file names and an optional comment for user tracking purposes. </w:t>
+      </w:r>
+    </w:p>
+    <w:p>
+      <w:r>
+        <w:t xml:space="preserve">The ARB Waveform Segments section is used when the .csv contains PDWs that play ARB segments. In the window, we can select the segments and align them with their index from the .csv </w:t>
+      </w:r>
+    </w:p>
+    <w:p>
+      <w:r>
+        <w:t xml:space="preserve">When ready, click the “Generate </w:t>
+      </w:r>
+      <w:proofErr w:type="spellStart"/>
+      <w:r>
+        <w:t>xDW</w:t>
+      </w:r>
+      <w:proofErr w:type="spellEnd"/>
+      <w:r>
+        <w:t xml:space="preserve"> Files” button. The Log has information on the processed PDWs and output of the system. A window will appear to notify the user of successful completion. </w:t>
+      </w:r>
+    </w:p>
+    <w:p>
+      <w:r>
         <w:lastRenderedPageBreak/>
         <w:drawing>
-          <wp:inline distT="0" distB="0" distL="0" distR="0" wp14:anchorId="3F463EC1" wp14:editId="660217ED">
-            <wp:extent cx="6138545" cy="7284085"/>
-            <wp:effectExtent l="0" t="0" r="0" b="0"/>
-            <wp:docPr id="792576931" name="Picture 1" descr="A screen shot of a computer&#10;&#10;Description automatically generated"/>
+          <wp:inline distT="0" distB="0" distL="0" distR="0" wp14:anchorId="5FE7D316" wp14:editId="2A96DBBE">
+            <wp:extent cx="6138545" cy="3898900"/>
+            <wp:effectExtent l="0" t="0" r="0" b="6350"/>
+            <wp:docPr id="1330904074" name="Picture 1"/>
             <wp:cNvGraphicFramePr>
               <a:graphicFrameLocks xmlns:a="http://schemas.openxmlformats.org/drawingml/2006/main" noChangeAspect="1"/>
             </wp:cNvGraphicFramePr>
@@ -5730,7 +6057,7 @@
               <a:graphicData uri="http://schemas.openxmlformats.org/drawingml/2006/picture">
                 <pic:pic xmlns:pic="http://schemas.openxmlformats.org/drawingml/2006/picture">
                   <pic:nvPicPr>
-                    <pic:cNvPr id="792576931" name="Picture 1" descr="A screen shot of a computer&#10;&#10;Description automatically generated"/>
+                    <pic:cNvPr id="1330904074" name=""/>
                     <pic:cNvPicPr/>
                   </pic:nvPicPr>
                   <pic:blipFill>
@@ -5742,7 +6069,7 @@
                   <pic:spPr>
                     <a:xfrm>
                       <a:off x="0" y="0"/>
-                      <a:ext cx="6138545" cy="7284085"/>
+                      <a:ext cx="6138545" cy="3898900"/>
                     </a:xfrm>
                     <a:prstGeom prst="rect">
                       <a:avLst/>
@@ -5756,9 +6083,16 @@
       </w:r>
     </w:p>
     <w:p/>
-    <w:p>
-      <w:r>
-        <w:t xml:space="preserve">When using arb waveform PDWs, three files are generated. </w:t>
+    <w:p/>
+    <w:p>
+      <w:r>
+        <w:t>When using arb waveform PDWs, three files are generated</w:t>
+      </w:r>
+      <w:r>
+        <w:t xml:space="preserve"> based on the Output base name</w:t>
+      </w:r>
+      <w:r>
+        <w:t xml:space="preserve">. </w:t>
       </w:r>
     </w:p>
     <w:p>
@@ -5774,8 +6108,17 @@
           <w:b/>
           <w:bCs/>
         </w:rPr>
-        <w:t>*.ps_def</w:t>
-      </w:r>
+        <w:t>*.</w:t>
+      </w:r>
+      <w:proofErr w:type="spellStart"/>
+      <w:r>
+        <w:rPr>
+          <w:b/>
+          <w:bCs/>
+        </w:rPr>
+        <w:t>ps_def</w:t>
+      </w:r>
+      <w:proofErr w:type="spellEnd"/>
       <w:r>
         <w:t xml:space="preserve"> file contains the PDWs and </w:t>
       </w:r>
@@ -5801,8 +6144,17 @@
           <w:b/>
           <w:bCs/>
         </w:rPr>
-        <w:t>*.ps_adr</w:t>
-      </w:r>
+        <w:t>*.</w:t>
+      </w:r>
+      <w:proofErr w:type="spellStart"/>
+      <w:r>
+        <w:rPr>
+          <w:b/>
+          <w:bCs/>
+        </w:rPr>
+        <w:t>ps_adr</w:t>
+      </w:r>
+      <w:proofErr w:type="spellEnd"/>
       <w:r>
         <w:t xml:space="preserve"> file contains the addresses of the waveform segments (addressed by PDWs)</w:t>
       </w:r>
@@ -5818,34 +6170,52 @@
         </w:numPr>
       </w:pPr>
       <w:r>
-        <w:t>‘</w:t>
-      </w:r>
-      <w:r>
         <w:rPr>
           <w:b/>
           <w:bCs/>
         </w:rPr>
-        <w:t>IQ_expert.wv</w:t>
-      </w:r>
-      <w:r>
-        <w:t>’</w:t>
-      </w:r>
-      <w:r>
-        <w:t>. This file is generated when arb PDWs are included.</w:t>
-      </w:r>
-    </w:p>
-    <w:p>
-      <w:r>
-        <w:lastRenderedPageBreak/>
-        <w:t xml:space="preserve">When not using arb waveform PDWs, only </w:t>
+        <w:t>*</w:t>
       </w:r>
       <w:r>
         <w:rPr>
           <w:b/>
           <w:bCs/>
         </w:rPr>
-        <w:t>*.ps_def</w:t>
-      </w:r>
+        <w:t>.</w:t>
+      </w:r>
+      <w:proofErr w:type="spellStart"/>
+      <w:r>
+        <w:rPr>
+          <w:b/>
+          <w:bCs/>
+        </w:rPr>
+        <w:t>wv</w:t>
+      </w:r>
+      <w:proofErr w:type="spellEnd"/>
+      <w:r>
+        <w:t>. This file is generated when arb PDWs are included.</w:t>
+      </w:r>
+    </w:p>
+    <w:p>
+      <w:r>
+        <w:t xml:space="preserve">When not using arb waveform PDWs, only </w:t>
+      </w:r>
+      <w:r>
+        <w:rPr>
+          <w:b/>
+          <w:bCs/>
+        </w:rPr>
+        <w:t>*.</w:t>
+      </w:r>
+      <w:proofErr w:type="spellStart"/>
+      <w:r>
+        <w:rPr>
+          <w:b/>
+          <w:bCs/>
+        </w:rPr>
+        <w:t>ps_def</w:t>
+      </w:r>
+      <w:proofErr w:type="spellEnd"/>
       <w:r>
         <w:t xml:space="preserve"> file </w:t>
       </w:r>
@@ -5860,9 +6230,14 @@
       </w:pPr>
       <w:bookmarkStart w:id="23" w:name="_Toc176525800"/>
       <w:r>
-        <w:t>Transfer Script Output Files to the SMW200A</w:t>
+        <w:t xml:space="preserve">Transfer Script Output Files to </w:t>
+      </w:r>
+      <w:proofErr w:type="gramStart"/>
+      <w:r>
+        <w:t>the SMW200A</w:t>
       </w:r>
       <w:bookmarkEnd w:id="23"/>
+      <w:proofErr w:type="gramEnd"/>
     </w:p>
     <w:p>
       <w:r>
@@ -5874,7 +6249,15 @@
     </w:p>
     <w:p>
       <w:r>
-        <w:t xml:space="preserve">Type “ftp://&lt;ip address&gt;” in the Windows Explorer window. </w:t>
+        <w:t>Type “ftp://&lt;</w:t>
+      </w:r>
+      <w:proofErr w:type="spellStart"/>
+      <w:r>
+        <w:t>ip</w:t>
+      </w:r>
+      <w:proofErr w:type="spellEnd"/>
+      <w:r>
+        <w:t xml:space="preserve"> address&gt;” in the Windows Explorer window. </w:t>
       </w:r>
       <w:r>
         <w:rPr>
@@ -5927,6 +6310,7 @@
         <w:rPr>
           <w:noProof/>
         </w:rPr>
+        <w:lastRenderedPageBreak/>
         <w:drawing>
           <wp:inline distT="0" distB="0" distL="0" distR="0" wp14:anchorId="6EA5E96D" wp14:editId="2D35D09D">
             <wp:extent cx="4590476" cy="3247619"/>
@@ -6014,7 +6398,6 @@
     </w:p>
     <w:p>
       <w:r>
-        <w:lastRenderedPageBreak/>
         <w:t xml:space="preserve">More methods and information can be found in the SMW200A User Manual </w:t>
       </w:r>
       <w:hyperlink r:id="rId24" w:history="1">
@@ -6039,7 +6422,15 @@
     </w:p>
     <w:p>
       <w:r>
-        <w:t xml:space="preserve">To play the file back, it is recommended to start from a PRESET. </w:t>
+        <w:t xml:space="preserve">To play the file back, it is recommended to start </w:t>
+      </w:r>
+      <w:proofErr w:type="gramStart"/>
+      <w:r>
+        <w:t>from</w:t>
+      </w:r>
+      <w:proofErr w:type="gramEnd"/>
+      <w:r>
+        <w:t xml:space="preserve"> a PRESET. </w:t>
       </w:r>
     </w:p>
     <w:p>
@@ -6051,6 +6442,7 @@
         </w:numPr>
       </w:pPr>
       <w:r>
+        <w:lastRenderedPageBreak/>
         <w:t>Navigate to the “Baseband” -&gt; “Extended Sequencer”</w:t>
       </w:r>
       <w:r>
@@ -6155,7 +6547,15 @@
         </w:numPr>
       </w:pPr>
       <w:r>
-        <w:t>Next, press “Definition File” and navigate to the “IQ_expert.ps_def” file.</w:t>
+        <w:t>Next, press “Definition File” and navigate to the “</w:t>
+      </w:r>
+      <w:proofErr w:type="spellStart"/>
+      <w:r>
+        <w:t>IQ_expert.ps_def</w:t>
+      </w:r>
+      <w:proofErr w:type="spellEnd"/>
+      <w:r>
+        <w:t>” file.</w:t>
       </w:r>
     </w:p>
     <w:p>
@@ -6477,7 +6877,15 @@
         </w:numPr>
       </w:pPr>
       <w:r>
-        <w:t>Under “Trigger In” tab, Select “Execute Trigger” (if in Armed Retrigger Mode),</w:t>
+        <w:t xml:space="preserve">Under “Trigger In” tab, </w:t>
+      </w:r>
+      <w:proofErr w:type="gramStart"/>
+      <w:r>
+        <w:t>Select</w:t>
+      </w:r>
+      <w:proofErr w:type="gramEnd"/>
+      <w:r>
+        <w:t xml:space="preserve"> “Execute Trigger” (if in Armed Retrigger Mode),</w:t>
       </w:r>
     </w:p>
     <w:p>
@@ -6563,7 +6971,15 @@
     </w:p>
     <w:p>
       <w:r>
-        <w:t>The last PDW in the list should have Marker 1 enabled. If the last PDW entry in the list has multiple “Number of Pulses” split it such that the last pulse has one “Number of Pulses”.</w:t>
+        <w:t xml:space="preserve">The last PDW in the list should have Marker 1 enabled. If the last PDW entry in the list has multiple “Number of Pulses” </w:t>
+      </w:r>
+      <w:proofErr w:type="gramStart"/>
+      <w:r>
+        <w:t>split</w:t>
+      </w:r>
+      <w:proofErr w:type="gramEnd"/>
+      <w:r>
+        <w:t xml:space="preserve"> it such that the last pulse has one “Number of Pulses”.</w:t>
       </w:r>
     </w:p>
     <w:p>
@@ -6897,7 +7313,15 @@
     </w:p>
     <w:p>
       <w:r>
-        <w:t xml:space="preserve">Now, the file will trigger itself to replay at the beginning on the last PDW of the list. </w:t>
+        <w:t xml:space="preserve">Now, the file will trigger itself to </w:t>
+      </w:r>
+      <w:proofErr w:type="gramStart"/>
+      <w:r>
+        <w:t>replay</w:t>
+      </w:r>
+      <w:proofErr w:type="gramEnd"/>
+      <w:r>
+        <w:t xml:space="preserve"> at the beginning on the last PDW of the list. </w:t>
       </w:r>
     </w:p>
     <w:p>

</xml_diff>

<commit_message>
updated the user guide
</commit_message>
<xml_diff>
--- a/Python Script SMW200A Instructions.docx
+++ b/Python Script SMW200A Instructions.docx
@@ -16,12 +16,18 @@
         <w:t>Document Version 1.</w:t>
       </w:r>
       <w:r>
-        <w:t>1</w:t>
-      </w:r>
-    </w:p>
-    <w:p>
-      <w:r>
-        <w:t>9/22/2026</w:t>
+        <w:t>2</w:t>
+      </w:r>
+    </w:p>
+    <w:p>
+      <w:r>
+        <w:t>9/2</w:t>
+      </w:r>
+      <w:r>
+        <w:t>4</w:t>
+      </w:r>
+      <w:r>
+        <w:t>/2026</w:t>
       </w:r>
     </w:p>
     <w:p/>
@@ -2230,11 +2236,9 @@
       <w:r>
         <w:t xml:space="preserve"> version 1.26.3. It most likely will work with any version </w:t>
       </w:r>
-      <w:proofErr w:type="gramStart"/>
       <w:r>
         <w:t>previous to</w:t>
       </w:r>
-      <w:proofErr w:type="gramEnd"/>
       <w:r>
         <w:t xml:space="preserve"> 2.0, but </w:t>
       </w:r>
@@ -2352,15 +2356,7 @@
     </w:p>
     <w:p>
       <w:r>
-        <w:t xml:space="preserve">On </w:t>
-      </w:r>
-      <w:proofErr w:type="gramStart"/>
-      <w:r>
-        <w:t>the SMW200A</w:t>
-      </w:r>
-      <w:proofErr w:type="gramEnd"/>
-      <w:r>
-        <w:t>:</w:t>
+        <w:t>On the SMW200A:</w:t>
       </w:r>
     </w:p>
     <w:p>
@@ -2368,20 +2364,145 @@
         <w:pStyle w:val="ListParagraph"/>
         <w:numPr>
           <w:ilvl w:val="0"/>
-          <w:numId w:val="35"/>
+          <w:numId w:val="43"/>
         </w:numPr>
       </w:pPr>
       <w:r>
-        <w:t>Realtime control interface (R&amp;S</w:t>
-      </w:r>
+        <w:t>Required:</w:t>
+      </w:r>
+    </w:p>
+    <w:p>
+      <w:pPr>
+        <w:pStyle w:val="ListParagraph"/>
+        <w:numPr>
+          <w:ilvl w:val="1"/>
+          <w:numId w:val="43"/>
+        </w:numPr>
+      </w:pPr>
       <w:r>
         <w:rPr>
-          <w:vertAlign w:val="superscript"/>
+          <w:b/>
+          <w:bCs/>
         </w:rPr>
-        <w:t>®</w:t>
-      </w:r>
-      <w:r>
-        <w:t>SMW-K503)</w:t>
+        <w:t>SMW-B13XT</w:t>
+      </w:r>
+      <w:r>
+        <w:t xml:space="preserve"> — Wideband baseband main module</w:t>
+      </w:r>
+    </w:p>
+    <w:p>
+      <w:pPr>
+        <w:pStyle w:val="ListParagraph"/>
+        <w:numPr>
+          <w:ilvl w:val="1"/>
+          <w:numId w:val="43"/>
+        </w:numPr>
+      </w:pPr>
+      <w:r>
+        <w:rPr>
+          <w:b/>
+          <w:bCs/>
+        </w:rPr>
+        <w:t>SMW-B9</w:t>
+      </w:r>
+      <w:r>
+        <w:t xml:space="preserve"> — Wideband baseband generator (incl. ADV DATA/CTRL interface)</w:t>
+      </w:r>
+    </w:p>
+    <w:p>
+      <w:pPr>
+        <w:pStyle w:val="ListParagraph"/>
+        <w:numPr>
+          <w:ilvl w:val="1"/>
+          <w:numId w:val="43"/>
+        </w:numPr>
+      </w:pPr>
+      <w:r>
+        <w:rPr>
+          <w:b/>
+          <w:bCs/>
+        </w:rPr>
+        <w:t>SMW-B10xx</w:t>
+      </w:r>
+      <w:r>
+        <w:t xml:space="preserve"> — RF frequency option, e.g. SMW-B1003</w:t>
+      </w:r>
+    </w:p>
+    <w:p>
+      <w:pPr>
+        <w:pStyle w:val="ListParagraph"/>
+        <w:numPr>
+          <w:ilvl w:val="1"/>
+          <w:numId w:val="43"/>
+        </w:numPr>
+      </w:pPr>
+      <w:r>
+        <w:rPr>
+          <w:b/>
+          <w:bCs/>
+        </w:rPr>
+        <w:t>SMW-K502</w:t>
+      </w:r>
+      <w:r>
+        <w:t xml:space="preserve"> — Wideband extended sequencing</w:t>
+      </w:r>
+    </w:p>
+    <w:p>
+      <w:pPr>
+        <w:pStyle w:val="ListParagraph"/>
+        <w:numPr>
+          <w:ilvl w:val="1"/>
+          <w:numId w:val="43"/>
+        </w:numPr>
+      </w:pPr>
+      <w:r>
+        <w:rPr>
+          <w:b/>
+          <w:bCs/>
+        </w:rPr>
+        <w:t>SMW-K503</w:t>
+      </w:r>
+      <w:r>
+        <w:t xml:space="preserve"> — Real-time control interface</w:t>
+      </w:r>
+    </w:p>
+    <w:p>
+      <w:pPr>
+        <w:pStyle w:val="ListParagraph"/>
+        <w:numPr>
+          <w:ilvl w:val="1"/>
+          <w:numId w:val="43"/>
+        </w:numPr>
+      </w:pPr>
+      <w:r>
+        <w:rPr>
+          <w:b/>
+          <w:bCs/>
+        </w:rPr>
+        <w:lastRenderedPageBreak/>
+        <w:t>SMW-K504</w:t>
+      </w:r>
+      <w:r>
+        <w:t xml:space="preserve"> — Enhanced PDW rate and control PDWs</w:t>
+      </w:r>
+    </w:p>
+    <w:p>
+      <w:pPr>
+        <w:pStyle w:val="ListParagraph"/>
+        <w:numPr>
+          <w:ilvl w:val="1"/>
+          <w:numId w:val="43"/>
+        </w:numPr>
+      </w:pPr>
+      <w:r>
+        <w:rPr>
+          <w:b/>
+          <w:bCs/>
+        </w:rPr>
+        <w:t>Firmware</w:t>
+      </w:r>
+      <w:r>
+        <w:t xml:space="preserve"> — 5.30.047.xx or later</w:t>
       </w:r>
     </w:p>
     <w:p>
@@ -2389,21 +2510,106 @@
         <w:pStyle w:val="ListParagraph"/>
         <w:numPr>
           <w:ilvl w:val="0"/>
-          <w:numId w:val="35"/>
+          <w:numId w:val="43"/>
         </w:numPr>
       </w:pPr>
       <w:r>
-        <w:t>Realtime control interface with enhanced PDW rate and control PDWs (R&amp;S</w:t>
-      </w:r>
+        <w:t>Optional:</w:t>
+      </w:r>
+    </w:p>
+    <w:p>
+      <w:pPr>
+        <w:pStyle w:val="ListParagraph"/>
+        <w:numPr>
+          <w:ilvl w:val="1"/>
+          <w:numId w:val="43"/>
+        </w:numPr>
+      </w:pPr>
       <w:r>
         <w:rPr>
-          <w:vertAlign w:val="superscript"/>
+          <w:b/>
+          <w:bCs/>
         </w:rPr>
-        <w:t>®</w:t>
-      </w:r>
-      <w:r>
-        <w:t>SMW-K504)</w:t>
-      </w:r>
+        <w:t>SMW-B15</w:t>
+      </w:r>
+      <w:r>
+        <w:t xml:space="preserve"> — Up to 4 processing boards, for up to 6 sequencers</w:t>
+      </w:r>
+    </w:p>
+    <w:p>
+      <w:pPr>
+        <w:pStyle w:val="ListParagraph"/>
+        <w:numPr>
+          <w:ilvl w:val="1"/>
+          <w:numId w:val="43"/>
+        </w:numPr>
+      </w:pPr>
+      <w:r>
+        <w:rPr>
+          <w:b/>
+          <w:bCs/>
+        </w:rPr>
+        <w:t>SMW-K515</w:t>
+      </w:r>
+      <w:r>
+        <w:t xml:space="preserve"> — ARB memory up to 2 </w:t>
+      </w:r>
+      <w:proofErr w:type="spellStart"/>
+      <w:r>
+        <w:t>GSamples</w:t>
+      </w:r>
+      <w:proofErr w:type="spellEnd"/>
+      <w:r>
+        <w:t>, for large ARB container waveforms</w:t>
+      </w:r>
+    </w:p>
+    <w:p>
+      <w:pPr>
+        <w:pStyle w:val="ListParagraph"/>
+        <w:numPr>
+          <w:ilvl w:val="1"/>
+          <w:numId w:val="43"/>
+        </w:numPr>
+      </w:pPr>
+      <w:r>
+        <w:rPr>
+          <w:b/>
+          <w:bCs/>
+        </w:rPr>
+        <w:t>SMW-B20xx</w:t>
+      </w:r>
+      <w:r>
+        <w:t xml:space="preserve"> — Second RF output</w:t>
+      </w:r>
+    </w:p>
+    <w:p>
+      <w:pPr>
+        <w:pStyle w:val="ListParagraph"/>
+        <w:numPr>
+          <w:ilvl w:val="1"/>
+          <w:numId w:val="43"/>
+        </w:numPr>
+      </w:pPr>
+      <w:r>
+        <w:rPr>
+          <w:b/>
+          <w:bCs/>
+        </w:rPr>
+        <w:t>SMW-K315 –</w:t>
+      </w:r>
+      <w:r>
+        <w:t xml:space="preserve"> Pulse-on-pulse simulation for summing outputs of processing boards </w:t>
+      </w:r>
+    </w:p>
+    <w:p>
+      <w:pPr>
+        <w:pStyle w:val="ListParagraph"/>
+        <w:numPr>
+          <w:ilvl w:val="0"/>
+          <w:numId w:val="0"/>
+        </w:numPr>
+        <w:ind w:left="785"/>
+      </w:pPr>
     </w:p>
     <w:p>
       <w:pPr>
@@ -2466,19 +2672,10 @@
           <w:b/>
           <w:bCs/>
         </w:rPr>
-        <w:lastRenderedPageBreak/>
         <w:t xml:space="preserve">PDWlist.csv </w:t>
       </w:r>
       <w:r>
-        <w:t xml:space="preserve">contains </w:t>
-      </w:r>
-      <w:proofErr w:type="gramStart"/>
-      <w:r>
-        <w:t>arb</w:t>
-      </w:r>
-      <w:proofErr w:type="gramEnd"/>
-      <w:r>
-        <w:t xml:space="preserve"> PDWs.</w:t>
+        <w:t>contains arb PDWs.</w:t>
       </w:r>
     </w:p>
     <w:p>
@@ -2817,20 +3014,13 @@
         <w:pStyle w:val="Heading3"/>
       </w:pPr>
       <w:r>
+        <w:lastRenderedPageBreak/>
         <w:t>PyQt6</w:t>
       </w:r>
     </w:p>
     <w:p>
       <w:r>
-        <w:t xml:space="preserve">PyQt6 is the package that enables </w:t>
-      </w:r>
-      <w:proofErr w:type="gramStart"/>
-      <w:r>
-        <w:t>the GUI</w:t>
-      </w:r>
-      <w:proofErr w:type="gramEnd"/>
-      <w:r>
-        <w:t>.</w:t>
+        <w:t>PyQt6 is the package that enables the GUI.</w:t>
       </w:r>
     </w:p>
     <w:p>
@@ -2968,16 +3158,7 @@
         <w:spacing w:after="240"/>
       </w:pPr>
       <w:r>
-        <w:lastRenderedPageBreak/>
-        <w:t xml:space="preserve">Change the working directory to the Python installation of your choice (adjust the </w:t>
-      </w:r>
-      <w:proofErr w:type="gramStart"/>
-      <w:r>
-        <w:t>user name</w:t>
-      </w:r>
-      <w:proofErr w:type="gramEnd"/>
-      <w:r>
-        <w:t xml:space="preserve"> and python version in the path):</w:t>
+        <w:t>Change the working directory to the Python installation of your choice (adjust the user name and python version in the path):</w:t>
       </w:r>
     </w:p>
     <w:p>
@@ -3060,15 +3241,7 @@
       </w:r>
       <w:proofErr w:type="spellEnd"/>
       <w:r>
-        <w:t xml:space="preserve"> is for instrument and data handling. Data handling mainly focuses on reading and writing I/Q files in </w:t>
-      </w:r>
-      <w:proofErr w:type="spellStart"/>
-      <w:r>
-        <w:t>public</w:t>
-      </w:r>
-      <w:proofErr w:type="spellEnd"/>
-      <w:r>
-        <w:t xml:space="preserve"> R&amp;S formats. To install this, please use pip </w:t>
+        <w:t xml:space="preserve"> is for instrument and data handling. Data handling mainly focuses on reading and writing I/Q files in public R&amp;S formats. To install this, please use pip </w:t>
       </w:r>
     </w:p>
     <w:p>
@@ -3224,6 +3397,7 @@
       </w:pPr>
       <w:bookmarkStart w:id="15" w:name="_Toc176525794"/>
       <w:r>
+        <w:lastRenderedPageBreak/>
         <w:t>References</w:t>
       </w:r>
       <w:bookmarkEnd w:id="15"/>
@@ -3278,7 +3452,6 @@
       <w:bookmarkStart w:id="16" w:name="_Ref176516871"/>
       <w:bookmarkStart w:id="17" w:name="_Toc176525795"/>
       <w:r>
-        <w:lastRenderedPageBreak/>
         <w:t>CSV Structure</w:t>
       </w:r>
       <w:bookmarkEnd w:id="16"/>
@@ -4107,7 +4280,11 @@
             </w:r>
             <w:proofErr w:type="spellEnd"/>
             <w:r>
-              <w:t>’ is used, adjusting the RF frequency &amp; level settings with a single TOA is possible. In this case, use ‘Level Offset (dB)’ column to enter the desired RF Level. If ‘EOF’ is used, the TOA marks the end of the scenario and sets the repetition interval for repeated playback.</w:t>
+              <w:t xml:space="preserve">’ is used, adjusting the RF frequency &amp; level </w:t>
+            </w:r>
+            <w:r>
+              <w:lastRenderedPageBreak/>
+              <w:t>settings with a single TOA is possible. In this case, use ‘Level Offset (dB)’ column to enter the desired RF Level. If ‘EOF’ is used, the TOA marks the end of the scenario and sets the repetition interval for repeated playback.</w:t>
             </w:r>
           </w:p>
         </w:tc>
@@ -4132,6 +4309,7 @@
           </w:tcPr>
           <w:p>
             <w:r>
+              <w:lastRenderedPageBreak/>
               <w:t>Pulse Width</w:t>
             </w:r>
           </w:p>
@@ -4409,7 +4587,6 @@
           </w:tcPr>
           <w:p>
             <w:r>
-              <w:lastRenderedPageBreak/>
               <w:t>Frequency Offset</w:t>
             </w:r>
           </w:p>
@@ -5626,6 +5803,7 @@
       <w:bookmarkStart w:id="18" w:name="_Ref176515172"/>
       <w:bookmarkStart w:id="19" w:name="_Toc176525796"/>
       <w:r>
+        <w:lastRenderedPageBreak/>
         <w:t>Workflow</w:t>
       </w:r>
       <w:bookmarkEnd w:id="18"/>
@@ -5714,7 +5892,6 @@
       </w:pPr>
       <w:bookmarkStart w:id="20" w:name="_Toc176525797"/>
       <w:r>
-        <w:lastRenderedPageBreak/>
         <w:t>Build a list of PDWs and TCDWs in .xlsx Format</w:t>
       </w:r>
       <w:bookmarkEnd w:id="20"/>
@@ -5726,15 +5903,7 @@
     </w:p>
     <w:p>
       <w:r>
-        <w:t xml:space="preserve">Each line in the .xlsx represents a pulse with </w:t>
-      </w:r>
-      <w:proofErr w:type="gramStart"/>
-      <w:r>
-        <w:t>a number of</w:t>
-      </w:r>
-      <w:proofErr w:type="gramEnd"/>
-      <w:r>
-        <w:t xml:space="preserve"> repetitions based on the “Number of Pulses” field. </w:t>
+        <w:t xml:space="preserve">Each line in the .xlsx represents a pulse with a number of repetitions based on the “Number of Pulses” field. </w:t>
       </w:r>
     </w:p>
     <w:p>
@@ -5747,15 +5916,7 @@
     </w:p>
     <w:p>
       <w:r>
-        <w:t xml:space="preserve">The last descriptor word in the file should be </w:t>
-      </w:r>
-      <w:proofErr w:type="gramStart"/>
-      <w:r>
-        <w:t>an EOF</w:t>
-      </w:r>
-      <w:proofErr w:type="gramEnd"/>
-      <w:r>
-        <w:t xml:space="preserve"> (End of File) TCDW. This ensures synchronization and terminates the list. </w:t>
+        <w:t xml:space="preserve">The last descriptor word in the file should be an EOF (End of File) TCDW. This ensures synchronization and terminates the list. </w:t>
       </w:r>
     </w:p>
     <w:p>
@@ -5770,23 +5931,7 @@
           <w:i/>
           <w:iCs/>
         </w:rPr>
-        <w:t xml:space="preserve">Note: If you do not have </w:t>
-      </w:r>
-      <w:proofErr w:type="gramStart"/>
-      <w:r>
-        <w:rPr>
-          <w:i/>
-          <w:iCs/>
-        </w:rPr>
-        <w:t>an EOF</w:t>
-      </w:r>
-      <w:proofErr w:type="gramEnd"/>
-      <w:r>
-        <w:rPr>
-          <w:i/>
-          <w:iCs/>
-        </w:rPr>
-        <w:t xml:space="preserve"> TCDW as your last descriptor word, one will be appended by the script at the time the last pulse ends. If the EOF TOA is earlier than the end of the last pulse, the script logs a warning because playback would be cut short. However, it is best practice to have this included in the file. </w:t>
+        <w:t xml:space="preserve">Note: If you do not have an EOF TCDW as your last descriptor word, one will be appended by the script at the time the last pulse ends. If the EOF TOA is earlier than the end of the last pulse, the script logs a warning because playback would be cut short. However, it is best practice to have this included in the file. </w:t>
       </w:r>
     </w:p>
     <w:p>
@@ -5911,6 +6056,9 @@
     </w:p>
     <w:p>
       <w:r>
+        <w:rPr>
+          <w:noProof/>
+        </w:rPr>
         <w:lastRenderedPageBreak/>
         <w:drawing>
           <wp:inline distT="0" distB="0" distL="0" distR="0" wp14:anchorId="657D8FFB" wp14:editId="382A2E0D">
@@ -5963,6 +6111,9 @@
     </w:p>
     <w:p>
       <w:r>
+        <w:rPr>
+          <w:noProof/>
+        </w:rPr>
         <w:lastRenderedPageBreak/>
         <w:drawing>
           <wp:inline distT="0" distB="0" distL="0" distR="0" wp14:anchorId="2C3F9546" wp14:editId="229AA639">
@@ -6044,6 +6195,9 @@
     </w:p>
     <w:p>
       <w:r>
+        <w:rPr>
+          <w:noProof/>
+        </w:rPr>
         <w:lastRenderedPageBreak/>
         <w:drawing>
           <wp:inline distT="0" distB="0" distL="0" distR="0" wp14:anchorId="5FE7D316" wp14:editId="2A96DBBE">
@@ -6230,14 +6384,9 @@
       </w:pPr>
       <w:bookmarkStart w:id="23" w:name="_Toc176525800"/>
       <w:r>
-        <w:t xml:space="preserve">Transfer Script Output Files to </w:t>
-      </w:r>
-      <w:proofErr w:type="gramStart"/>
-      <w:r>
-        <w:t>the SMW200A</w:t>
+        <w:t>Transfer Script Output Files to the SMW200A</w:t>
       </w:r>
       <w:bookmarkEnd w:id="23"/>
-      <w:proofErr w:type="gramEnd"/>
     </w:p>
     <w:p>
       <w:r>
@@ -6422,15 +6571,7 @@
     </w:p>
     <w:p>
       <w:r>
-        <w:t xml:space="preserve">To play the file back, it is recommended to start </w:t>
-      </w:r>
-      <w:proofErr w:type="gramStart"/>
-      <w:r>
-        <w:t>from</w:t>
-      </w:r>
-      <w:proofErr w:type="gramEnd"/>
-      <w:r>
-        <w:t xml:space="preserve"> a PRESET. </w:t>
+        <w:t xml:space="preserve">To play the file back, it is recommended to start from a PRESET. </w:t>
       </w:r>
     </w:p>
     <w:p>
@@ -6877,15 +7018,7 @@
         </w:numPr>
       </w:pPr>
       <w:r>
-        <w:t xml:space="preserve">Under “Trigger In” tab, </w:t>
-      </w:r>
-      <w:proofErr w:type="gramStart"/>
-      <w:r>
-        <w:t>Select</w:t>
-      </w:r>
-      <w:proofErr w:type="gramEnd"/>
-      <w:r>
-        <w:t xml:space="preserve"> “Execute Trigger” (if in Armed Retrigger Mode),</w:t>
+        <w:t>Under “Trigger In” tab, Select “Execute Trigger” (if in Armed Retrigger Mode),</w:t>
       </w:r>
     </w:p>
     <w:p>
@@ -6953,55 +7086,26 @@
         <w:pStyle w:val="Heading2"/>
       </w:pPr>
       <w:r>
-        <w:t>Continuous Playback</w:t>
-      </w:r>
-    </w:p>
-    <w:p>
-      <w:r>
-        <w:t xml:space="preserve">In the case that the user wants continuous looping playback of the file without the need to manually or externally trigger the SMW200A, there are a few modifications to the PDW list and SMW200A setup. This setup enables the SMW200A to retrigger playback itself by utilizing the marker functionality. Essentially, the setup requires a marker output at the end of the PDW list which will be looped back into the SMW200A for retriggering the file playback. </w:t>
-      </w:r>
-    </w:p>
-    <w:p>
-      <w:pPr>
-        <w:pStyle w:val="Heading3"/>
-      </w:pPr>
-      <w:r>
-        <w:t>PDW List Modifications</w:t>
-      </w:r>
-    </w:p>
-    <w:p>
-      <w:r>
-        <w:t xml:space="preserve">The last PDW in the list should have Marker 1 enabled. If the last PDW entry in the list has multiple “Number of Pulses” </w:t>
-      </w:r>
-      <w:proofErr w:type="gramStart"/>
-      <w:r>
-        <w:t>split</w:t>
-      </w:r>
-      <w:proofErr w:type="gramEnd"/>
-      <w:r>
-        <w:t xml:space="preserve"> it such that the last pulse has one “Number of Pulses”.</w:t>
-      </w:r>
-    </w:p>
-    <w:p>
-      <w:r>
-        <w:t>Example:</w:t>
-      </w:r>
-    </w:p>
-    <w:p>
-      <w:r>
-        <w:t>Before: The last PDW is a Barker with “Number of Pulses” = 4</w:t>
-      </w:r>
-    </w:p>
-    <w:p>
-      <w:r>
-        <w:rPr>
-          <w:noProof/>
-        </w:rPr>
+        <w:t>Extended Sequencer Advanced</w:t>
+      </w:r>
+    </w:p>
+    <w:p>
+      <w:r>
+        <w:t xml:space="preserve">This allows for multiple files to be loaded onto different hardware resources. A sequencer is a unit of resource. There are up to 6 supported sequencers determined by the hardware configuration. A B9 or B15 option constitutes one sequencer. </w:t>
+      </w:r>
+    </w:p>
+    <w:p>
+      <w:r>
+        <w:t xml:space="preserve">The GUI has a tab to upload separate files to each sequencer. The outputs can be directed to RF A or RF B. If more than one sequencer is directed to one RF port, the outputs are summed. This allows for pulse-on-pulse modulation (provided the SMW is equipped with the K315 option). </w:t>
+      </w:r>
+    </w:p>
+    <w:p>
+      <w:r>
         <w:drawing>
-          <wp:inline distT="0" distB="0" distL="0" distR="0" wp14:anchorId="5EE081F2" wp14:editId="0F1DA4FE">
-            <wp:extent cx="6138545" cy="265430"/>
-            <wp:effectExtent l="0" t="0" r="0" b="1270"/>
-            <wp:docPr id="313509963" name="Picture 1"/>
+          <wp:inline distT="0" distB="0" distL="0" distR="0" wp14:anchorId="49B6E509" wp14:editId="63F03521">
+            <wp:extent cx="6138545" cy="5904865"/>
+            <wp:effectExtent l="0" t="0" r="0" b="635"/>
+            <wp:docPr id="1956504173" name="Picture 1"/>
             <wp:cNvGraphicFramePr>
               <a:graphicFrameLocks xmlns:a="http://schemas.openxmlformats.org/drawingml/2006/main" noChangeAspect="1"/>
             </wp:cNvGraphicFramePr>
@@ -7009,7 +7113,7 @@
               <a:graphicData uri="http://schemas.openxmlformats.org/drawingml/2006/picture">
                 <pic:pic xmlns:pic="http://schemas.openxmlformats.org/drawingml/2006/picture">
                   <pic:nvPicPr>
-                    <pic:cNvPr id="313509963" name=""/>
+                    <pic:cNvPr id="1956504173" name=""/>
                     <pic:cNvPicPr/>
                   </pic:nvPicPr>
                   <pic:blipFill>
@@ -7021,7 +7125,7 @@
                   <pic:spPr>
                     <a:xfrm>
                       <a:off x="0" y="0"/>
-                      <a:ext cx="6138545" cy="265430"/>
+                      <a:ext cx="6138545" cy="5904865"/>
                     </a:xfrm>
                     <a:prstGeom prst="rect">
                       <a:avLst/>
@@ -7036,19 +7140,12 @@
     </w:p>
     <w:p>
       <w:r>
-        <w:t xml:space="preserve">After: The last PDW is split into two PDWs. The first has 3 pulses and no marker, and the second has 1 pulse with Marker 1 enabled. </w:t>
-      </w:r>
-    </w:p>
-    <w:p>
-      <w:r>
-        <w:rPr>
-          <w:noProof/>
-        </w:rPr>
+        <w:lastRenderedPageBreak/>
         <w:drawing>
-          <wp:inline distT="0" distB="0" distL="0" distR="0" wp14:anchorId="7AB9AB9F" wp14:editId="14FB5025">
-            <wp:extent cx="6138545" cy="241935"/>
-            <wp:effectExtent l="0" t="0" r="0" b="5715"/>
-            <wp:docPr id="2087910477" name="Picture 1"/>
+          <wp:inline distT="0" distB="0" distL="0" distR="0" wp14:anchorId="6E2E666A" wp14:editId="0B284CDE">
+            <wp:extent cx="6138545" cy="4169410"/>
+            <wp:effectExtent l="0" t="0" r="0" b="2540"/>
+            <wp:docPr id="853006524" name="Picture 1"/>
             <wp:cNvGraphicFramePr>
               <a:graphicFrameLocks xmlns:a="http://schemas.openxmlformats.org/drawingml/2006/main" noChangeAspect="1"/>
             </wp:cNvGraphicFramePr>
@@ -7056,7 +7153,7 @@
               <a:graphicData uri="http://schemas.openxmlformats.org/drawingml/2006/picture">
                 <pic:pic xmlns:pic="http://schemas.openxmlformats.org/drawingml/2006/picture">
                   <pic:nvPicPr>
-                    <pic:cNvPr id="2087910477" name=""/>
+                    <pic:cNvPr id="853006524" name=""/>
                     <pic:cNvPicPr/>
                   </pic:nvPicPr>
                   <pic:blipFill>
@@ -7068,7 +7165,7 @@
                   <pic:spPr>
                     <a:xfrm>
                       <a:off x="0" y="0"/>
-                      <a:ext cx="6138545" cy="241935"/>
+                      <a:ext cx="6138545" cy="4169410"/>
                     </a:xfrm>
                     <a:prstGeom prst="rect">
                       <a:avLst/>
@@ -7082,36 +7179,12 @@
       </w:r>
     </w:p>
     <w:p>
-      <w:pPr>
-        <w:pStyle w:val="Heading3"/>
-      </w:pPr>
-      <w:r>
-        <w:t>SMW200A Setup Modifications</w:t>
-      </w:r>
-    </w:p>
-    <w:p>
-      <w:pPr>
-        <w:pStyle w:val="ListParagraph"/>
-        <w:numPr>
-          <w:ilvl w:val="3"/>
-          <w:numId w:val="41"/>
-        </w:numPr>
-        <w:ind w:left="450" w:hanging="270"/>
-      </w:pPr>
-      <w:r>
-        <w:t>Under the “Extended Sequencer” window in the baseband, navigate to the “Marker” tab and select “Global Connectors”</w:t>
-      </w:r>
-    </w:p>
-    <w:p>
-      <w:r>
-        <w:rPr>
-          <w:noProof/>
-        </w:rPr>
+      <w:r>
         <w:drawing>
-          <wp:inline distT="0" distB="0" distL="0" distR="0" wp14:anchorId="3CB715C9" wp14:editId="131DA7E5">
-            <wp:extent cx="4933277" cy="3238500"/>
-            <wp:effectExtent l="0" t="0" r="1270" b="0"/>
-            <wp:docPr id="1392424049" name="Picture 1" descr="A screenshot of a computer&#10;&#10;Description automatically generated"/>
+          <wp:inline distT="0" distB="0" distL="0" distR="0" wp14:anchorId="62C47E5C" wp14:editId="0C70CDF2">
+            <wp:extent cx="6138545" cy="2388235"/>
+            <wp:effectExtent l="0" t="0" r="0" b="0"/>
+            <wp:docPr id="859669612" name="Picture 1"/>
             <wp:cNvGraphicFramePr>
               <a:graphicFrameLocks xmlns:a="http://schemas.openxmlformats.org/drawingml/2006/main" noChangeAspect="1"/>
             </wp:cNvGraphicFramePr>
@@ -7119,7 +7192,7 @@
               <a:graphicData uri="http://schemas.openxmlformats.org/drawingml/2006/picture">
                 <pic:pic xmlns:pic="http://schemas.openxmlformats.org/drawingml/2006/picture">
                   <pic:nvPicPr>
-                    <pic:cNvPr id="1392424049" name="Picture 1" descr="A screenshot of a computer&#10;&#10;Description automatically generated"/>
+                    <pic:cNvPr id="859669612" name=""/>
                     <pic:cNvPicPr/>
                   </pic:nvPicPr>
                   <pic:blipFill>
@@ -7131,7 +7204,7 @@
                   <pic:spPr>
                     <a:xfrm>
                       <a:off x="0" y="0"/>
-                      <a:ext cx="4954644" cy="3252526"/>
+                      <a:ext cx="6138545" cy="2388235"/>
                     </a:xfrm>
                     <a:prstGeom prst="rect">
                       <a:avLst/>
@@ -7146,186 +7219,6 @@
     </w:p>
     <w:p>
       <w:pPr>
-        <w:pStyle w:val="ListParagraph"/>
-        <w:numPr>
-          <w:ilvl w:val="3"/>
-          <w:numId w:val="41"/>
-        </w:numPr>
-        <w:ind w:left="540"/>
-      </w:pPr>
-      <w:r>
-        <w:lastRenderedPageBreak/>
-        <w:t>Under the “Routing” tab, ensure User 1 is routed to “Baseband A Marker 1” and User 3 is routed to “Global Trigger 1”.</w:t>
-      </w:r>
-    </w:p>
-    <w:p>
-      <w:r>
-        <w:rPr>
-          <w:noProof/>
-        </w:rPr>
-        <w:drawing>
-          <wp:inline distT="0" distB="0" distL="0" distR="0" wp14:anchorId="54B5AA64" wp14:editId="332BB380">
-            <wp:extent cx="4653345" cy="3511550"/>
-            <wp:effectExtent l="0" t="0" r="0" b="0"/>
-            <wp:docPr id="1164894112" name="Picture 1" descr="A screenshot of a computer&#10;&#10;Description automatically generated"/>
-            <wp:cNvGraphicFramePr>
-              <a:graphicFrameLocks xmlns:a="http://schemas.openxmlformats.org/drawingml/2006/main" noChangeAspect="1"/>
-            </wp:cNvGraphicFramePr>
-            <a:graphic xmlns:a="http://schemas.openxmlformats.org/drawingml/2006/main">
-              <a:graphicData uri="http://schemas.openxmlformats.org/drawingml/2006/picture">
-                <pic:pic xmlns:pic="http://schemas.openxmlformats.org/drawingml/2006/picture">
-                  <pic:nvPicPr>
-                    <pic:cNvPr id="1164894112" name="Picture 1" descr="A screenshot of a computer&#10;&#10;Description automatically generated"/>
-                    <pic:cNvPicPr/>
-                  </pic:nvPicPr>
-                  <pic:blipFill>
-                    <a:blip r:embed="rId36"/>
-                    <a:stretch>
-                      <a:fillRect/>
-                    </a:stretch>
-                  </pic:blipFill>
-                  <pic:spPr>
-                    <a:xfrm>
-                      <a:off x="0" y="0"/>
-                      <a:ext cx="4658197" cy="3515212"/>
-                    </a:xfrm>
-                    <a:prstGeom prst="rect">
-                      <a:avLst/>
-                    </a:prstGeom>
-                  </pic:spPr>
-                </pic:pic>
-              </a:graphicData>
-            </a:graphic>
-          </wp:inline>
-        </w:drawing>
-      </w:r>
-    </w:p>
-    <w:p>
-      <w:pPr>
-        <w:pStyle w:val="ListParagraph"/>
-        <w:numPr>
-          <w:ilvl w:val="3"/>
-          <w:numId w:val="41"/>
-        </w:numPr>
-        <w:ind w:left="540"/>
-      </w:pPr>
-      <w:r>
-        <w:t>Using a BNC connector, connect User 1 to User 3 on the front panel of the SMW200A</w:t>
-      </w:r>
-    </w:p>
-    <w:p>
-      <w:r>
-        <w:rPr>
-          <w:noProof/>
-        </w:rPr>
-        <w:drawing>
-          <wp:inline distT="0" distB="0" distL="0" distR="0" wp14:anchorId="6A8ABBF9" wp14:editId="7AEE0044">
-            <wp:extent cx="4222011" cy="3804920"/>
-            <wp:effectExtent l="0" t="0" r="7620" b="5080"/>
-            <wp:docPr id="2034705627" name="Picture 1" descr="A close-up of a device&#10;&#10;Description automatically generated"/>
-            <wp:cNvGraphicFramePr>
-              <a:graphicFrameLocks xmlns:a="http://schemas.openxmlformats.org/drawingml/2006/main" noChangeAspect="1"/>
-            </wp:cNvGraphicFramePr>
-            <a:graphic xmlns:a="http://schemas.openxmlformats.org/drawingml/2006/main">
-              <a:graphicData uri="http://schemas.openxmlformats.org/drawingml/2006/picture">
-                <pic:pic xmlns:pic="http://schemas.openxmlformats.org/drawingml/2006/picture">
-                  <pic:nvPicPr>
-                    <pic:cNvPr id="2034705627" name="Picture 1" descr="A close-up of a device&#10;&#10;Description automatically generated"/>
-                    <pic:cNvPicPr/>
-                  </pic:nvPicPr>
-                  <pic:blipFill>
-                    <a:blip r:embed="rId37"/>
-                    <a:stretch>
-                      <a:fillRect/>
-                    </a:stretch>
-                  </pic:blipFill>
-                  <pic:spPr>
-                    <a:xfrm>
-                      <a:off x="0" y="0"/>
-                      <a:ext cx="4227278" cy="3809666"/>
-                    </a:xfrm>
-                    <a:prstGeom prst="rect">
-                      <a:avLst/>
-                    </a:prstGeom>
-                  </pic:spPr>
-                </pic:pic>
-              </a:graphicData>
-            </a:graphic>
-          </wp:inline>
-        </w:drawing>
-      </w:r>
-    </w:p>
-    <w:p>
-      <w:pPr>
-        <w:pStyle w:val="ListParagraph"/>
-        <w:numPr>
-          <w:ilvl w:val="3"/>
-          <w:numId w:val="41"/>
-        </w:numPr>
-        <w:ind w:left="540"/>
-      </w:pPr>
-      <w:r>
-        <w:t xml:space="preserve">Under the “Trigger In” tab in the “Extended Sequencer”, select Mode -&gt; Retrigger and Source -&gt; External Global Trigger 1. This allows the User 3 port to trigger the playback of the file. </w:t>
-      </w:r>
-    </w:p>
-    <w:p>
-      <w:r>
-        <w:rPr>
-          <w:noProof/>
-        </w:rPr>
-        <w:lastRenderedPageBreak/>
-        <w:drawing>
-          <wp:inline distT="0" distB="0" distL="0" distR="0" wp14:anchorId="2FF2DD70" wp14:editId="1AF8A979">
-            <wp:extent cx="4307558" cy="3232785"/>
-            <wp:effectExtent l="0" t="0" r="0" b="5715"/>
-            <wp:docPr id="1492369194" name="Picture 1" descr="A screenshot of a computer&#10;&#10;Description automatically generated"/>
-            <wp:cNvGraphicFramePr>
-              <a:graphicFrameLocks xmlns:a="http://schemas.openxmlformats.org/drawingml/2006/main" noChangeAspect="1"/>
-            </wp:cNvGraphicFramePr>
-            <a:graphic xmlns:a="http://schemas.openxmlformats.org/drawingml/2006/main">
-              <a:graphicData uri="http://schemas.openxmlformats.org/drawingml/2006/picture">
-                <pic:pic xmlns:pic="http://schemas.openxmlformats.org/drawingml/2006/picture">
-                  <pic:nvPicPr>
-                    <pic:cNvPr id="1492369194" name="Picture 1" descr="A screenshot of a computer&#10;&#10;Description automatically generated"/>
-                    <pic:cNvPicPr/>
-                  </pic:nvPicPr>
-                  <pic:blipFill>
-                    <a:blip r:embed="rId38"/>
-                    <a:stretch>
-                      <a:fillRect/>
-                    </a:stretch>
-                  </pic:blipFill>
-                  <pic:spPr>
-                    <a:xfrm>
-                      <a:off x="0" y="0"/>
-                      <a:ext cx="4317790" cy="3240464"/>
-                    </a:xfrm>
-                    <a:prstGeom prst="rect">
-                      <a:avLst/>
-                    </a:prstGeom>
-                  </pic:spPr>
-                </pic:pic>
-              </a:graphicData>
-            </a:graphic>
-          </wp:inline>
-        </w:drawing>
-      </w:r>
-    </w:p>
-    <w:p>
-      <w:r>
-        <w:t xml:space="preserve">Now, the file will trigger itself to </w:t>
-      </w:r>
-      <w:proofErr w:type="gramStart"/>
-      <w:r>
-        <w:t>replay</w:t>
-      </w:r>
-      <w:proofErr w:type="gramEnd"/>
-      <w:r>
-        <w:t xml:space="preserve"> at the beginning on the last PDW of the list. </w:t>
-      </w:r>
-    </w:p>
-    <w:p>
-      <w:pPr>
         <w:pStyle w:val="Heading1"/>
       </w:pPr>
       <w:r>
@@ -7341,12 +7234,12 @@
     <w:p/>
     <w:p/>
     <w:sectPr>
-      <w:headerReference w:type="even" r:id="rId39"/>
-      <w:headerReference w:type="default" r:id="rId40"/>
-      <w:footerReference w:type="even" r:id="rId41"/>
-      <w:footerReference w:type="default" r:id="rId42"/>
-      <w:headerReference w:type="first" r:id="rId43"/>
-      <w:footerReference w:type="first" r:id="rId44"/>
+      <w:headerReference w:type="even" r:id="rId36"/>
+      <w:headerReference w:type="default" r:id="rId37"/>
+      <w:footerReference w:type="even" r:id="rId38"/>
+      <w:footerReference w:type="default" r:id="rId39"/>
+      <w:headerReference w:type="first" r:id="rId40"/>
+      <w:footerReference w:type="first" r:id="rId41"/>
       <w:pgSz w:w="11906" w:h="16838"/>
       <w:pgMar w:top="1701" w:right="992" w:bottom="1134" w:left="1247" w:header="709" w:footer="709" w:gutter="0"/>
       <w:cols w:space="708"/>
@@ -7891,6 +7784,146 @@
     </w:lvl>
   </w:abstractNum>
   <w:abstractNum w:abstractNumId="4" w15:restartNumberingAfterBreak="0">
+    <w:nsid w:val="12A0297D"/>
+    <w:multiLevelType w:val="hybridMultilevel"/>
+    <w:tmpl w:val="CDD88D1E"/>
+    <w:lvl w:ilvl="0" w:tplc="38E0557A">
+      <w:start w:val="1"/>
+      <w:numFmt w:val="bullet"/>
+      <w:lvlText w:val="►"/>
+      <w:lvlJc w:val="left"/>
+      <w:pPr>
+        <w:tabs>
+          <w:tab w:val="num" w:pos="720"/>
+        </w:tabs>
+        <w:ind w:left="720" w:hanging="360"/>
+      </w:pPr>
+      <w:rPr>
+        <w:rFonts w:ascii="Arial" w:hAnsi="Arial" w:hint="default"/>
+      </w:rPr>
+    </w:lvl>
+    <w:lvl w:ilvl="1" w:tplc="A8FC4E9E" w:tentative="1">
+      <w:start w:val="1"/>
+      <w:numFmt w:val="bullet"/>
+      <w:lvlText w:val="►"/>
+      <w:lvlJc w:val="left"/>
+      <w:pPr>
+        <w:tabs>
+          <w:tab w:val="num" w:pos="1440"/>
+        </w:tabs>
+        <w:ind w:left="1440" w:hanging="360"/>
+      </w:pPr>
+      <w:rPr>
+        <w:rFonts w:ascii="Arial" w:hAnsi="Arial" w:hint="default"/>
+      </w:rPr>
+    </w:lvl>
+    <w:lvl w:ilvl="2" w:tplc="9272A0C6" w:tentative="1">
+      <w:start w:val="1"/>
+      <w:numFmt w:val="bullet"/>
+      <w:lvlText w:val="►"/>
+      <w:lvlJc w:val="left"/>
+      <w:pPr>
+        <w:tabs>
+          <w:tab w:val="num" w:pos="2160"/>
+        </w:tabs>
+        <w:ind w:left="2160" w:hanging="360"/>
+      </w:pPr>
+      <w:rPr>
+        <w:rFonts w:ascii="Arial" w:hAnsi="Arial" w:hint="default"/>
+      </w:rPr>
+    </w:lvl>
+    <w:lvl w:ilvl="3" w:tplc="72467996" w:tentative="1">
+      <w:start w:val="1"/>
+      <w:numFmt w:val="bullet"/>
+      <w:lvlText w:val="►"/>
+      <w:lvlJc w:val="left"/>
+      <w:pPr>
+        <w:tabs>
+          <w:tab w:val="num" w:pos="2880"/>
+        </w:tabs>
+        <w:ind w:left="2880" w:hanging="360"/>
+      </w:pPr>
+      <w:rPr>
+        <w:rFonts w:ascii="Arial" w:hAnsi="Arial" w:hint="default"/>
+      </w:rPr>
+    </w:lvl>
+    <w:lvl w:ilvl="4" w:tplc="EBF6BF56" w:tentative="1">
+      <w:start w:val="1"/>
+      <w:numFmt w:val="bullet"/>
+      <w:lvlText w:val="►"/>
+      <w:lvlJc w:val="left"/>
+      <w:pPr>
+        <w:tabs>
+          <w:tab w:val="num" w:pos="3600"/>
+        </w:tabs>
+        <w:ind w:left="3600" w:hanging="360"/>
+      </w:pPr>
+      <w:rPr>
+        <w:rFonts w:ascii="Arial" w:hAnsi="Arial" w:hint="default"/>
+      </w:rPr>
+    </w:lvl>
+    <w:lvl w:ilvl="5" w:tplc="E36E90BE" w:tentative="1">
+      <w:start w:val="1"/>
+      <w:numFmt w:val="bullet"/>
+      <w:lvlText w:val="►"/>
+      <w:lvlJc w:val="left"/>
+      <w:pPr>
+        <w:tabs>
+          <w:tab w:val="num" w:pos="4320"/>
+        </w:tabs>
+        <w:ind w:left="4320" w:hanging="360"/>
+      </w:pPr>
+      <w:rPr>
+        <w:rFonts w:ascii="Arial" w:hAnsi="Arial" w:hint="default"/>
+      </w:rPr>
+    </w:lvl>
+    <w:lvl w:ilvl="6" w:tplc="3A5EBBFC" w:tentative="1">
+      <w:start w:val="1"/>
+      <w:numFmt w:val="bullet"/>
+      <w:lvlText w:val="►"/>
+      <w:lvlJc w:val="left"/>
+      <w:pPr>
+        <w:tabs>
+          <w:tab w:val="num" w:pos="5040"/>
+        </w:tabs>
+        <w:ind w:left="5040" w:hanging="360"/>
+      </w:pPr>
+      <w:rPr>
+        <w:rFonts w:ascii="Arial" w:hAnsi="Arial" w:hint="default"/>
+      </w:rPr>
+    </w:lvl>
+    <w:lvl w:ilvl="7" w:tplc="249E3C50" w:tentative="1">
+      <w:start w:val="1"/>
+      <w:numFmt w:val="bullet"/>
+      <w:lvlText w:val="►"/>
+      <w:lvlJc w:val="left"/>
+      <w:pPr>
+        <w:tabs>
+          <w:tab w:val="num" w:pos="5760"/>
+        </w:tabs>
+        <w:ind w:left="5760" w:hanging="360"/>
+      </w:pPr>
+      <w:rPr>
+        <w:rFonts w:ascii="Arial" w:hAnsi="Arial" w:hint="default"/>
+      </w:rPr>
+    </w:lvl>
+    <w:lvl w:ilvl="8" w:tplc="2B42005C" w:tentative="1">
+      <w:start w:val="1"/>
+      <w:numFmt w:val="bullet"/>
+      <w:lvlText w:val="►"/>
+      <w:lvlJc w:val="left"/>
+      <w:pPr>
+        <w:tabs>
+          <w:tab w:val="num" w:pos="6480"/>
+        </w:tabs>
+        <w:ind w:left="6480" w:hanging="360"/>
+      </w:pPr>
+      <w:rPr>
+        <w:rFonts w:ascii="Arial" w:hAnsi="Arial" w:hint="default"/>
+      </w:rPr>
+    </w:lvl>
+  </w:abstractNum>
+  <w:abstractNum w:abstractNumId="5" w15:restartNumberingAfterBreak="0">
     <w:nsid w:val="164911B0"/>
     <w:multiLevelType w:val="multilevel"/>
     <w:tmpl w:val="16ECC3E0"/>
@@ -8004,13 +8037,13 @@
       </w:rPr>
     </w:lvl>
   </w:abstractNum>
-  <w:abstractNum w:abstractNumId="5" w15:restartNumberingAfterBreak="0">
+  <w:abstractNum w:abstractNumId="6" w15:restartNumberingAfterBreak="0">
     <w:nsid w:val="1CD8441C"/>
     <w:multiLevelType w:val="multilevel"/>
     <w:tmpl w:val="1B04B730"/>
     <w:numStyleLink w:val="RSBullets"/>
   </w:abstractNum>
-  <w:abstractNum w:abstractNumId="6" w15:restartNumberingAfterBreak="0">
+  <w:abstractNum w:abstractNumId="7" w15:restartNumberingAfterBreak="0">
     <w:nsid w:val="1CF3487F"/>
     <w:multiLevelType w:val="hybridMultilevel"/>
     <w:tmpl w:val="E102CA58"/>
@@ -8123,7 +8156,7 @@
       </w:rPr>
     </w:lvl>
   </w:abstractNum>
-  <w:abstractNum w:abstractNumId="7" w15:restartNumberingAfterBreak="0">
+  <w:abstractNum w:abstractNumId="8" w15:restartNumberingAfterBreak="0">
     <w:nsid w:val="2574065C"/>
     <w:multiLevelType w:val="multilevel"/>
     <w:tmpl w:val="3D287A5C"/>
@@ -8245,7 +8278,7 @@
       </w:rPr>
     </w:lvl>
   </w:abstractNum>
-  <w:abstractNum w:abstractNumId="8" w15:restartNumberingAfterBreak="0">
+  <w:abstractNum w:abstractNumId="9" w15:restartNumberingAfterBreak="0">
     <w:nsid w:val="27DC6F34"/>
     <w:multiLevelType w:val="hybridMultilevel"/>
     <w:tmpl w:val="E2E2A056"/>
@@ -8331,19 +8364,19 @@
       </w:pPr>
     </w:lvl>
   </w:abstractNum>
-  <w:abstractNum w:abstractNumId="9" w15:restartNumberingAfterBreak="0">
+  <w:abstractNum w:abstractNumId="10" w15:restartNumberingAfterBreak="0">
     <w:nsid w:val="2D2806D7"/>
     <w:multiLevelType w:val="multilevel"/>
     <w:tmpl w:val="1B04B730"/>
     <w:numStyleLink w:val="RSBullets"/>
   </w:abstractNum>
-  <w:abstractNum w:abstractNumId="10" w15:restartNumberingAfterBreak="0">
+  <w:abstractNum w:abstractNumId="11" w15:restartNumberingAfterBreak="0">
     <w:nsid w:val="2FE52E80"/>
     <w:multiLevelType w:val="multilevel"/>
     <w:tmpl w:val="1B04B730"/>
     <w:numStyleLink w:val="RSBullets"/>
   </w:abstractNum>
-  <w:abstractNum w:abstractNumId="11" w15:restartNumberingAfterBreak="0">
+  <w:abstractNum w:abstractNumId="12" w15:restartNumberingAfterBreak="0">
     <w:nsid w:val="342660B3"/>
     <w:multiLevelType w:val="multilevel"/>
     <w:tmpl w:val="1B04B730"/>
@@ -8507,19 +8540,19 @@
       </w:rPr>
     </w:lvl>
   </w:abstractNum>
-  <w:abstractNum w:abstractNumId="12" w15:restartNumberingAfterBreak="0">
+  <w:abstractNum w:abstractNumId="13" w15:restartNumberingAfterBreak="0">
     <w:nsid w:val="364A6D1D"/>
     <w:multiLevelType w:val="multilevel"/>
     <w:tmpl w:val="1B04B730"/>
     <w:numStyleLink w:val="RSBullets"/>
   </w:abstractNum>
-  <w:abstractNum w:abstractNumId="13" w15:restartNumberingAfterBreak="0">
+  <w:abstractNum w:abstractNumId="14" w15:restartNumberingAfterBreak="0">
     <w:nsid w:val="3A29703A"/>
     <w:multiLevelType w:val="multilevel"/>
     <w:tmpl w:val="760620C0"/>
     <w:numStyleLink w:val="1ai"/>
   </w:abstractNum>
-  <w:abstractNum w:abstractNumId="14" w15:restartNumberingAfterBreak="0">
+  <w:abstractNum w:abstractNumId="15" w15:restartNumberingAfterBreak="0">
     <w:nsid w:val="3A4A67D4"/>
     <w:multiLevelType w:val="hybridMultilevel"/>
     <w:tmpl w:val="E1503CEE"/>
@@ -8632,7 +8665,7 @@
       </w:rPr>
     </w:lvl>
   </w:abstractNum>
-  <w:abstractNum w:abstractNumId="15" w15:restartNumberingAfterBreak="0">
+  <w:abstractNum w:abstractNumId="16" w15:restartNumberingAfterBreak="0">
     <w:nsid w:val="3BA7281E"/>
     <w:multiLevelType w:val="multilevel"/>
     <w:tmpl w:val="454E3D22"/>
@@ -8777,7 +8810,7 @@
       </w:rPr>
     </w:lvl>
   </w:abstractNum>
-  <w:abstractNum w:abstractNumId="16" w15:restartNumberingAfterBreak="0">
+  <w:abstractNum w:abstractNumId="17" w15:restartNumberingAfterBreak="0">
     <w:nsid w:val="3BED38FF"/>
     <w:multiLevelType w:val="hybridMultilevel"/>
     <w:tmpl w:val="0C4C3976"/>
@@ -8890,31 +8923,31 @@
       </w:rPr>
     </w:lvl>
   </w:abstractNum>
-  <w:abstractNum w:abstractNumId="17" w15:restartNumberingAfterBreak="0">
+  <w:abstractNum w:abstractNumId="18" w15:restartNumberingAfterBreak="0">
     <w:nsid w:val="3E9D5BE6"/>
     <w:multiLevelType w:val="multilevel"/>
     <w:tmpl w:val="1B04B730"/>
     <w:numStyleLink w:val="RSBullets"/>
   </w:abstractNum>
-  <w:abstractNum w:abstractNumId="18" w15:restartNumberingAfterBreak="0">
+  <w:abstractNum w:abstractNumId="19" w15:restartNumberingAfterBreak="0">
     <w:nsid w:val="406C2E72"/>
     <w:multiLevelType w:val="multilevel"/>
     <w:tmpl w:val="1B04B730"/>
     <w:numStyleLink w:val="RSBullets"/>
   </w:abstractNum>
-  <w:abstractNum w:abstractNumId="19" w15:restartNumberingAfterBreak="0">
+  <w:abstractNum w:abstractNumId="20" w15:restartNumberingAfterBreak="0">
     <w:nsid w:val="43392F8D"/>
     <w:multiLevelType w:val="multilevel"/>
     <w:tmpl w:val="16ECC3E0"/>
     <w:numStyleLink w:val="111111"/>
   </w:abstractNum>
-  <w:abstractNum w:abstractNumId="20" w15:restartNumberingAfterBreak="0">
+  <w:abstractNum w:abstractNumId="21" w15:restartNumberingAfterBreak="0">
     <w:nsid w:val="48D714EE"/>
     <w:multiLevelType w:val="multilevel"/>
     <w:tmpl w:val="1B04B730"/>
     <w:numStyleLink w:val="RSBullets"/>
   </w:abstractNum>
-  <w:abstractNum w:abstractNumId="21" w15:restartNumberingAfterBreak="0">
+  <w:abstractNum w:abstractNumId="22" w15:restartNumberingAfterBreak="0">
     <w:nsid w:val="4A084D8E"/>
     <w:multiLevelType w:val="multilevel"/>
     <w:tmpl w:val="DD662C80"/>
@@ -9059,7 +9092,7 @@
       </w:rPr>
     </w:lvl>
   </w:abstractNum>
-  <w:abstractNum w:abstractNumId="22" w15:restartNumberingAfterBreak="0">
+  <w:abstractNum w:abstractNumId="23" w15:restartNumberingAfterBreak="0">
     <w:nsid w:val="4E9209A7"/>
     <w:multiLevelType w:val="hybridMultilevel"/>
     <w:tmpl w:val="66426D5A"/>
@@ -9145,7 +9178,7 @@
       </w:pPr>
     </w:lvl>
   </w:abstractNum>
-  <w:abstractNum w:abstractNumId="23" w15:restartNumberingAfterBreak="0">
+  <w:abstractNum w:abstractNumId="24" w15:restartNumberingAfterBreak="0">
     <w:nsid w:val="4F4F4BA5"/>
     <w:multiLevelType w:val="hybridMultilevel"/>
     <w:tmpl w:val="E2E2A056"/>
@@ -9231,7 +9264,7 @@
       </w:pPr>
     </w:lvl>
   </w:abstractNum>
-  <w:abstractNum w:abstractNumId="24" w15:restartNumberingAfterBreak="0">
+  <w:abstractNum w:abstractNumId="25" w15:restartNumberingAfterBreak="0">
     <w:nsid w:val="50C96EA4"/>
     <w:multiLevelType w:val="multilevel"/>
     <w:tmpl w:val="34C2837E"/>
@@ -9372,7 +9405,7 @@
       </w:rPr>
     </w:lvl>
   </w:abstractNum>
-  <w:abstractNum w:abstractNumId="25" w15:restartNumberingAfterBreak="0">
+  <w:abstractNum w:abstractNumId="26" w15:restartNumberingAfterBreak="0">
     <w:nsid w:val="56902673"/>
     <w:multiLevelType w:val="multilevel"/>
     <w:tmpl w:val="2346B966"/>
@@ -9499,7 +9532,7 @@
       </w:rPr>
     </w:lvl>
   </w:abstractNum>
-  <w:abstractNum w:abstractNumId="26" w15:restartNumberingAfterBreak="0">
+  <w:abstractNum w:abstractNumId="27" w15:restartNumberingAfterBreak="0">
     <w:nsid w:val="5B3B1CEC"/>
     <w:multiLevelType w:val="hybridMultilevel"/>
     <w:tmpl w:val="426465C6"/>
@@ -9612,13 +9645,13 @@
       </w:rPr>
     </w:lvl>
   </w:abstractNum>
-  <w:abstractNum w:abstractNumId="27" w15:restartNumberingAfterBreak="0">
+  <w:abstractNum w:abstractNumId="28" w15:restartNumberingAfterBreak="0">
     <w:nsid w:val="5BC31123"/>
     <w:multiLevelType w:val="multilevel"/>
     <w:tmpl w:val="1B04B730"/>
     <w:numStyleLink w:val="RSBullets"/>
   </w:abstractNum>
-  <w:abstractNum w:abstractNumId="28" w15:restartNumberingAfterBreak="0">
+  <w:abstractNum w:abstractNumId="29" w15:restartNumberingAfterBreak="0">
     <w:nsid w:val="5C79547F"/>
     <w:multiLevelType w:val="hybridMultilevel"/>
     <w:tmpl w:val="E2E2A056"/>
@@ -9704,7 +9737,7 @@
       </w:pPr>
     </w:lvl>
   </w:abstractNum>
-  <w:abstractNum w:abstractNumId="29" w15:restartNumberingAfterBreak="0">
+  <w:abstractNum w:abstractNumId="30" w15:restartNumberingAfterBreak="0">
     <w:nsid w:val="5D33332E"/>
     <w:multiLevelType w:val="multilevel"/>
     <w:tmpl w:val="0407001D"/>
@@ -9790,19 +9823,19 @@
       </w:pPr>
     </w:lvl>
   </w:abstractNum>
-  <w:abstractNum w:abstractNumId="30" w15:restartNumberingAfterBreak="0">
+  <w:abstractNum w:abstractNumId="31" w15:restartNumberingAfterBreak="0">
     <w:nsid w:val="63A56C02"/>
     <w:multiLevelType w:val="multilevel"/>
     <w:tmpl w:val="760620C0"/>
     <w:numStyleLink w:val="1ai"/>
   </w:abstractNum>
-  <w:abstractNum w:abstractNumId="31" w15:restartNumberingAfterBreak="0">
+  <w:abstractNum w:abstractNumId="32" w15:restartNumberingAfterBreak="0">
     <w:nsid w:val="65BC23B4"/>
     <w:multiLevelType w:val="multilevel"/>
     <w:tmpl w:val="1B04B730"/>
     <w:numStyleLink w:val="RSBullets"/>
   </w:abstractNum>
-  <w:abstractNum w:abstractNumId="32" w15:restartNumberingAfterBreak="0">
+  <w:abstractNum w:abstractNumId="33" w15:restartNumberingAfterBreak="0">
     <w:nsid w:val="69830EF2"/>
     <w:multiLevelType w:val="hybridMultilevel"/>
     <w:tmpl w:val="66426D5A"/>
@@ -9888,7 +9921,287 @@
       </w:pPr>
     </w:lvl>
   </w:abstractNum>
-  <w:abstractNum w:abstractNumId="33" w15:restartNumberingAfterBreak="0">
+  <w:abstractNum w:abstractNumId="34" w15:restartNumberingAfterBreak="0">
+    <w:nsid w:val="6AE35634"/>
+    <w:multiLevelType w:val="hybridMultilevel"/>
+    <w:tmpl w:val="BE7AC17E"/>
+    <w:lvl w:ilvl="0" w:tplc="04090001">
+      <w:start w:val="1"/>
+      <w:numFmt w:val="bullet"/>
+      <w:lvlText w:val=""/>
+      <w:lvlJc w:val="left"/>
+      <w:pPr>
+        <w:tabs>
+          <w:tab w:val="num" w:pos="720"/>
+        </w:tabs>
+        <w:ind w:left="720" w:hanging="360"/>
+      </w:pPr>
+      <w:rPr>
+        <w:rFonts w:ascii="Symbol" w:hAnsi="Symbol" w:hint="default"/>
+      </w:rPr>
+    </w:lvl>
+    <w:lvl w:ilvl="1" w:tplc="FFFFFFFF">
+      <w:start w:val="1"/>
+      <w:numFmt w:val="bullet"/>
+      <w:lvlText w:val="►"/>
+      <w:lvlJc w:val="left"/>
+      <w:pPr>
+        <w:tabs>
+          <w:tab w:val="num" w:pos="1440"/>
+        </w:tabs>
+        <w:ind w:left="1440" w:hanging="360"/>
+      </w:pPr>
+      <w:rPr>
+        <w:rFonts w:ascii="Arial" w:hAnsi="Arial" w:hint="default"/>
+      </w:rPr>
+    </w:lvl>
+    <w:lvl w:ilvl="2" w:tplc="FFFFFFFF" w:tentative="1">
+      <w:start w:val="1"/>
+      <w:numFmt w:val="bullet"/>
+      <w:lvlText w:val="►"/>
+      <w:lvlJc w:val="left"/>
+      <w:pPr>
+        <w:tabs>
+          <w:tab w:val="num" w:pos="2160"/>
+        </w:tabs>
+        <w:ind w:left="2160" w:hanging="360"/>
+      </w:pPr>
+      <w:rPr>
+        <w:rFonts w:ascii="Arial" w:hAnsi="Arial" w:hint="default"/>
+      </w:rPr>
+    </w:lvl>
+    <w:lvl w:ilvl="3" w:tplc="FFFFFFFF" w:tentative="1">
+      <w:start w:val="1"/>
+      <w:numFmt w:val="bullet"/>
+      <w:lvlText w:val="►"/>
+      <w:lvlJc w:val="left"/>
+      <w:pPr>
+        <w:tabs>
+          <w:tab w:val="num" w:pos="2880"/>
+        </w:tabs>
+        <w:ind w:left="2880" w:hanging="360"/>
+      </w:pPr>
+      <w:rPr>
+        <w:rFonts w:ascii="Arial" w:hAnsi="Arial" w:hint="default"/>
+      </w:rPr>
+    </w:lvl>
+    <w:lvl w:ilvl="4" w:tplc="FFFFFFFF" w:tentative="1">
+      <w:start w:val="1"/>
+      <w:numFmt w:val="bullet"/>
+      <w:lvlText w:val="►"/>
+      <w:lvlJc w:val="left"/>
+      <w:pPr>
+        <w:tabs>
+          <w:tab w:val="num" w:pos="3600"/>
+        </w:tabs>
+        <w:ind w:left="3600" w:hanging="360"/>
+      </w:pPr>
+      <w:rPr>
+        <w:rFonts w:ascii="Arial" w:hAnsi="Arial" w:hint="default"/>
+      </w:rPr>
+    </w:lvl>
+    <w:lvl w:ilvl="5" w:tplc="FFFFFFFF" w:tentative="1">
+      <w:start w:val="1"/>
+      <w:numFmt w:val="bullet"/>
+      <w:lvlText w:val="►"/>
+      <w:lvlJc w:val="left"/>
+      <w:pPr>
+        <w:tabs>
+          <w:tab w:val="num" w:pos="4320"/>
+        </w:tabs>
+        <w:ind w:left="4320" w:hanging="360"/>
+      </w:pPr>
+      <w:rPr>
+        <w:rFonts w:ascii="Arial" w:hAnsi="Arial" w:hint="default"/>
+      </w:rPr>
+    </w:lvl>
+    <w:lvl w:ilvl="6" w:tplc="FFFFFFFF" w:tentative="1">
+      <w:start w:val="1"/>
+      <w:numFmt w:val="bullet"/>
+      <w:lvlText w:val="►"/>
+      <w:lvlJc w:val="left"/>
+      <w:pPr>
+        <w:tabs>
+          <w:tab w:val="num" w:pos="5040"/>
+        </w:tabs>
+        <w:ind w:left="5040" w:hanging="360"/>
+      </w:pPr>
+      <w:rPr>
+        <w:rFonts w:ascii="Arial" w:hAnsi="Arial" w:hint="default"/>
+      </w:rPr>
+    </w:lvl>
+    <w:lvl w:ilvl="7" w:tplc="FFFFFFFF" w:tentative="1">
+      <w:start w:val="1"/>
+      <w:numFmt w:val="bullet"/>
+      <w:lvlText w:val="►"/>
+      <w:lvlJc w:val="left"/>
+      <w:pPr>
+        <w:tabs>
+          <w:tab w:val="num" w:pos="5760"/>
+        </w:tabs>
+        <w:ind w:left="5760" w:hanging="360"/>
+      </w:pPr>
+      <w:rPr>
+        <w:rFonts w:ascii="Arial" w:hAnsi="Arial" w:hint="default"/>
+      </w:rPr>
+    </w:lvl>
+    <w:lvl w:ilvl="8" w:tplc="FFFFFFFF" w:tentative="1">
+      <w:start w:val="1"/>
+      <w:numFmt w:val="bullet"/>
+      <w:lvlText w:val="►"/>
+      <w:lvlJc w:val="left"/>
+      <w:pPr>
+        <w:tabs>
+          <w:tab w:val="num" w:pos="6480"/>
+        </w:tabs>
+        <w:ind w:left="6480" w:hanging="360"/>
+      </w:pPr>
+      <w:rPr>
+        <w:rFonts w:ascii="Arial" w:hAnsi="Arial" w:hint="default"/>
+      </w:rPr>
+    </w:lvl>
+  </w:abstractNum>
+  <w:abstractNum w:abstractNumId="35" w15:restartNumberingAfterBreak="0">
+    <w:nsid w:val="6EA1598F"/>
+    <w:multiLevelType w:val="hybridMultilevel"/>
+    <w:tmpl w:val="159A135C"/>
+    <w:lvl w:ilvl="0" w:tplc="0E16BB88">
+      <w:start w:val="1"/>
+      <w:numFmt w:val="bullet"/>
+      <w:lvlText w:val="►"/>
+      <w:lvlJc w:val="left"/>
+      <w:pPr>
+        <w:tabs>
+          <w:tab w:val="num" w:pos="720"/>
+        </w:tabs>
+        <w:ind w:left="720" w:hanging="360"/>
+      </w:pPr>
+      <w:rPr>
+        <w:rFonts w:ascii="Arial" w:hAnsi="Arial" w:hint="default"/>
+      </w:rPr>
+    </w:lvl>
+    <w:lvl w:ilvl="1" w:tplc="F0023910" w:tentative="1">
+      <w:start w:val="1"/>
+      <w:numFmt w:val="bullet"/>
+      <w:lvlText w:val="►"/>
+      <w:lvlJc w:val="left"/>
+      <w:pPr>
+        <w:tabs>
+          <w:tab w:val="num" w:pos="1440"/>
+        </w:tabs>
+        <w:ind w:left="1440" w:hanging="360"/>
+      </w:pPr>
+      <w:rPr>
+        <w:rFonts w:ascii="Arial" w:hAnsi="Arial" w:hint="default"/>
+      </w:rPr>
+    </w:lvl>
+    <w:lvl w:ilvl="2" w:tplc="77742546" w:tentative="1">
+      <w:start w:val="1"/>
+      <w:numFmt w:val="bullet"/>
+      <w:lvlText w:val="►"/>
+      <w:lvlJc w:val="left"/>
+      <w:pPr>
+        <w:tabs>
+          <w:tab w:val="num" w:pos="2160"/>
+        </w:tabs>
+        <w:ind w:left="2160" w:hanging="360"/>
+      </w:pPr>
+      <w:rPr>
+        <w:rFonts w:ascii="Arial" w:hAnsi="Arial" w:hint="default"/>
+      </w:rPr>
+    </w:lvl>
+    <w:lvl w:ilvl="3" w:tplc="6C127EFC" w:tentative="1">
+      <w:start w:val="1"/>
+      <w:numFmt w:val="bullet"/>
+      <w:lvlText w:val="►"/>
+      <w:lvlJc w:val="left"/>
+      <w:pPr>
+        <w:tabs>
+          <w:tab w:val="num" w:pos="2880"/>
+        </w:tabs>
+        <w:ind w:left="2880" w:hanging="360"/>
+      </w:pPr>
+      <w:rPr>
+        <w:rFonts w:ascii="Arial" w:hAnsi="Arial" w:hint="default"/>
+      </w:rPr>
+    </w:lvl>
+    <w:lvl w:ilvl="4" w:tplc="0408066A" w:tentative="1">
+      <w:start w:val="1"/>
+      <w:numFmt w:val="bullet"/>
+      <w:lvlText w:val="►"/>
+      <w:lvlJc w:val="left"/>
+      <w:pPr>
+        <w:tabs>
+          <w:tab w:val="num" w:pos="3600"/>
+        </w:tabs>
+        <w:ind w:left="3600" w:hanging="360"/>
+      </w:pPr>
+      <w:rPr>
+        <w:rFonts w:ascii="Arial" w:hAnsi="Arial" w:hint="default"/>
+      </w:rPr>
+    </w:lvl>
+    <w:lvl w:ilvl="5" w:tplc="4A04CF2A" w:tentative="1">
+      <w:start w:val="1"/>
+      <w:numFmt w:val="bullet"/>
+      <w:lvlText w:val="►"/>
+      <w:lvlJc w:val="left"/>
+      <w:pPr>
+        <w:tabs>
+          <w:tab w:val="num" w:pos="4320"/>
+        </w:tabs>
+        <w:ind w:left="4320" w:hanging="360"/>
+      </w:pPr>
+      <w:rPr>
+        <w:rFonts w:ascii="Arial" w:hAnsi="Arial" w:hint="default"/>
+      </w:rPr>
+    </w:lvl>
+    <w:lvl w:ilvl="6" w:tplc="147415B6" w:tentative="1">
+      <w:start w:val="1"/>
+      <w:numFmt w:val="bullet"/>
+      <w:lvlText w:val="►"/>
+      <w:lvlJc w:val="left"/>
+      <w:pPr>
+        <w:tabs>
+          <w:tab w:val="num" w:pos="5040"/>
+        </w:tabs>
+        <w:ind w:left="5040" w:hanging="360"/>
+      </w:pPr>
+      <w:rPr>
+        <w:rFonts w:ascii="Arial" w:hAnsi="Arial" w:hint="default"/>
+      </w:rPr>
+    </w:lvl>
+    <w:lvl w:ilvl="7" w:tplc="664CF80E" w:tentative="1">
+      <w:start w:val="1"/>
+      <w:numFmt w:val="bullet"/>
+      <w:lvlText w:val="►"/>
+      <w:lvlJc w:val="left"/>
+      <w:pPr>
+        <w:tabs>
+          <w:tab w:val="num" w:pos="5760"/>
+        </w:tabs>
+        <w:ind w:left="5760" w:hanging="360"/>
+      </w:pPr>
+      <w:rPr>
+        <w:rFonts w:ascii="Arial" w:hAnsi="Arial" w:hint="default"/>
+      </w:rPr>
+    </w:lvl>
+    <w:lvl w:ilvl="8" w:tplc="B19E8140" w:tentative="1">
+      <w:start w:val="1"/>
+      <w:numFmt w:val="bullet"/>
+      <w:lvlText w:val="►"/>
+      <w:lvlJc w:val="left"/>
+      <w:pPr>
+        <w:tabs>
+          <w:tab w:val="num" w:pos="6480"/>
+        </w:tabs>
+        <w:ind w:left="6480" w:hanging="360"/>
+      </w:pPr>
+      <w:rPr>
+        <w:rFonts w:ascii="Arial" w:hAnsi="Arial" w:hint="default"/>
+      </w:rPr>
+    </w:lvl>
+  </w:abstractNum>
+  <w:abstractNum w:abstractNumId="36" w15:restartNumberingAfterBreak="0">
     <w:nsid w:val="75C5455A"/>
     <w:multiLevelType w:val="hybridMultilevel"/>
     <w:tmpl w:val="BC966374"/>
@@ -10002,64 +10315,64 @@
     </w:lvl>
   </w:abstractNum>
   <w:num w:numId="1" w16cid:durableId="1170438871">
-    <w:abstractNumId w:val="7"/>
+    <w:abstractNumId w:val="8"/>
   </w:num>
   <w:num w:numId="2" w16cid:durableId="2012171325">
-    <w:abstractNumId w:val="21"/>
+    <w:abstractNumId w:val="22"/>
   </w:num>
   <w:num w:numId="3" w16cid:durableId="2012561503">
-    <w:abstractNumId w:val="15"/>
+    <w:abstractNumId w:val="16"/>
   </w:num>
   <w:num w:numId="4" w16cid:durableId="523977845">
-    <w:abstractNumId w:val="11"/>
+    <w:abstractNumId w:val="12"/>
   </w:num>
   <w:num w:numId="5" w16cid:durableId="1863593055">
-    <w:abstractNumId w:val="4"/>
+    <w:abstractNumId w:val="5"/>
   </w:num>
   <w:num w:numId="6" w16cid:durableId="427623177">
     <w:abstractNumId w:val="2"/>
   </w:num>
   <w:num w:numId="7" w16cid:durableId="646980725">
-    <w:abstractNumId w:val="12"/>
+    <w:abstractNumId w:val="13"/>
   </w:num>
   <w:num w:numId="8" w16cid:durableId="514422520">
-    <w:abstractNumId w:val="25"/>
+    <w:abstractNumId w:val="26"/>
   </w:num>
   <w:num w:numId="9" w16cid:durableId="34232550">
-    <w:abstractNumId w:val="26"/>
+    <w:abstractNumId w:val="27"/>
   </w:num>
   <w:num w:numId="10" w16cid:durableId="861825860">
     <w:abstractNumId w:val="1"/>
   </w:num>
   <w:num w:numId="11" w16cid:durableId="980384070">
-    <w:abstractNumId w:val="5"/>
+    <w:abstractNumId w:val="6"/>
   </w:num>
   <w:num w:numId="12" w16cid:durableId="315768150">
-    <w:abstractNumId w:val="9"/>
+    <w:abstractNumId w:val="10"/>
   </w:num>
   <w:num w:numId="13" w16cid:durableId="1002396076">
-    <w:abstractNumId w:val="17"/>
+    <w:abstractNumId w:val="18"/>
   </w:num>
   <w:num w:numId="14" w16cid:durableId="1220094731">
-    <w:abstractNumId w:val="20"/>
+    <w:abstractNumId w:val="21"/>
   </w:num>
   <w:num w:numId="15" w16cid:durableId="1196773948">
-    <w:abstractNumId w:val="18"/>
+    <w:abstractNumId w:val="19"/>
   </w:num>
   <w:num w:numId="16" w16cid:durableId="1622683382">
-    <w:abstractNumId w:val="29"/>
+    <w:abstractNumId w:val="30"/>
   </w:num>
   <w:num w:numId="17" w16cid:durableId="1694577982">
-    <w:abstractNumId w:val="27"/>
+    <w:abstractNumId w:val="28"/>
   </w:num>
   <w:num w:numId="18" w16cid:durableId="237136006">
-    <w:abstractNumId w:val="31"/>
+    <w:abstractNumId w:val="32"/>
   </w:num>
   <w:num w:numId="19" w16cid:durableId="1641963118">
-    <w:abstractNumId w:val="10"/>
+    <w:abstractNumId w:val="11"/>
   </w:num>
   <w:num w:numId="20" w16cid:durableId="922102183">
-    <w:abstractNumId w:val="13"/>
+    <w:abstractNumId w:val="14"/>
   </w:num>
   <w:num w:numId="21" w16cid:durableId="201870063">
     <w:abstractNumId w:val="3"/>
@@ -10074,13 +10387,13 @@
     <w:abstractNumId w:val="0"/>
   </w:num>
   <w:num w:numId="25" w16cid:durableId="190267757">
-    <w:abstractNumId w:val="19"/>
+    <w:abstractNumId w:val="20"/>
   </w:num>
   <w:num w:numId="26" w16cid:durableId="1639795909">
-    <w:abstractNumId w:val="24"/>
+    <w:abstractNumId w:val="25"/>
   </w:num>
   <w:num w:numId="27" w16cid:durableId="1646088463">
-    <w:abstractNumId w:val="24"/>
+    <w:abstractNumId w:val="25"/>
     <w:lvlOverride w:ilvl="0">
       <w:startOverride w:val="1"/>
     </w:lvlOverride>
@@ -10110,7 +10423,7 @@
     </w:lvlOverride>
   </w:num>
   <w:num w:numId="28" w16cid:durableId="2099784051">
-    <w:abstractNumId w:val="30"/>
+    <w:abstractNumId w:val="31"/>
   </w:num>
   <w:num w:numId="29" w16cid:durableId="1790658031">
     <w:abstractNumId w:val="3"/>
@@ -10122,7 +10435,7 @@
     <w:abstractNumId w:val="3"/>
   </w:num>
   <w:num w:numId="32" w16cid:durableId="491141638">
-    <w:abstractNumId w:val="28"/>
+    <w:abstractNumId w:val="29"/>
     <w:lvlOverride w:ilvl="0">
       <w:startOverride w:val="1"/>
     </w:lvlOverride>
@@ -10152,7 +10465,7 @@
     </w:lvlOverride>
   </w:num>
   <w:num w:numId="33" w16cid:durableId="878862728">
-    <w:abstractNumId w:val="22"/>
+    <w:abstractNumId w:val="23"/>
     <w:lvlOverride w:ilvl="0">
       <w:startOverride w:val="1"/>
     </w:lvlOverride>
@@ -10182,28 +10495,37 @@
     </w:lvlOverride>
   </w:num>
   <w:num w:numId="34" w16cid:durableId="1975331402">
-    <w:abstractNumId w:val="22"/>
+    <w:abstractNumId w:val="23"/>
   </w:num>
   <w:num w:numId="35" w16cid:durableId="187256350">
-    <w:abstractNumId w:val="32"/>
+    <w:abstractNumId w:val="33"/>
   </w:num>
   <w:num w:numId="36" w16cid:durableId="1179546093">
-    <w:abstractNumId w:val="33"/>
+    <w:abstractNumId w:val="36"/>
   </w:num>
   <w:num w:numId="37" w16cid:durableId="559368323">
-    <w:abstractNumId w:val="6"/>
+    <w:abstractNumId w:val="7"/>
   </w:num>
   <w:num w:numId="38" w16cid:durableId="1548759794">
-    <w:abstractNumId w:val="14"/>
+    <w:abstractNumId w:val="15"/>
   </w:num>
   <w:num w:numId="39" w16cid:durableId="1242721211">
-    <w:abstractNumId w:val="16"/>
+    <w:abstractNumId w:val="17"/>
   </w:num>
   <w:num w:numId="40" w16cid:durableId="2128772446">
-    <w:abstractNumId w:val="8"/>
+    <w:abstractNumId w:val="9"/>
   </w:num>
   <w:num w:numId="41" w16cid:durableId="1063066355">
-    <w:abstractNumId w:val="23"/>
+    <w:abstractNumId w:val="24"/>
+  </w:num>
+  <w:num w:numId="42" w16cid:durableId="312487634">
+    <w:abstractNumId w:val="4"/>
+  </w:num>
+  <w:num w:numId="43" w16cid:durableId="1544517118">
+    <w:abstractNumId w:val="34"/>
+  </w:num>
+  <w:num w:numId="44" w16cid:durableId="2145811139">
+    <w:abstractNumId w:val="35"/>
   </w:num>
   <w:numIdMacAtCleanup w:val="9"/>
 </w:numbering>
@@ -10786,7 +11108,6 @@
   <w:style w:type="character" w:default="1" w:styleId="DefaultParagraphFont">
     <w:name w:val="Default Paragraph Font"/>
     <w:uiPriority w:val="1"/>
-    <w:semiHidden/>
     <w:unhideWhenUsed/>
   </w:style>
   <w:style w:type="table" w:default="1" w:styleId="TableNormal">

</xml_diff>

<commit_message>
Update user manual for setup scripts and playback tabs
Version 1.3. Covers Python 3.12+ with the pinned packages, the setup scripts and requirements.txt, the SMW Playback and Multi-Sequencer tabs, arb PDWs in the CSV column descriptions, and the rev 2.4 ICD. The manual setup now installs from requirements.txt.
</commit_message>
<xml_diff>
--- a/Python Script SMW200A Instructions.docx
+++ b/Python Script SMW200A Instructions.docx
@@ -13,21 +13,12 @@
     <w:p/>
     <w:p>
       <w:r>
-        <w:t>Document Version 1.</w:t>
-      </w:r>
-      <w:r>
-        <w:t>2</w:t>
-      </w:r>
-    </w:p>
-    <w:p>
-      <w:r>
-        <w:t>9/2</w:t>
-      </w:r>
-      <w:r>
-        <w:t>4</w:t>
-      </w:r>
-      <w:r>
-        <w:t>/2026</w:t>
+        <w:t xml:space="preserve">Document Version 1.3</w:t>
+      </w:r>
+    </w:p>
+    <w:p>
+      <w:r>
+        <w:t xml:space="preserve">10/14/2026</w:t>
       </w:r>
     </w:p>
     <w:p/>
@@ -172,11 +163,7 @@
           </w:pPr>
           <w:r>
             <w:fldChar w:fldCharType="begin"/>
-          </w:r>
-          <w:r>
             <w:instrText xml:space="preserve"> TOC \o "1-3" \h \z \u </w:instrText>
-          </w:r>
-          <w:r>
             <w:fldChar w:fldCharType="separate"/>
           </w:r>
           <w:hyperlink w:anchor="_Toc242882264" w:history="1">
@@ -214,46 +201,10 @@
                 <w:webHidden/>
               </w:rPr>
               <w:tab/>
-            </w:r>
-            <w:r>
-              <w:rPr>
-                <w:noProof/>
-                <w:webHidden/>
-              </w:rPr>
               <w:fldChar w:fldCharType="begin"/>
-            </w:r>
-            <w:r>
-              <w:rPr>
-                <w:noProof/>
-                <w:webHidden/>
-              </w:rPr>
               <w:instrText xml:space="preserve"> PAGEREF _Toc242882264 \h </w:instrText>
-            </w:r>
-            <w:r>
-              <w:rPr>
-                <w:noProof/>
-                <w:webHidden/>
-              </w:rPr>
-            </w:r>
-            <w:r>
-              <w:rPr>
-                <w:noProof/>
-                <w:webHidden/>
-              </w:rPr>
               <w:fldChar w:fldCharType="separate"/>
-            </w:r>
-            <w:r>
-              <w:rPr>
-                <w:noProof/>
-                <w:webHidden/>
-              </w:rPr>
               <w:t>3</w:t>
-            </w:r>
-            <w:r>
-              <w:rPr>
-                <w:noProof/>
-                <w:webHidden/>
-              </w:rPr>
               <w:fldChar w:fldCharType="end"/>
             </w:r>
           </w:hyperlink>
@@ -302,46 +253,10 @@
                 <w:webHidden/>
               </w:rPr>
               <w:tab/>
-            </w:r>
-            <w:r>
-              <w:rPr>
-                <w:noProof/>
-                <w:webHidden/>
-              </w:rPr>
               <w:fldChar w:fldCharType="begin"/>
-            </w:r>
-            <w:r>
-              <w:rPr>
-                <w:noProof/>
-                <w:webHidden/>
-              </w:rPr>
               <w:instrText xml:space="preserve"> PAGEREF _Toc242882265 \h </w:instrText>
-            </w:r>
-            <w:r>
-              <w:rPr>
-                <w:noProof/>
-                <w:webHidden/>
-              </w:rPr>
-            </w:r>
-            <w:r>
-              <w:rPr>
-                <w:noProof/>
-                <w:webHidden/>
-              </w:rPr>
               <w:fldChar w:fldCharType="separate"/>
-            </w:r>
-            <w:r>
-              <w:rPr>
-                <w:noProof/>
-                <w:webHidden/>
-              </w:rPr>
               <w:t>3</w:t>
-            </w:r>
-            <w:r>
-              <w:rPr>
-                <w:noProof/>
-                <w:webHidden/>
-              </w:rPr>
               <w:fldChar w:fldCharType="end"/>
             </w:r>
           </w:hyperlink>
@@ -390,46 +305,10 @@
                 <w:webHidden/>
               </w:rPr>
               <w:tab/>
-            </w:r>
-            <w:r>
-              <w:rPr>
-                <w:noProof/>
-                <w:webHidden/>
-              </w:rPr>
               <w:fldChar w:fldCharType="begin"/>
-            </w:r>
-            <w:r>
-              <w:rPr>
-                <w:noProof/>
-                <w:webHidden/>
-              </w:rPr>
               <w:instrText xml:space="preserve"> PAGEREF _Toc242882266 \h </w:instrText>
-            </w:r>
-            <w:r>
-              <w:rPr>
-                <w:noProof/>
-                <w:webHidden/>
-              </w:rPr>
-            </w:r>
-            <w:r>
-              <w:rPr>
-                <w:noProof/>
-                <w:webHidden/>
-              </w:rPr>
               <w:fldChar w:fldCharType="separate"/>
-            </w:r>
-            <w:r>
-              <w:rPr>
-                <w:noProof/>
-                <w:webHidden/>
-              </w:rPr>
               <w:t>3</w:t>
-            </w:r>
-            <w:r>
-              <w:rPr>
-                <w:noProof/>
-                <w:webHidden/>
-              </w:rPr>
               <w:fldChar w:fldCharType="end"/>
             </w:r>
           </w:hyperlink>
@@ -484,46 +363,10 @@
                 <w:webHidden/>
               </w:rPr>
               <w:tab/>
-            </w:r>
-            <w:r>
-              <w:rPr>
-                <w:noProof/>
-                <w:webHidden/>
-              </w:rPr>
               <w:fldChar w:fldCharType="begin"/>
-            </w:r>
-            <w:r>
-              <w:rPr>
-                <w:noProof/>
-                <w:webHidden/>
-              </w:rPr>
               <w:instrText xml:space="preserve"> PAGEREF _Toc242882267 \h </w:instrText>
-            </w:r>
-            <w:r>
-              <w:rPr>
-                <w:noProof/>
-                <w:webHidden/>
-              </w:rPr>
-            </w:r>
-            <w:r>
-              <w:rPr>
-                <w:noProof/>
-                <w:webHidden/>
-              </w:rPr>
               <w:fldChar w:fldCharType="separate"/>
-            </w:r>
-            <w:r>
-              <w:rPr>
-                <w:noProof/>
-                <w:webHidden/>
-              </w:rPr>
               <w:t>3</w:t>
-            </w:r>
-            <w:r>
-              <w:rPr>
-                <w:noProof/>
-                <w:webHidden/>
-              </w:rPr>
               <w:fldChar w:fldCharType="end"/>
             </w:r>
           </w:hyperlink>
@@ -572,46 +415,10 @@
                 <w:webHidden/>
               </w:rPr>
               <w:tab/>
-            </w:r>
-            <w:r>
-              <w:rPr>
-                <w:noProof/>
-                <w:webHidden/>
-              </w:rPr>
               <w:fldChar w:fldCharType="begin"/>
-            </w:r>
-            <w:r>
-              <w:rPr>
-                <w:noProof/>
-                <w:webHidden/>
-              </w:rPr>
               <w:instrText xml:space="preserve"> PAGEREF _Toc242882268 \h </w:instrText>
-            </w:r>
-            <w:r>
-              <w:rPr>
-                <w:noProof/>
-                <w:webHidden/>
-              </w:rPr>
-            </w:r>
-            <w:r>
-              <w:rPr>
-                <w:noProof/>
-                <w:webHidden/>
-              </w:rPr>
               <w:fldChar w:fldCharType="separate"/>
-            </w:r>
-            <w:r>
-              <w:rPr>
-                <w:noProof/>
-                <w:webHidden/>
-              </w:rPr>
               <w:t>3</w:t>
-            </w:r>
-            <w:r>
-              <w:rPr>
-                <w:noProof/>
-                <w:webHidden/>
-              </w:rPr>
               <w:fldChar w:fldCharType="end"/>
             </w:r>
           </w:hyperlink>
@@ -660,46 +467,10 @@
                 <w:webHidden/>
               </w:rPr>
               <w:tab/>
-            </w:r>
-            <w:r>
-              <w:rPr>
-                <w:noProof/>
-                <w:webHidden/>
-              </w:rPr>
               <w:fldChar w:fldCharType="begin"/>
-            </w:r>
-            <w:r>
-              <w:rPr>
-                <w:noProof/>
-                <w:webHidden/>
-              </w:rPr>
               <w:instrText xml:space="preserve"> PAGEREF _Toc242882269 \h </w:instrText>
-            </w:r>
-            <w:r>
-              <w:rPr>
-                <w:noProof/>
-                <w:webHidden/>
-              </w:rPr>
-            </w:r>
-            <w:r>
-              <w:rPr>
-                <w:noProof/>
-                <w:webHidden/>
-              </w:rPr>
               <w:fldChar w:fldCharType="separate"/>
-            </w:r>
-            <w:r>
-              <w:rPr>
-                <w:noProof/>
-                <w:webHidden/>
-              </w:rPr>
               <w:t>4</w:t>
-            </w:r>
-            <w:r>
-              <w:rPr>
-                <w:noProof/>
-                <w:webHidden/>
-              </w:rPr>
               <w:fldChar w:fldCharType="end"/>
             </w:r>
           </w:hyperlink>
@@ -748,46 +519,10 @@
                 <w:webHidden/>
               </w:rPr>
               <w:tab/>
-            </w:r>
-            <w:r>
-              <w:rPr>
-                <w:noProof/>
-                <w:webHidden/>
-              </w:rPr>
               <w:fldChar w:fldCharType="begin"/>
-            </w:r>
-            <w:r>
-              <w:rPr>
-                <w:noProof/>
-                <w:webHidden/>
-              </w:rPr>
               <w:instrText xml:space="preserve"> PAGEREF _Toc242882270 \h </w:instrText>
-            </w:r>
-            <w:r>
-              <w:rPr>
-                <w:noProof/>
-                <w:webHidden/>
-              </w:rPr>
-            </w:r>
-            <w:r>
-              <w:rPr>
-                <w:noProof/>
-                <w:webHidden/>
-              </w:rPr>
               <w:fldChar w:fldCharType="separate"/>
-            </w:r>
-            <w:r>
-              <w:rPr>
-                <w:noProof/>
-                <w:webHidden/>
-              </w:rPr>
               <w:t>4</w:t>
-            </w:r>
-            <w:r>
-              <w:rPr>
-                <w:noProof/>
-                <w:webHidden/>
-              </w:rPr>
               <w:fldChar w:fldCharType="end"/>
             </w:r>
           </w:hyperlink>
@@ -840,46 +575,10 @@
                 <w:webHidden/>
               </w:rPr>
               <w:tab/>
-            </w:r>
-            <w:r>
-              <w:rPr>
-                <w:noProof/>
-                <w:webHidden/>
-              </w:rPr>
               <w:fldChar w:fldCharType="begin"/>
-            </w:r>
-            <w:r>
-              <w:rPr>
-                <w:noProof/>
-                <w:webHidden/>
-              </w:rPr>
               <w:instrText xml:space="preserve"> PAGEREF _Toc242882271 \h </w:instrText>
-            </w:r>
-            <w:r>
-              <w:rPr>
-                <w:noProof/>
-                <w:webHidden/>
-              </w:rPr>
-            </w:r>
-            <w:r>
-              <w:rPr>
-                <w:noProof/>
-                <w:webHidden/>
-              </w:rPr>
               <w:fldChar w:fldCharType="separate"/>
-            </w:r>
-            <w:r>
-              <w:rPr>
-                <w:noProof/>
-                <w:webHidden/>
-              </w:rPr>
               <w:t>4</w:t>
-            </w:r>
-            <w:r>
-              <w:rPr>
-                <w:noProof/>
-                <w:webHidden/>
-              </w:rPr>
               <w:fldChar w:fldCharType="end"/>
             </w:r>
           </w:hyperlink>
@@ -932,46 +631,10 @@
                 <w:webHidden/>
               </w:rPr>
               <w:tab/>
-            </w:r>
-            <w:r>
-              <w:rPr>
-                <w:noProof/>
-                <w:webHidden/>
-              </w:rPr>
               <w:fldChar w:fldCharType="begin"/>
-            </w:r>
-            <w:r>
-              <w:rPr>
-                <w:noProof/>
-                <w:webHidden/>
-              </w:rPr>
               <w:instrText xml:space="preserve"> PAGEREF _Toc242882272 \h </w:instrText>
-            </w:r>
-            <w:r>
-              <w:rPr>
-                <w:noProof/>
-                <w:webHidden/>
-              </w:rPr>
-            </w:r>
-            <w:r>
-              <w:rPr>
-                <w:noProof/>
-                <w:webHidden/>
-              </w:rPr>
               <w:fldChar w:fldCharType="separate"/>
-            </w:r>
-            <w:r>
-              <w:rPr>
-                <w:noProof/>
-                <w:webHidden/>
-              </w:rPr>
               <w:t>4</w:t>
-            </w:r>
-            <w:r>
-              <w:rPr>
-                <w:noProof/>
-                <w:webHidden/>
-              </w:rPr>
               <w:fldChar w:fldCharType="end"/>
             </w:r>
           </w:hyperlink>
@@ -1024,46 +687,10 @@
                 <w:webHidden/>
               </w:rPr>
               <w:tab/>
-            </w:r>
-            <w:r>
-              <w:rPr>
-                <w:noProof/>
-                <w:webHidden/>
-              </w:rPr>
               <w:fldChar w:fldCharType="begin"/>
-            </w:r>
-            <w:r>
-              <w:rPr>
-                <w:noProof/>
-                <w:webHidden/>
-              </w:rPr>
               <w:instrText xml:space="preserve"> PAGEREF _Toc242882273 \h </w:instrText>
-            </w:r>
-            <w:r>
-              <w:rPr>
-                <w:noProof/>
-                <w:webHidden/>
-              </w:rPr>
-            </w:r>
-            <w:r>
-              <w:rPr>
-                <w:noProof/>
-                <w:webHidden/>
-              </w:rPr>
               <w:fldChar w:fldCharType="separate"/>
-            </w:r>
-            <w:r>
-              <w:rPr>
-                <w:noProof/>
-                <w:webHidden/>
-              </w:rPr>
               <w:t>5</w:t>
-            </w:r>
-            <w:r>
-              <w:rPr>
-                <w:noProof/>
-                <w:webHidden/>
-              </w:rPr>
               <w:fldChar w:fldCharType="end"/>
             </w:r>
           </w:hyperlink>
@@ -1116,46 +743,10 @@
                 <w:webHidden/>
               </w:rPr>
               <w:tab/>
-            </w:r>
-            <w:r>
-              <w:rPr>
-                <w:noProof/>
-                <w:webHidden/>
-              </w:rPr>
               <w:fldChar w:fldCharType="begin"/>
-            </w:r>
-            <w:r>
-              <w:rPr>
-                <w:noProof/>
-                <w:webHidden/>
-              </w:rPr>
               <w:instrText xml:space="preserve"> PAGEREF _Toc242882274 \h </w:instrText>
-            </w:r>
-            <w:r>
-              <w:rPr>
-                <w:noProof/>
-                <w:webHidden/>
-              </w:rPr>
-            </w:r>
-            <w:r>
-              <w:rPr>
-                <w:noProof/>
-                <w:webHidden/>
-              </w:rPr>
               <w:fldChar w:fldCharType="separate"/>
-            </w:r>
-            <w:r>
-              <w:rPr>
-                <w:noProof/>
-                <w:webHidden/>
-              </w:rPr>
               <w:t>5</w:t>
-            </w:r>
-            <w:r>
-              <w:rPr>
-                <w:noProof/>
-                <w:webHidden/>
-              </w:rPr>
               <w:fldChar w:fldCharType="end"/>
             </w:r>
           </w:hyperlink>
@@ -1208,46 +799,10 @@
                 <w:webHidden/>
               </w:rPr>
               <w:tab/>
-            </w:r>
-            <w:r>
-              <w:rPr>
-                <w:noProof/>
-                <w:webHidden/>
-              </w:rPr>
               <w:fldChar w:fldCharType="begin"/>
-            </w:r>
-            <w:r>
-              <w:rPr>
-                <w:noProof/>
-                <w:webHidden/>
-              </w:rPr>
               <w:instrText xml:space="preserve"> PAGEREF _Toc242882275 \h </w:instrText>
-            </w:r>
-            <w:r>
-              <w:rPr>
-                <w:noProof/>
-                <w:webHidden/>
-              </w:rPr>
-            </w:r>
-            <w:r>
-              <w:rPr>
-                <w:noProof/>
-                <w:webHidden/>
-              </w:rPr>
               <w:fldChar w:fldCharType="separate"/>
-            </w:r>
-            <w:r>
-              <w:rPr>
-                <w:noProof/>
-                <w:webHidden/>
-              </w:rPr>
               <w:t>5</w:t>
-            </w:r>
-            <w:r>
-              <w:rPr>
-                <w:noProof/>
-                <w:webHidden/>
-              </w:rPr>
               <w:fldChar w:fldCharType="end"/>
             </w:r>
           </w:hyperlink>
@@ -1296,46 +851,10 @@
                 <w:webHidden/>
               </w:rPr>
               <w:tab/>
-            </w:r>
-            <w:r>
-              <w:rPr>
-                <w:noProof/>
-                <w:webHidden/>
-              </w:rPr>
               <w:fldChar w:fldCharType="begin"/>
-            </w:r>
-            <w:r>
-              <w:rPr>
-                <w:noProof/>
-                <w:webHidden/>
-              </w:rPr>
               <w:instrText xml:space="preserve"> PAGEREF _Toc242882276 \h </w:instrText>
-            </w:r>
-            <w:r>
-              <w:rPr>
-                <w:noProof/>
-                <w:webHidden/>
-              </w:rPr>
-            </w:r>
-            <w:r>
-              <w:rPr>
-                <w:noProof/>
-                <w:webHidden/>
-              </w:rPr>
               <w:fldChar w:fldCharType="separate"/>
-            </w:r>
-            <w:r>
-              <w:rPr>
-                <w:noProof/>
-                <w:webHidden/>
-              </w:rPr>
               <w:t>5</w:t>
-            </w:r>
-            <w:r>
-              <w:rPr>
-                <w:noProof/>
-                <w:webHidden/>
-              </w:rPr>
               <w:fldChar w:fldCharType="end"/>
             </w:r>
           </w:hyperlink>
@@ -1384,46 +903,10 @@
                 <w:webHidden/>
               </w:rPr>
               <w:tab/>
-            </w:r>
-            <w:r>
-              <w:rPr>
-                <w:noProof/>
-                <w:webHidden/>
-              </w:rPr>
               <w:fldChar w:fldCharType="begin"/>
-            </w:r>
-            <w:r>
-              <w:rPr>
-                <w:noProof/>
-                <w:webHidden/>
-              </w:rPr>
               <w:instrText xml:space="preserve"> PAGEREF _Toc242882277 \h </w:instrText>
-            </w:r>
-            <w:r>
-              <w:rPr>
-                <w:noProof/>
-                <w:webHidden/>
-              </w:rPr>
-            </w:r>
-            <w:r>
-              <w:rPr>
-                <w:noProof/>
-                <w:webHidden/>
-              </w:rPr>
               <w:fldChar w:fldCharType="separate"/>
-            </w:r>
-            <w:r>
-              <w:rPr>
-                <w:noProof/>
-                <w:webHidden/>
-              </w:rPr>
               <w:t>6</w:t>
-            </w:r>
-            <w:r>
-              <w:rPr>
-                <w:noProof/>
-                <w:webHidden/>
-              </w:rPr>
               <w:fldChar w:fldCharType="end"/>
             </w:r>
           </w:hyperlink>
@@ -1478,46 +961,10 @@
                 <w:webHidden/>
               </w:rPr>
               <w:tab/>
-            </w:r>
-            <w:r>
-              <w:rPr>
-                <w:noProof/>
-                <w:webHidden/>
-              </w:rPr>
               <w:fldChar w:fldCharType="begin"/>
-            </w:r>
-            <w:r>
-              <w:rPr>
-                <w:noProof/>
-                <w:webHidden/>
-              </w:rPr>
               <w:instrText xml:space="preserve"> PAGEREF _Toc242882278 \h </w:instrText>
-            </w:r>
-            <w:r>
-              <w:rPr>
-                <w:noProof/>
-                <w:webHidden/>
-              </w:rPr>
-            </w:r>
-            <w:r>
-              <w:rPr>
-                <w:noProof/>
-                <w:webHidden/>
-              </w:rPr>
               <w:fldChar w:fldCharType="separate"/>
-            </w:r>
-            <w:r>
-              <w:rPr>
-                <w:noProof/>
-                <w:webHidden/>
-              </w:rPr>
               <w:t>6</w:t>
-            </w:r>
-            <w:r>
-              <w:rPr>
-                <w:noProof/>
-                <w:webHidden/>
-              </w:rPr>
               <w:fldChar w:fldCharType="end"/>
             </w:r>
           </w:hyperlink>
@@ -1572,46 +1019,10 @@
                 <w:webHidden/>
               </w:rPr>
               <w:tab/>
-            </w:r>
-            <w:r>
-              <w:rPr>
-                <w:noProof/>
-                <w:webHidden/>
-              </w:rPr>
               <w:fldChar w:fldCharType="begin"/>
-            </w:r>
-            <w:r>
-              <w:rPr>
-                <w:noProof/>
-                <w:webHidden/>
-              </w:rPr>
               <w:instrText xml:space="preserve"> PAGEREF _Toc242882279 \h </w:instrText>
-            </w:r>
-            <w:r>
-              <w:rPr>
-                <w:noProof/>
-                <w:webHidden/>
-              </w:rPr>
-            </w:r>
-            <w:r>
-              <w:rPr>
-                <w:noProof/>
-                <w:webHidden/>
-              </w:rPr>
               <w:fldChar w:fldCharType="separate"/>
-            </w:r>
-            <w:r>
-              <w:rPr>
-                <w:noProof/>
-                <w:webHidden/>
-              </w:rPr>
               <w:t>8</w:t>
-            </w:r>
-            <w:r>
-              <w:rPr>
-                <w:noProof/>
-                <w:webHidden/>
-              </w:rPr>
               <w:fldChar w:fldCharType="end"/>
             </w:r>
           </w:hyperlink>
@@ -1660,46 +1071,10 @@
                 <w:webHidden/>
               </w:rPr>
               <w:tab/>
-            </w:r>
-            <w:r>
-              <w:rPr>
-                <w:noProof/>
-                <w:webHidden/>
-              </w:rPr>
               <w:fldChar w:fldCharType="begin"/>
-            </w:r>
-            <w:r>
-              <w:rPr>
-                <w:noProof/>
-                <w:webHidden/>
-              </w:rPr>
               <w:instrText xml:space="preserve"> PAGEREF _Toc242882280 \h </w:instrText>
-            </w:r>
-            <w:r>
-              <w:rPr>
-                <w:noProof/>
-                <w:webHidden/>
-              </w:rPr>
-            </w:r>
-            <w:r>
-              <w:rPr>
-                <w:noProof/>
-                <w:webHidden/>
-              </w:rPr>
               <w:fldChar w:fldCharType="separate"/>
-            </w:r>
-            <w:r>
-              <w:rPr>
-                <w:noProof/>
-                <w:webHidden/>
-              </w:rPr>
               <w:t>8</w:t>
-            </w:r>
-            <w:r>
-              <w:rPr>
-                <w:noProof/>
-                <w:webHidden/>
-              </w:rPr>
               <w:fldChar w:fldCharType="end"/>
             </w:r>
           </w:hyperlink>
@@ -1748,46 +1123,10 @@
                 <w:webHidden/>
               </w:rPr>
               <w:tab/>
-            </w:r>
-            <w:r>
-              <w:rPr>
-                <w:noProof/>
-                <w:webHidden/>
-              </w:rPr>
               <w:fldChar w:fldCharType="begin"/>
-            </w:r>
-            <w:r>
-              <w:rPr>
-                <w:noProof/>
-                <w:webHidden/>
-              </w:rPr>
               <w:instrText xml:space="preserve"> PAGEREF _Toc242882281 \h </w:instrText>
-            </w:r>
-            <w:r>
-              <w:rPr>
-                <w:noProof/>
-                <w:webHidden/>
-              </w:rPr>
-            </w:r>
-            <w:r>
-              <w:rPr>
-                <w:noProof/>
-                <w:webHidden/>
-              </w:rPr>
               <w:fldChar w:fldCharType="separate"/>
-            </w:r>
-            <w:r>
-              <w:rPr>
-                <w:noProof/>
-                <w:webHidden/>
-              </w:rPr>
               <w:t>8</w:t>
-            </w:r>
-            <w:r>
-              <w:rPr>
-                <w:noProof/>
-                <w:webHidden/>
-              </w:rPr>
               <w:fldChar w:fldCharType="end"/>
             </w:r>
           </w:hyperlink>
@@ -1836,46 +1175,10 @@
                 <w:webHidden/>
               </w:rPr>
               <w:tab/>
-            </w:r>
-            <w:r>
-              <w:rPr>
-                <w:noProof/>
-                <w:webHidden/>
-              </w:rPr>
               <w:fldChar w:fldCharType="begin"/>
-            </w:r>
-            <w:r>
-              <w:rPr>
-                <w:noProof/>
-                <w:webHidden/>
-              </w:rPr>
               <w:instrText xml:space="preserve"> PAGEREF _Toc242882282 \h </w:instrText>
-            </w:r>
-            <w:r>
-              <w:rPr>
-                <w:noProof/>
-                <w:webHidden/>
-              </w:rPr>
-            </w:r>
-            <w:r>
-              <w:rPr>
-                <w:noProof/>
-                <w:webHidden/>
-              </w:rPr>
               <w:fldChar w:fldCharType="separate"/>
-            </w:r>
-            <w:r>
-              <w:rPr>
-                <w:noProof/>
-                <w:webHidden/>
-              </w:rPr>
               <w:t>8</w:t>
-            </w:r>
-            <w:r>
-              <w:rPr>
-                <w:noProof/>
-                <w:webHidden/>
-              </w:rPr>
               <w:fldChar w:fldCharType="end"/>
             </w:r>
           </w:hyperlink>
@@ -1924,46 +1227,10 @@
                 <w:webHidden/>
               </w:rPr>
               <w:tab/>
-            </w:r>
-            <w:r>
-              <w:rPr>
-                <w:noProof/>
-                <w:webHidden/>
-              </w:rPr>
               <w:fldChar w:fldCharType="begin"/>
-            </w:r>
-            <w:r>
-              <w:rPr>
-                <w:noProof/>
-                <w:webHidden/>
-              </w:rPr>
               <w:instrText xml:space="preserve"> PAGEREF _Toc242882283 \h </w:instrText>
-            </w:r>
-            <w:r>
-              <w:rPr>
-                <w:noProof/>
-                <w:webHidden/>
-              </w:rPr>
-            </w:r>
-            <w:r>
-              <w:rPr>
-                <w:noProof/>
-                <w:webHidden/>
-              </w:rPr>
               <w:fldChar w:fldCharType="separate"/>
-            </w:r>
-            <w:r>
-              <w:rPr>
-                <w:noProof/>
-                <w:webHidden/>
-              </w:rPr>
               <w:t>12</w:t>
-            </w:r>
-            <w:r>
-              <w:rPr>
-                <w:noProof/>
-                <w:webHidden/>
-              </w:rPr>
               <w:fldChar w:fldCharType="end"/>
             </w:r>
           </w:hyperlink>
@@ -2012,46 +1279,10 @@
                 <w:webHidden/>
               </w:rPr>
               <w:tab/>
-            </w:r>
-            <w:r>
-              <w:rPr>
-                <w:noProof/>
-                <w:webHidden/>
-              </w:rPr>
               <w:fldChar w:fldCharType="begin"/>
-            </w:r>
-            <w:r>
-              <w:rPr>
-                <w:noProof/>
-                <w:webHidden/>
-              </w:rPr>
               <w:instrText xml:space="preserve"> PAGEREF _Toc242882284 \h </w:instrText>
-            </w:r>
-            <w:r>
-              <w:rPr>
-                <w:noProof/>
-                <w:webHidden/>
-              </w:rPr>
-            </w:r>
-            <w:r>
-              <w:rPr>
-                <w:noProof/>
-                <w:webHidden/>
-              </w:rPr>
               <w:fldChar w:fldCharType="separate"/>
-            </w:r>
-            <w:r>
-              <w:rPr>
-                <w:noProof/>
-                <w:webHidden/>
-              </w:rPr>
               <w:t>13</w:t>
-            </w:r>
-            <w:r>
-              <w:rPr>
-                <w:noProof/>
-                <w:webHidden/>
-              </w:rPr>
               <w:fldChar w:fldCharType="end"/>
             </w:r>
           </w:hyperlink>
@@ -2106,46 +1337,10 @@
                 <w:webHidden/>
               </w:rPr>
               <w:tab/>
-            </w:r>
-            <w:r>
-              <w:rPr>
-                <w:noProof/>
-                <w:webHidden/>
-              </w:rPr>
               <w:fldChar w:fldCharType="begin"/>
-            </w:r>
-            <w:r>
-              <w:rPr>
-                <w:noProof/>
-                <w:webHidden/>
-              </w:rPr>
               <w:instrText xml:space="preserve"> PAGEREF _Toc242882285 \h </w:instrText>
-            </w:r>
-            <w:r>
-              <w:rPr>
-                <w:noProof/>
-                <w:webHidden/>
-              </w:rPr>
-            </w:r>
-            <w:r>
-              <w:rPr>
-                <w:noProof/>
-                <w:webHidden/>
-              </w:rPr>
               <w:fldChar w:fldCharType="separate"/>
-            </w:r>
-            <w:r>
-              <w:rPr>
-                <w:noProof/>
-                <w:webHidden/>
-              </w:rPr>
               <w:t>18</w:t>
-            </w:r>
-            <w:r>
-              <w:rPr>
-                <w:noProof/>
-                <w:webHidden/>
-              </w:rPr>
               <w:fldChar w:fldCharType="end"/>
             </w:r>
           </w:hyperlink>
@@ -2194,46 +1389,10 @@
                 <w:webHidden/>
               </w:rPr>
               <w:tab/>
-            </w:r>
-            <w:r>
-              <w:rPr>
-                <w:noProof/>
-                <w:webHidden/>
-              </w:rPr>
               <w:fldChar w:fldCharType="begin"/>
-            </w:r>
-            <w:r>
-              <w:rPr>
-                <w:noProof/>
-                <w:webHidden/>
-              </w:rPr>
               <w:instrText xml:space="preserve"> PAGEREF _Toc242882286 \h </w:instrText>
-            </w:r>
-            <w:r>
-              <w:rPr>
-                <w:noProof/>
-                <w:webHidden/>
-              </w:rPr>
-            </w:r>
-            <w:r>
-              <w:rPr>
-                <w:noProof/>
-                <w:webHidden/>
-              </w:rPr>
               <w:fldChar w:fldCharType="separate"/>
-            </w:r>
-            <w:r>
-              <w:rPr>
-                <w:noProof/>
-                <w:webHidden/>
-              </w:rPr>
               <w:t>18</w:t>
-            </w:r>
-            <w:r>
-              <w:rPr>
-                <w:noProof/>
-                <w:webHidden/>
-              </w:rPr>
               <w:fldChar w:fldCharType="end"/>
             </w:r>
           </w:hyperlink>
@@ -2288,46 +1447,10 @@
                 <w:webHidden/>
               </w:rPr>
               <w:tab/>
-            </w:r>
-            <w:r>
-              <w:rPr>
-                <w:noProof/>
-                <w:webHidden/>
-              </w:rPr>
               <w:fldChar w:fldCharType="begin"/>
-            </w:r>
-            <w:r>
-              <w:rPr>
-                <w:noProof/>
-                <w:webHidden/>
-              </w:rPr>
               <w:instrText xml:space="preserve"> PAGEREF _Toc242882287 \h </w:instrText>
-            </w:r>
-            <w:r>
-              <w:rPr>
-                <w:noProof/>
-                <w:webHidden/>
-              </w:rPr>
-            </w:r>
-            <w:r>
-              <w:rPr>
-                <w:noProof/>
-                <w:webHidden/>
-              </w:rPr>
               <w:fldChar w:fldCharType="separate"/>
-            </w:r>
-            <w:r>
-              <w:rPr>
-                <w:noProof/>
-                <w:webHidden/>
-              </w:rPr>
               <w:t>19</w:t>
-            </w:r>
-            <w:r>
-              <w:rPr>
-                <w:noProof/>
-                <w:webHidden/>
-              </w:rPr>
               <w:fldChar w:fldCharType="end"/>
             </w:r>
           </w:hyperlink>
@@ -2372,21 +1495,12 @@
     </w:p>
     <w:p>
       <w:r>
-        <w:t>This script was created to convert .csv formatted Pulse Descriptor Word (PDWs) and Timed Control Descriptor Words (TCDWs)</w:t>
-      </w:r>
-      <w:r>
-        <w:t xml:space="preserve"> to a format that is readable by Rohde &amp; Schwarz vector signal generators</w:t>
-      </w:r>
-      <w:r>
-        <w:t xml:space="preserve">. </w:t>
-      </w:r>
-    </w:p>
-    <w:p>
-      <w:r>
-        <w:t>Descriptor Words are simple, readable structures that describe a pulse.</w:t>
-      </w:r>
-      <w:r>
-        <w:t xml:space="preserve"> R&amp;S Pulse Descriptor Words (PDW) can be used to generate pulsed signals in real-time or replay pre-calculated waveform segments. R&amp;S Timed Control Descriptor Words (TCDW) can be used to change instrument RF frequency and/or level or re-arm the Extended Sequencer.</w:t>
+        <w:t xml:space="preserve">This script was created to convert .csv formatted Pulse Descriptor Word (PDWs) and Timed Control Descriptor Words (TCDWs) to a format that is readable by Rohde &amp; Schwarz vector signal generators. </w:t>
+      </w:r>
+    </w:p>
+    <w:p>
+      <w:r>
+        <w:t xml:space="preserve">Descriptor Words are simple, readable structures that describe a pulse. R&amp;S Pulse Descriptor Words (PDW) can be used to generate pulsed signals in real-time or replay pre-calculated waveform segments. R&amp;S Timed Control Descriptor Words (TCDW) can be used to change instrument RF frequency and/or level or re-arm the Extended Sequencer.</w:t>
       </w:r>
     </w:p>
     <w:p>
@@ -2420,10 +1534,7 @@
       </w:pPr>
       <w:bookmarkStart w:id="4" w:name="_Toc242882268"/>
       <w:r>
-        <w:t xml:space="preserve">Required </w:t>
-      </w:r>
-      <w:r>
-        <w:t>Components</w:t>
+        <w:t xml:space="preserve">Required Components</w:t>
       </w:r>
       <w:bookmarkEnd w:id="4"/>
     </w:p>
@@ -2440,10 +1551,14 @@
         </w:numPr>
       </w:pPr>
       <w:r>
-        <w:t xml:space="preserve">Python: Version 3.12.3 was used </w:t>
-      </w:r>
-      <w:r>
-        <w:t>during verification.</w:t>
+        <w:rPr>
+          <w:b/>
+          <w:bCs/>
+        </w:rPr>
+        <w:t xml:space="preserve">Python: </w:t>
+      </w:r>
+      <w:r>
+        <w:t xml:space="preserve">version 3.12 or later. Version 3.12 is recommended. Windows and Linux are supported.</w:t>
       </w:r>
     </w:p>
     <w:p>
@@ -2453,43 +1568,105 @@
           <w:numId w:val="12"/>
         </w:numPr>
       </w:pPr>
-      <w:proofErr w:type="spellStart"/>
-      <w:r>
-        <w:t>r</w:t>
-      </w:r>
-      <w:r>
-        <w:t>sxdwstreaming</w:t>
-      </w:r>
-      <w:proofErr w:type="spellEnd"/>
-      <w:r>
-        <w:t xml:space="preserve">: </w:t>
-      </w:r>
-      <w:r>
-        <w:t>the package file (wheel) for PDW Expert</w:t>
-      </w:r>
-      <w:r>
-        <w:t>.</w:t>
-      </w:r>
-      <w:r>
-        <w:t xml:space="preserve"> Please reference installation instruction in Section </w:t>
-      </w:r>
-      <w:r>
-        <w:fldChar w:fldCharType="begin"/>
-      </w:r>
-      <w:r>
-        <w:instrText xml:space="preserve"> REF _Ref176511416 \w \h </w:instrText>
-      </w:r>
-      <w:r>
-        <w:fldChar w:fldCharType="separate"/>
-      </w:r>
-      <w:r>
-        <w:t>2.3</w:t>
-      </w:r>
-      <w:r>
-        <w:fldChar w:fldCharType="end"/>
-      </w:r>
-      <w:r>
-        <w:t xml:space="preserve"> for more details.</w:t>
+      <w:r>
+        <w:rPr>
+          <w:b/>
+          <w:bCs/>
+        </w:rPr>
+        <w:t xml:space="preserve">Python packages: </w:t>
+      </w:r>
+      <w:r>
+        <w:t xml:space="preserve">listed in requirements.txt. The setup scripts install these automatically. Please reference the installation instructions in Section 2.3 for more details.</w:t>
+      </w:r>
+    </w:p>
+    <w:p>
+      <w:pPr>
+        <w:numPr>
+          <w:ilvl w:val="1"/>
+          <w:numId w:val="12"/>
+        </w:numPr>
+      </w:pPr>
+      <w:r>
+        <w:rPr>
+          <w:b/>
+          <w:bCs/>
+        </w:rPr>
+        <w:t xml:space="preserve">rsxdwstreaming 2.0.0: </w:t>
+      </w:r>
+      <w:r>
+        <w:t xml:space="preserve">the package file (wheel) for PDW Expert. It is included in the repository.</w:t>
+      </w:r>
+    </w:p>
+    <w:p>
+      <w:pPr>
+        <w:numPr>
+          <w:ilvl w:val="1"/>
+          <w:numId w:val="12"/>
+        </w:numPr>
+      </w:pPr>
+      <w:r>
+        <w:rPr>
+          <w:b/>
+          <w:bCs/>
+        </w:rPr>
+        <w:t xml:space="preserve">numpy 2.5.3: </w:t>
+      </w:r>
+      <w:r>
+        <w:t xml:space="preserve">used for numeric operations.</w:t>
+      </w:r>
+    </w:p>
+    <w:p>
+      <w:pPr>
+        <w:numPr>
+          <w:ilvl w:val="1"/>
+          <w:numId w:val="12"/>
+        </w:numPr>
+      </w:pPr>
+      <w:r>
+        <w:rPr>
+          <w:b/>
+          <w:bCs/>
+        </w:rPr>
+        <w:t xml:space="preserve">rskfd 0.7.2: </w:t>
+      </w:r>
+      <w:r>
+        <w:t xml:space="preserve">instrument and data handling, including reading and writing R&amp;S waveform (.wv) files. Documentation: https://pypi.org/project/rskfd/</w:t>
+      </w:r>
+    </w:p>
+    <w:p>
+      <w:pPr>
+        <w:numPr>
+          <w:ilvl w:val="1"/>
+          <w:numId w:val="12"/>
+        </w:numPr>
+      </w:pPr>
+      <w:r>
+        <w:rPr>
+          <w:b/>
+          <w:bCs/>
+        </w:rPr>
+        <w:t xml:space="preserve">bitstring, below version 5: </w:t>
+      </w:r>
+      <w:r>
+        <w:t xml:space="preserve">used by rsxdwstreaming. Version 5 and later do not work with rsxdwstreaming 2.0.0.</w:t>
+      </w:r>
+    </w:p>
+    <w:p>
+      <w:pPr>
+        <w:numPr>
+          <w:ilvl w:val="1"/>
+          <w:numId w:val="12"/>
+        </w:numPr>
+      </w:pPr>
+      <w:r>
+        <w:rPr>
+          <w:b/>
+          <w:bCs/>
+        </w:rPr>
+        <w:t xml:space="preserve">PyQt6: </w:t>
+      </w:r>
+      <w:r>
+        <w:t xml:space="preserve">provides the GUI.</w:t>
       </w:r>
     </w:p>
     <w:p>
@@ -2499,148 +1676,20 @@
           <w:numId w:val="12"/>
         </w:numPr>
       </w:pPr>
-      <w:proofErr w:type="spellStart"/>
-      <w:r>
-        <w:t>n</w:t>
-      </w:r>
-      <w:r>
-        <w:t>umpy</w:t>
-      </w:r>
-      <w:proofErr w:type="spellEnd"/>
-      <w:r>
-        <w:t xml:space="preserve"> version 1.26.3. It most likely will work with any version </w:t>
-      </w:r>
-      <w:proofErr w:type="gramStart"/>
-      <w:r>
-        <w:t>previous to</w:t>
-      </w:r>
-      <w:proofErr w:type="gramEnd"/>
-      <w:r>
-        <w:t xml:space="preserve"> 2.0, but </w:t>
-      </w:r>
-      <w:r>
-        <w:t>the verified version is</w:t>
-      </w:r>
-      <w:r>
-        <w:t xml:space="preserve"> 1.26.3</w:t>
-      </w:r>
-      <w:r>
-        <w:t xml:space="preserve">. Please reference installation instruction in Section </w:t>
-      </w:r>
-      <w:r>
-        <w:fldChar w:fldCharType="begin"/>
-      </w:r>
-      <w:r>
-        <w:instrText xml:space="preserve"> REF _Ref176511416 \w \h </w:instrText>
-      </w:r>
-      <w:r>
-        <w:fldChar w:fldCharType="separate"/>
-      </w:r>
-      <w:r>
-        <w:t>2.3</w:t>
-      </w:r>
-      <w:r>
-        <w:fldChar w:fldCharType="end"/>
-      </w:r>
-      <w:r>
-        <w:t xml:space="preserve"> for more details.</w:t>
-      </w:r>
-    </w:p>
-    <w:p>
-      <w:pPr>
-        <w:numPr>
-          <w:ilvl w:val="1"/>
-          <w:numId w:val="12"/>
-        </w:numPr>
-      </w:pPr>
-      <w:r>
-        <w:t xml:space="preserve">Documentation: </w:t>
-      </w:r>
-      <w:hyperlink r:id="rId10" w:history="1">
-        <w:r>
-          <w:rPr>
-            <w:rStyle w:val="Hyperlink"/>
-          </w:rPr>
-          <w:t>https://numpy.org/doc/1.26/</w:t>
-        </w:r>
-      </w:hyperlink>
-      <w:r>
-        <w:t xml:space="preserve"> </w:t>
-      </w:r>
-    </w:p>
-    <w:p>
-      <w:pPr>
-        <w:numPr>
-          <w:ilvl w:val="0"/>
-          <w:numId w:val="12"/>
-        </w:numPr>
-      </w:pPr>
-      <w:proofErr w:type="spellStart"/>
-      <w:r>
-        <w:t>r</w:t>
-      </w:r>
-      <w:r>
-        <w:t>skfd</w:t>
-      </w:r>
-      <w:proofErr w:type="spellEnd"/>
-      <w:r>
-        <w:t xml:space="preserve">: </w:t>
-      </w:r>
-      <w:r>
-        <w:t xml:space="preserve">This is a tool for instrument and data handling in R&amp;S formats. </w:t>
-      </w:r>
-      <w:r>
-        <w:t xml:space="preserve">Please reference installation instruction in Section </w:t>
-      </w:r>
-      <w:r>
-        <w:fldChar w:fldCharType="begin"/>
-      </w:r>
-      <w:r>
-        <w:instrText xml:space="preserve"> REF _Ref176511416 \w \h </w:instrText>
-      </w:r>
-      <w:r>
-        <w:fldChar w:fldCharType="separate"/>
-      </w:r>
-      <w:r>
-        <w:t>2.3</w:t>
-      </w:r>
-      <w:r>
-        <w:fldChar w:fldCharType="end"/>
-      </w:r>
-      <w:r>
-        <w:t xml:space="preserve"> for more details.</w:t>
-      </w:r>
-    </w:p>
-    <w:p>
-      <w:pPr>
-        <w:numPr>
-          <w:ilvl w:val="1"/>
-          <w:numId w:val="12"/>
-        </w:numPr>
-      </w:pPr>
-      <w:r>
-        <w:t xml:space="preserve">Documentation: </w:t>
-      </w:r>
-      <w:hyperlink r:id="rId11" w:history="1">
-        <w:r>
-          <w:rPr>
-            <w:rStyle w:val="Hyperlink"/>
-          </w:rPr>
-          <w:t>https://pypi.org/project/rskfd/</w:t>
-        </w:r>
-      </w:hyperlink>
-    </w:p>
-    <w:p>
-      <w:r>
-        <w:t xml:space="preserve">On </w:t>
-      </w:r>
-      <w:proofErr w:type="gramStart"/>
-      <w:r>
-        <w:t>the SMW200A</w:t>
-      </w:r>
-      <w:proofErr w:type="gramEnd"/>
-      <w:r>
-        <w:t>:</w:t>
+      <w:r>
+        <w:rPr>
+          <w:b/>
+          <w:bCs/>
+        </w:rPr>
+        <w:t xml:space="preserve">LAN connection to the SMW200A: </w:t>
+      </w:r>
+      <w:r>
+        <w:t xml:space="preserve">needed only for the SMW Playback and Multi-Sequencer tabs.</w:t>
+      </w:r>
+    </w:p>
+    <w:p>
+      <w:r>
+        <w:t xml:space="preserve">On the SMW200A:</w:t>
       </w:r>
     </w:p>
     <w:p>
@@ -2836,15 +1885,7 @@
         <w:t>SMW-K515</w:t>
       </w:r>
       <w:r>
-        <w:t xml:space="preserve"> — ARB memory up to 2 </w:t>
-      </w:r>
-      <w:proofErr w:type="spellStart"/>
-      <w:r>
-        <w:t>GSamples</w:t>
-      </w:r>
-      <w:proofErr w:type="spellEnd"/>
-      <w:r>
-        <w:t>, for large ARB container waveforms</w:t>
+        <w:t xml:space="preserve"> — ARB memory up to 2 GSamples, for large ARB container waveforms</w:t>
       </w:r>
     </w:p>
     <w:p>
@@ -2907,7 +1948,7 @@
     </w:p>
     <w:p>
       <w:r>
-        <w:t xml:space="preserve">Inside the folder attached, there are a few important files: </w:t>
+        <w:t xml:space="preserve">The repository contains the following important files:</w:t>
       </w:r>
     </w:p>
     <w:p>
@@ -2922,26 +1963,28 @@
           <w:b/>
           <w:bCs/>
         </w:rPr>
-        <w:t>PDWlist.csv</w:t>
-      </w:r>
-      <w:r>
-        <w:t xml:space="preserve"> and </w:t>
-      </w:r>
+        <w:t xml:space="preserve">xdw_file_playback.py</w:t>
+      </w:r>
+      <w:r>
+        <w:t xml:space="preserve"> – the script a user runs to start the GUI and generate the files needed for import into the SMW200A. The output files are named after the Output base name entered in the GUI (by default, the name of the selected .csv file):</w:t>
+      </w:r>
+    </w:p>
+    <w:p>
+      <w:pPr>
+        <w:numPr>
+          <w:ilvl w:val="1"/>
+          <w:numId w:val="11"/>
+        </w:numPr>
+      </w:pPr>
       <w:r>
         <w:rPr>
           <w:b/>
           <w:bCs/>
         </w:rPr>
-        <w:t>PDWlist_verif.csv</w:t>
-      </w:r>
-      <w:r>
-        <w:t>– example csv files with PDWs</w:t>
-      </w:r>
-      <w:r>
-        <w:t xml:space="preserve"> and TCDWs</w:t>
-      </w:r>
-      <w:r>
-        <w:t>.</w:t>
+        <w:t xml:space="preserve">*.ps_def</w:t>
+      </w:r>
+      <w:r>
+        <w:t xml:space="preserve"> – contains the PDWs and TCDWs. This file is always generated.</w:t>
       </w:r>
     </w:p>
     <w:p>
@@ -2956,18 +1999,10 @@
           <w:b/>
           <w:bCs/>
         </w:rPr>
-        <w:t xml:space="preserve">PDWlist.csv </w:t>
-      </w:r>
-      <w:r>
-        <w:t xml:space="preserve">contains </w:t>
-      </w:r>
-      <w:proofErr w:type="gramStart"/>
-      <w:r>
-        <w:t>arb</w:t>
-      </w:r>
-      <w:proofErr w:type="gramEnd"/>
-      <w:r>
-        <w:t xml:space="preserve"> PDWs.</w:t>
+        <w:t xml:space="preserve">*.ps_adr</w:t>
+      </w:r>
+      <w:r>
+        <w:t xml:space="preserve"> – contains the addresses of the waveform segments addressed by arb PDWs. This file is generated only when arb PDWs are included.</w:t>
       </w:r>
     </w:p>
     <w:p>
@@ -2982,10 +2017,10 @@
           <w:b/>
           <w:bCs/>
         </w:rPr>
-        <w:t xml:space="preserve">PDWlist_verif.csv </w:t>
-      </w:r>
-      <w:r>
-        <w:t>does not contain arb PDWs.</w:t>
+        <w:t xml:space="preserve">*.wv</w:t>
+      </w:r>
+      <w:r>
+        <w:t xml:space="preserve"> – the container waveform holding all ARB waveform segments. This file is generated only when arb PDWs are included.</w:t>
       </w:r>
     </w:p>
     <w:p>
@@ -3000,16 +2035,57 @@
           <w:b/>
           <w:bCs/>
         </w:rPr>
-        <w:t>xdw_file_playback.py</w:t>
-      </w:r>
-      <w:r>
-        <w:t xml:space="preserve"> – this is the script a user would run to generate the files needed for the import into the SMW200A</w:t>
-      </w:r>
-      <w:r>
-        <w:t>. Running this script outputs the following files</w:t>
-      </w:r>
-      <w:r>
-        <w:t>:</w:t>
+        <w:t xml:space="preserve">xdw_pdw_gui.py, smw_playback_tabs.py, smw_control.py, create_pulse.py</w:t>
+      </w:r>
+      <w:r>
+        <w:t xml:space="preserve"> – the GUI and instrument control code used by xdw_file_playback.py.</w:t>
+      </w:r>
+    </w:p>
+    <w:p>
+      <w:pPr>
+        <w:numPr>
+          <w:ilvl w:val="0"/>
+          <w:numId w:val="11"/>
+        </w:numPr>
+      </w:pPr>
+      <w:r>
+        <w:rPr>
+          <w:b/>
+          <w:bCs/>
+        </w:rPr>
+        <w:t xml:space="preserve">setup_windows.ps1, setup_linux.sh, requirements.txt</w:t>
+      </w:r>
+      <w:r>
+        <w:t xml:space="preserve"> – set up the Python environment (Section 2.3).</w:t>
+      </w:r>
+    </w:p>
+    <w:p>
+      <w:pPr>
+        <w:numPr>
+          <w:ilvl w:val="0"/>
+          <w:numId w:val="11"/>
+        </w:numPr>
+      </w:pPr>
+      <w:r>
+        <w:rPr>
+          <w:b/>
+          <w:bCs/>
+        </w:rPr>
+        <w:t xml:space="preserve">build_exe.py</w:t>
+      </w:r>
+      <w:r>
+        <w:t xml:space="preserve"> – packages the GUI into a standalone xdw_pdw_gui.exe for users who do not have Python installed (Section 2.3).</w:t>
+      </w:r>
+    </w:p>
+    <w:p>
+      <w:pPr>
+        <w:numPr>
+          <w:ilvl w:val="0"/>
+          <w:numId w:val="11"/>
+        </w:numPr>
+      </w:pPr>
+      <w:r>
+        <w:t xml:space="preserve">Example PDW lists with PDWs and TCDWs:</w:t>
       </w:r>
     </w:p>
     <w:p>
@@ -3024,28 +2100,28 @@
           <w:b/>
           <w:bCs/>
         </w:rPr>
-        <w:t>*.</w:t>
-      </w:r>
-      <w:proofErr w:type="spellStart"/>
+        <w:t xml:space="preserve">PDWlist.csv</w:t>
+      </w:r>
+      <w:r>
+        <w:t xml:space="preserve"> – contains arb PDWs.</w:t>
+      </w:r>
+    </w:p>
+    <w:p>
+      <w:pPr>
+        <w:numPr>
+          <w:ilvl w:val="1"/>
+          <w:numId w:val="11"/>
+        </w:numPr>
+      </w:pPr>
       <w:r>
         <w:rPr>
           <w:b/>
           <w:bCs/>
         </w:rPr>
-        <w:t>ps_def</w:t>
-      </w:r>
-      <w:proofErr w:type="spellEnd"/>
-      <w:r>
-        <w:t xml:space="preserve"> file contains the PDWs and </w:t>
-      </w:r>
-      <w:r>
-        <w:t>T</w:t>
-      </w:r>
-      <w:r>
-        <w:t>CDWs</w:t>
-      </w:r>
-      <w:r>
-        <w:t>. This file is always generated.</w:t>
+        <w:t xml:space="preserve">PDWlist_verif.csv</w:t>
+      </w:r>
+      <w:r>
+        <w:t xml:space="preserve"> – does not contain arb PDWs.</w:t>
       </w:r>
     </w:p>
     <w:p>
@@ -3060,28 +2136,34 @@
           <w:b/>
           <w:bCs/>
         </w:rPr>
-        <w:t>*.</w:t>
-      </w:r>
-      <w:proofErr w:type="spellStart"/>
+        <w:t xml:space="preserve">PDWlist_RF_B.csv</w:t>
+      </w:r>
+      <w:r>
+        <w:t xml:space="preserve"> – the same as PDWlist.csv, but its TCDWs set path 1 (RF B). For use with the Multi-Sequencer tab.</w:t>
+      </w:r>
+    </w:p>
+    <w:p>
+      <w:pPr>
+        <w:numPr>
+          <w:ilvl w:val="0"/>
+          <w:numId w:val="11"/>
+        </w:numPr>
+      </w:pPr>
       <w:r>
         <w:rPr>
           <w:b/>
           <w:bCs/>
         </w:rPr>
-        <w:t>ps_adr</w:t>
-      </w:r>
-      <w:proofErr w:type="spellEnd"/>
-      <w:r>
-        <w:t xml:space="preserve"> file contains the addresses of the waveform segments (addressed by PDWs)</w:t>
-      </w:r>
-      <w:r>
-        <w:t>. This file is generated when arb PDWs are included.</w:t>
+        <w:t xml:space="preserve">pulse1.wv, pulse2.wv</w:t>
+      </w:r>
+      <w:r>
+        <w:t xml:space="preserve"> – example ARB waveform segments used by PDWlist.csv.</w:t>
       </w:r>
     </w:p>
     <w:p>
       <w:pPr>
         <w:numPr>
-          <w:ilvl w:val="1"/>
+          <w:ilvl w:val="0"/>
           <w:numId w:val="11"/>
         </w:numPr>
       </w:pPr>
@@ -3090,86 +2172,46 @@
           <w:b/>
           <w:bCs/>
         </w:rPr>
-        <w:t>Pulse1.wv</w:t>
-      </w:r>
-      <w:r>
-        <w:t xml:space="preserve"> and </w:t>
-      </w:r>
+        <w:t xml:space="preserve">rsxdwstreaming-2.0.0-py2.py3-none-any.whl</w:t>
+      </w:r>
+      <w:r>
+        <w:t xml:space="preserve"> – the package file (wheel) for PDW Expert.</w:t>
+      </w:r>
+    </w:p>
+    <w:p>
+      <w:pPr>
+        <w:numPr>
+          <w:ilvl w:val="0"/>
+          <w:numId w:val="11"/>
+        </w:numPr>
+      </w:pPr>
       <w:r>
         <w:rPr>
           <w:b/>
           <w:bCs/>
         </w:rPr>
-        <w:t>Pulse2.wv</w:t>
-      </w:r>
-      <w:r>
-        <w:t xml:space="preserve"> are example waveform files used in the csv file for use with the ‘xdw_file_playback.py’ script to generate the container waveform ‘</w:t>
-      </w:r>
-      <w:proofErr w:type="spellStart"/>
+        <w:t xml:space="preserve">ICD_PDW_TCDW_rev2.4.pdf</w:t>
+      </w:r>
+      <w:r>
+        <w:t xml:space="preserve"> – the K503/-K504 PDW and TCDW interface control document (ICD).</w:t>
+      </w:r>
+    </w:p>
+    <w:p>
+      <w:pPr>
+        <w:numPr>
+          <w:ilvl w:val="0"/>
+          <w:numId w:val="11"/>
+        </w:numPr>
+      </w:pPr>
       <w:r>
         <w:rPr>
           <w:b/>
           <w:bCs/>
         </w:rPr>
-        <w:t>IQ_expert.wv</w:t>
-      </w:r>
-      <w:proofErr w:type="spellEnd"/>
-      <w:r>
-        <w:t>’</w:t>
-      </w:r>
-      <w:r>
-        <w:t>. This file is generated when arb PDWs are included.</w:t>
-      </w:r>
-    </w:p>
-    <w:p>
-      <w:pPr>
-        <w:numPr>
-          <w:ilvl w:val="0"/>
-          <w:numId w:val="11"/>
-        </w:numPr>
-      </w:pPr>
-      <w:r>
-        <w:rPr>
-          <w:b/>
-          <w:bCs/>
-        </w:rPr>
-        <w:t>r</w:t>
-      </w:r>
-      <w:r>
-        <w:rPr>
-          <w:b/>
-          <w:bCs/>
-        </w:rPr>
-        <w:t>sxdwstreaming-2.0.0-py2.py3-none-any.whl</w:t>
-      </w:r>
-      <w:r>
-        <w:t xml:space="preserve"> - is the package file (wheel) for PDW Expert </w:t>
-      </w:r>
-    </w:p>
-    <w:p>
-      <w:pPr>
-        <w:numPr>
-          <w:ilvl w:val="0"/>
-          <w:numId w:val="11"/>
-        </w:numPr>
-      </w:pPr>
-      <w:r>
-        <w:rPr>
-          <w:b/>
-          <w:bCs/>
-        </w:rPr>
-        <w:t xml:space="preserve">Doc </w:t>
-      </w:r>
-      <w:r>
-        <w:t xml:space="preserve">directory – Contains HTML formatted documentation for installation of the </w:t>
-      </w:r>
-      <w:proofErr w:type="spellStart"/>
-      <w:r>
-        <w:t>Rsxdwstreaming</w:t>
-      </w:r>
-      <w:proofErr w:type="spellEnd"/>
-      <w:r>
-        <w:t xml:space="preserve"> package</w:t>
+        <w:t xml:space="preserve">doc</w:t>
+      </w:r>
+      <w:r>
+        <w:t xml:space="preserve"> directory – HTML documentation for the rsxdwstreaming package.</w:t>
       </w:r>
     </w:p>
     <w:p>
@@ -3261,18 +2303,7 @@
         </w:numPr>
       </w:pPr>
       <w:r>
-        <w:t xml:space="preserve">If the Python installer is blocked on your PC, the </w:t>
-      </w:r>
-      <w:proofErr w:type="spellStart"/>
-      <w:r>
-        <w:t>uv</w:t>
-      </w:r>
-      <w:proofErr w:type="spellEnd"/>
-      <w:r>
-        <w:t xml:space="preserve"> tool (https://docs.astral.sh/uv/) can install Python without it</w:t>
-      </w:r>
-      <w:r>
-        <w:t>:</w:t>
+        <w:t xml:space="preserve">If the Python installer is blocked on your PC, the uv tool (https://docs.astral.sh/uv/) can install Python without it:</w:t>
       </w:r>
     </w:p>
     <w:p>
@@ -3283,21 +2314,8 @@
           <w:numId w:val="17"/>
         </w:numPr>
       </w:pPr>
-      <w:proofErr w:type="spellStart"/>
-      <w:r>
-        <w:t>uv</w:t>
-      </w:r>
-      <w:proofErr w:type="spellEnd"/>
-      <w:r>
-        <w:t xml:space="preserve"> python </w:t>
-      </w:r>
-      <w:proofErr w:type="gramStart"/>
-      <w:r>
-        <w:t>install</w:t>
-      </w:r>
-      <w:proofErr w:type="gramEnd"/>
-      <w:r>
-        <w:t xml:space="preserve"> 3.12</w:t>
+      <w:r>
+        <w:t xml:space="preserve">uv python install 3.12</w:t>
       </w:r>
     </w:p>
     <w:p>
@@ -3354,23 +2372,7 @@
         <w:ind w:left="850"/>
       </w:pPr>
       <w:r>
-        <w:t xml:space="preserve">    </w:t>
-      </w:r>
-      <w:proofErr w:type="spellStart"/>
-      <w:r>
-        <w:t>powershell</w:t>
-      </w:r>
-      <w:proofErr w:type="spellEnd"/>
-      <w:r>
-        <w:t xml:space="preserve"> -</w:t>
-      </w:r>
-      <w:proofErr w:type="spellStart"/>
-      <w:r>
-        <w:t>ExecutionPolicy</w:t>
-      </w:r>
-      <w:proofErr w:type="spellEnd"/>
-      <w:r>
-        <w:t xml:space="preserve"> Bypass -File .\setup_windows.ps1</w:t>
+        <w:t xml:space="preserve">    powershell -ExecutionPolicy Bypass -File .\setup_windows.ps1</w:t>
       </w:r>
     </w:p>
     <w:p>
@@ -3383,15 +2385,7 @@
         <w:ind w:left="720"/>
       </w:pPr>
       <w:r>
-        <w:t xml:space="preserve">If Python was installed with </w:t>
-      </w:r>
-      <w:proofErr w:type="spellStart"/>
-      <w:r>
-        <w:t>uv</w:t>
-      </w:r>
-      <w:proofErr w:type="spellEnd"/>
-      <w:r>
-        <w:t>, run this instead</w:t>
+        <w:t xml:space="preserve">If Python was installed with uv, run this instead:</w:t>
       </w:r>
     </w:p>
     <w:p>
@@ -3403,29 +2397,8 @@
         </w:numPr>
         <w:ind w:left="1145"/>
       </w:pPr>
-      <w:proofErr w:type="spellStart"/>
-      <w:r>
-        <w:t>powershell</w:t>
-      </w:r>
-      <w:proofErr w:type="spellEnd"/>
-      <w:r>
-        <w:t xml:space="preserve"> -</w:t>
-      </w:r>
-      <w:proofErr w:type="spellStart"/>
-      <w:r>
-        <w:t>ExecutionPolicy</w:t>
-      </w:r>
-      <w:proofErr w:type="spellEnd"/>
-      <w:r>
-        <w:t xml:space="preserve"> Bypass -File .\setup_windows.ps1 -Python "$(</w:t>
-      </w:r>
-      <w:proofErr w:type="spellStart"/>
-      <w:r>
-        <w:t>uv</w:t>
-      </w:r>
-      <w:proofErr w:type="spellEnd"/>
-      <w:r>
-        <w:t xml:space="preserve"> python find 3.12)"</w:t>
+      <w:r>
+        <w:t xml:space="preserve">powershell -ExecutionPolicy Bypass -File .\setup_windows.ps1 -Python "$(uv python find 3.12)"</w:t>
       </w:r>
     </w:p>
     <w:p>
@@ -3438,23 +2411,7 @@
         <w:ind w:left="425"/>
       </w:pPr>
       <w:r>
-        <w:t xml:space="preserve">     </w:t>
-      </w:r>
-      <w:r>
-        <w:t xml:space="preserve">The script creates a Python virtual environment in a folder </w:t>
-      </w:r>
-      <w:proofErr w:type="gramStart"/>
-      <w:r>
-        <w:t>named .</w:t>
-      </w:r>
-      <w:proofErr w:type="spellStart"/>
-      <w:r>
-        <w:t>venv</w:t>
-      </w:r>
-      <w:proofErr w:type="spellEnd"/>
-      <w:proofErr w:type="gramEnd"/>
-      <w:r>
-        <w:t xml:space="preserve"> and installs all required packages into it. It prints "Setup complete" when finished. You only need to run it once.</w:t>
+        <w:t xml:space="preserve">     The script creates a Python virtual environment in a folder named .venv and installs all required packages into it. It prints "Setup complete" when finished. You only need to run it once.</w:t>
       </w:r>
     </w:p>
     <w:p>
@@ -3466,10 +2423,7 @@
         </w:numPr>
       </w:pPr>
       <w:r>
-        <w:t>Start the GUI</w:t>
-      </w:r>
-      <w:r>
-        <w:t xml:space="preserve"> without building</w:t>
+        <w:t xml:space="preserve">Start the GUI</w:t>
       </w:r>
     </w:p>
     <w:p>
@@ -3482,15 +2436,7 @@
         <w:ind w:left="720"/>
       </w:pPr>
       <w:r>
-        <w:t>.</w:t>
-      </w:r>
-      <w:proofErr w:type="spellStart"/>
-      <w:r>
-        <w:t>venv</w:t>
-      </w:r>
-      <w:proofErr w:type="spellEnd"/>
-      <w:r>
-        <w:t>\Scripts\python.exe xdw_file_playback.py</w:t>
+        <w:t>.venv\Scripts\python.exe xdw_file_playback.py</w:t>
       </w:r>
     </w:p>
     <w:p>
@@ -3515,18 +2461,7 @@
         </w:numPr>
       </w:pPr>
       <w:r>
-        <w:t xml:space="preserve">Install Python 3.12 or later and the </w:t>
-      </w:r>
-      <w:proofErr w:type="spellStart"/>
-      <w:r>
-        <w:t>venv</w:t>
-      </w:r>
-      <w:proofErr w:type="spellEnd"/>
-      <w:r>
-        <w:t xml:space="preserve"> modul</w:t>
-      </w:r>
-      <w:r>
-        <w:t>e</w:t>
+        <w:t xml:space="preserve">Install Python 3.12 or later and the venv module</w:t>
       </w:r>
     </w:p>
     <w:p>
@@ -3539,18 +2474,7 @@
         <w:ind w:left="720"/>
       </w:pPr>
       <w:r>
-        <w:t>U</w:t>
-      </w:r>
-      <w:r>
-        <w:t xml:space="preserve">se your </w:t>
-      </w:r>
-      <w:proofErr w:type="gramStart"/>
-      <w:r>
-        <w:t>distribution's</w:t>
-      </w:r>
-      <w:proofErr w:type="gramEnd"/>
-      <w:r>
-        <w:t xml:space="preserve"> package manager. For example, on Debian or Ubuntu:</w:t>
+        <w:t xml:space="preserve">Use your distribution's package manager. For example, on Debian or Ubuntu:</w:t>
       </w:r>
     </w:p>
     <w:p>
@@ -3562,13 +2486,8 @@
         </w:numPr>
         <w:ind w:left="720" w:firstLine="130"/>
       </w:pPr>
-      <w:proofErr w:type="spellStart"/>
-      <w:r>
-        <w:t>sudo</w:t>
-      </w:r>
-      <w:proofErr w:type="spellEnd"/>
-      <w:r>
-        <w:t xml:space="preserve"> apt install python3 python3-venv</w:t>
+      <w:r>
+        <w:t xml:space="preserve">sudo apt install python3 python3-venv</w:t>
       </w:r>
     </w:p>
     <w:p>
@@ -3581,36 +2500,15 @@
         <w:ind w:left="720"/>
       </w:pPr>
       <w:r>
-        <w:t xml:space="preserve">If your distribution does not package Python 3.12 or later, the </w:t>
-      </w:r>
-      <w:proofErr w:type="spellStart"/>
-      <w:r>
-        <w:t>uv</w:t>
-      </w:r>
-      <w:proofErr w:type="spellEnd"/>
-      <w:r>
-        <w:t xml:space="preserve"> tool (https://docs.astral.sh/uv/) can install it:</w:t>
+        <w:t xml:space="preserve">If your distribution does not package Python 3.12 or later, the uv tool (https://docs.astral.sh/uv/) can install it:</w:t>
       </w:r>
     </w:p>
     <w:p>
       <w:pPr>
         <w:ind w:left="425" w:firstLine="425"/>
       </w:pPr>
-      <w:proofErr w:type="spellStart"/>
-      <w:r>
-        <w:t>uv</w:t>
-      </w:r>
-      <w:proofErr w:type="spellEnd"/>
-      <w:r>
-        <w:t xml:space="preserve"> python </w:t>
-      </w:r>
-      <w:proofErr w:type="gramStart"/>
-      <w:r>
-        <w:t>install</w:t>
-      </w:r>
-      <w:proofErr w:type="gramEnd"/>
-      <w:r>
-        <w:t xml:space="preserve"> 3.12</w:t>
+      <w:r>
+        <w:t xml:space="preserve">uv python install 3.12</w:t>
       </w:r>
     </w:p>
     <w:p>
@@ -3648,23 +2546,9 @@
     <w:p>
       <w:r>
         <w:t xml:space="preserve">  </w:t>
-      </w:r>
-      <w:r>
         <w:tab/>
-      </w:r>
-      <w:r>
         <w:tab/>
-      </w:r>
-      <w:r>
-        <w:t xml:space="preserve">If Python was installed with </w:t>
-      </w:r>
-      <w:proofErr w:type="spellStart"/>
-      <w:r>
-        <w:t>uv</w:t>
-      </w:r>
-      <w:proofErr w:type="spellEnd"/>
-      <w:r>
-        <w:t>, run this instead:</w:t>
+        <w:t xml:space="preserve">If Python was installed with uv, run this instead:</w:t>
       </w:r>
     </w:p>
     <w:p>
@@ -3672,15 +2556,7 @@
         <w:ind w:left="425" w:firstLine="425"/>
       </w:pPr>
       <w:r>
-        <w:t>PYTHON="$(</w:t>
-      </w:r>
-      <w:proofErr w:type="spellStart"/>
-      <w:r>
-        <w:t>uv</w:t>
-      </w:r>
-      <w:proofErr w:type="spellEnd"/>
-      <w:r>
-        <w:t xml:space="preserve"> python find 3.12)" ./setup_linux.sh</w:t>
+        <w:t xml:space="preserve">PYTHON="$(uv python find 3.12)" ./setup_linux.sh</w:t>
       </w:r>
     </w:p>
     <w:p>
@@ -3688,20 +2564,7 @@
         <w:ind w:left="850" w:firstLine="5"/>
       </w:pPr>
       <w:r>
-        <w:t xml:space="preserve">The script creates a Python virtual environment in a folder </w:t>
-      </w:r>
-      <w:proofErr w:type="gramStart"/>
-      <w:r>
-        <w:t>named .</w:t>
-      </w:r>
-      <w:proofErr w:type="spellStart"/>
-      <w:r>
-        <w:t>venv</w:t>
-      </w:r>
-      <w:proofErr w:type="spellEnd"/>
-      <w:proofErr w:type="gramEnd"/>
-      <w:r>
-        <w:t xml:space="preserve"> and installs all required packages into it. It prints "Setup complete" when finished. You only need to run it once.</w:t>
+        <w:t xml:space="preserve">The script creates a Python virtual environment in a folder named .venv and installs all required packages into it. It prints "Setup complete" when finished. You only need to run it once.</w:t>
       </w:r>
     </w:p>
     <w:p>
@@ -3720,18 +2583,8 @@
       <w:pPr>
         <w:ind w:left="295" w:firstLine="425"/>
       </w:pPr>
-      <w:proofErr w:type="gramStart"/>
-      <w:r>
-        <w:t>.</w:t>
-      </w:r>
-      <w:proofErr w:type="spellStart"/>
-      <w:r>
-        <w:t>venv</w:t>
-      </w:r>
-      <w:proofErr w:type="spellEnd"/>
-      <w:proofErr w:type="gramEnd"/>
-      <w:r>
-        <w:t>/bin/python xdw_file_playback.py</w:t>
+      <w:r>
+        <w:t>.venv/bin/python xdw_file_playback.py</w:t>
       </w:r>
     </w:p>
     <w:p/>
@@ -3743,25 +2596,12 @@
     <w:p/>
     <w:p>
       <w:r>
-        <w:t>If the GUI fails to start with an error about the Qt platform plugin "</w:t>
-      </w:r>
-      <w:proofErr w:type="spellStart"/>
-      <w:r>
-        <w:t>xcb</w:t>
-      </w:r>
-      <w:proofErr w:type="spellEnd"/>
-      <w:r>
-        <w:t>", install the missing system library:</w:t>
-      </w:r>
-    </w:p>
-    <w:p>
-      <w:proofErr w:type="spellStart"/>
-      <w:r>
-        <w:t>sudo</w:t>
-      </w:r>
-      <w:proofErr w:type="spellEnd"/>
-      <w:r>
-        <w:t xml:space="preserve"> apt install libxcb-cursor0</w:t>
+        <w:t>If the GUI fails to start with an error about the Qt platform plugin "xcb", install the missing system library:</w:t>
+      </w:r>
+    </w:p>
+    <w:p>
+      <w:r>
+        <w:t xml:space="preserve">sudo apt install libxcb-cursor0</w:t>
       </w:r>
     </w:p>
     <w:p/>
@@ -3775,21 +2615,7 @@
     </w:p>
     <w:p>
       <w:r>
-        <w:t xml:space="preserve">The GUI can be packaged into a single xdw_pdw_gui.exe file. Users without Python can then run it. The </w:t>
-      </w:r>
-      <w:proofErr w:type="gramStart"/>
-      <w:r>
-        <w:t>build</w:t>
-      </w:r>
-      <w:proofErr w:type="gramEnd"/>
-      <w:r>
-        <w:t xml:space="preserve"> must be run on Windows, using the Python environment created </w:t>
-      </w:r>
-    </w:p>
-    <w:p>
-      <w:r>
-        <w:lastRenderedPageBreak/>
-        <w:t xml:space="preserve">by the installation instructions above.                                              </w:t>
+        <w:t xml:space="preserve">The GUI can be packaged into a single xdw_pdw_gui.exe file. Users without Python can then run it. The build must be run on Windows, using the Python environment created by the installation instructions above.</w:t>
       </w:r>
     </w:p>
     <w:p/>
@@ -3858,34 +2684,16 @@
         </w:numPr>
       </w:pPr>
       <w:r>
-        <w:t xml:space="preserve">Install </w:t>
-      </w:r>
-      <w:proofErr w:type="spellStart"/>
-      <w:r>
-        <w:t>PyInstaller</w:t>
-      </w:r>
-      <w:proofErr w:type="spellEnd"/>
+        <w:t xml:space="preserve">Install PyInstaller</w:t>
+      </w:r>
     </w:p>
     <w:p>
       <w:pPr>
         <w:ind w:left="720"/>
       </w:pPr>
       <w:r>
-        <w:t>.</w:t>
-      </w:r>
-      <w:proofErr w:type="spellStart"/>
-      <w:r>
-        <w:t>venv</w:t>
-      </w:r>
-      <w:proofErr w:type="spellEnd"/>
-      <w:r>
-        <w:t xml:space="preserve">\Scripts\python.exe -m pip install </w:t>
-      </w:r>
-      <w:proofErr w:type="spellStart"/>
-      <w:r>
-        <w:t>pyinstaller</w:t>
-      </w:r>
-      <w:proofErr w:type="spellEnd"/>
+        <w:t xml:space="preserve">.venv\Scripts\python.exe -m pip install pyinstaller</w:t>
+      </w:r>
     </w:p>
     <w:p>
       <w:pPr>
@@ -3896,10 +2704,7 @@
         </w:numPr>
       </w:pPr>
       <w:r>
-        <w:t>Build the executabl</w:t>
-      </w:r>
-      <w:r>
-        <w:t>e</w:t>
+        <w:t>Build the executable</w:t>
       </w:r>
     </w:p>
     <w:p>
@@ -3907,52 +2712,15 @@
         <w:ind w:left="720"/>
       </w:pPr>
       <w:r>
-        <w:t>.</w:t>
-      </w:r>
-      <w:proofErr w:type="spellStart"/>
-      <w:r>
-        <w:t>venv</w:t>
-      </w:r>
-      <w:proofErr w:type="spellEnd"/>
-      <w:r>
-        <w:t>\Scripts\python.exe build_exe.py</w:t>
-      </w:r>
-    </w:p>
-    <w:p>
-      <w:r>
-        <w:t xml:space="preserve">  </w:t>
-      </w:r>
-      <w:r>
-        <w:t xml:space="preserve">    </w:t>
-      </w:r>
-      <w:r>
+        <w:t>.venv\Scripts\python.exe build_exe.py</w:t>
+      </w:r>
+    </w:p>
+    <w:p>
+      <w:r>
+        <w:t xml:space="preserve">      </w:t>
         <w:tab/>
-        <w:t xml:space="preserve">     </w:t>
-      </w:r>
-      <w:r>
-        <w:t xml:space="preserve">The </w:t>
-      </w:r>
-      <w:proofErr w:type="gramStart"/>
-      <w:r>
-        <w:t>build</w:t>
-      </w:r>
-      <w:proofErr w:type="gramEnd"/>
-      <w:r>
-        <w:t xml:space="preserve"> takes a few minutes. When it finishes, the executable is at </w:t>
-      </w:r>
-      <w:proofErr w:type="spellStart"/>
-      <w:r>
-        <w:t>dist</w:t>
-      </w:r>
-      <w:proofErr w:type="spellEnd"/>
-      <w:r>
-        <w:t>\</w:t>
-      </w:r>
-      <w:proofErr w:type="spellStart"/>
-      <w:r>
-        <w:t>xdw_pdw_gui.exe.</w:t>
-      </w:r>
-      <w:proofErr w:type="spellEnd"/>
+        <w:t xml:space="preserve">     The build takes a few minutes. When it finishes, the executable is at dist\xdw_pdw_gui.exe.</w:t>
+      </w:r>
     </w:p>
     <w:p>
       <w:pPr>
@@ -3976,15 +2744,7 @@
         <w:ind w:left="720"/>
       </w:pPr>
       <w:r>
-        <w:t xml:space="preserve">Copy </w:t>
-      </w:r>
-      <w:proofErr w:type="spellStart"/>
-      <w:r>
-        <w:t>dist</w:t>
-      </w:r>
-      <w:proofErr w:type="spellEnd"/>
-      <w:r>
-        <w:t>\xdw_pdw_gui.exe to any location or PC and double-click it to run. Each launch takes several seconds while the program unpacks itself.</w:t>
+        <w:t xml:space="preserve">Copy dist\xdw_pdw_gui.exe to any location or PC and double-click it to run. Each launch takes several seconds while the program unpacks itself.</w:t>
       </w:r>
     </w:p>
     <w:p>
@@ -4001,15 +2761,7 @@
         </w:numPr>
       </w:pPr>
       <w:r>
-        <w:t xml:space="preserve">Antivirus software flags or blocks the .exe. Some antivirus software flags </w:t>
-      </w:r>
-      <w:proofErr w:type="gramStart"/>
-      <w:r>
-        <w:t>single-file</w:t>
-      </w:r>
-      <w:proofErr w:type="gramEnd"/>
-      <w:r>
-        <w:t xml:space="preserve"> builds like this one. To avoid it:</w:t>
+        <w:t xml:space="preserve">Antivirus software flags or blocks the .exe. Some antivirus software flags single-file builds like this one. To avoid it:</w:t>
       </w:r>
     </w:p>
     <w:p>
@@ -4021,18 +2773,8 @@
         </w:numPr>
       </w:pPr>
       <w:r>
-        <w:t>Open build_exe.py and remove the line '--</w:t>
-      </w:r>
-      <w:proofErr w:type="spellStart"/>
-      <w:r>
-        <w:t>onefile</w:t>
-      </w:r>
-      <w:proofErr w:type="spellEnd"/>
-      <w:proofErr w:type="gramStart"/>
-      <w:r>
-        <w:t>',.</w:t>
-      </w:r>
-      <w:proofErr w:type="gramEnd"/>
+        <w:t>Open build_exe.py and remove the line '--onefile',.</w:t>
+      </w:r>
     </w:p>
     <w:p>
       <w:pPr>
@@ -4051,23 +2793,7 @@
         <w:ind w:left="1565"/>
       </w:pPr>
       <w:r>
-        <w:t xml:space="preserve">This creates a </w:t>
-      </w:r>
-      <w:proofErr w:type="spellStart"/>
-      <w:r>
-        <w:t>dist</w:t>
-      </w:r>
-      <w:proofErr w:type="spellEnd"/>
-      <w:r>
-        <w:t>\</w:t>
-      </w:r>
-      <w:proofErr w:type="spellStart"/>
-      <w:r>
-        <w:t>xdw_pdw_gui</w:t>
-      </w:r>
-      <w:proofErr w:type="spellEnd"/>
-      <w:r>
-        <w:t xml:space="preserve"> folder instead of a single file. Share the whole folder and run xdw_pdw_gui.exe inside it.</w:t>
+        <w:t xml:space="preserve">This creates a dist\xdw_pdw_gui folder instead of a single file. Share the whole folder and run xdw_pdw_gui.exe inside it.</w:t>
       </w:r>
     </w:p>
     <w:p/>
@@ -4121,6 +2847,54 @@
     </w:p>
     <w:p>
       <w:pPr>
+        <w:pStyle w:val="ListParagraph"/>
+        <w:numPr>
+          <w:ilvl w:val="0"/>
+          <w:numId w:val="21"/>
+        </w:numPr>
+      </w:pPr>
+      <w:r>
+        <w:t xml:space="preserve">The build fails with "PermissionError: [WinError 5] Access is denied: ...\dist\xdw_pdw_gui.exe". The previous xdw_pdw_gui.exe is still running or open, so the build cannot replace it. To fix it:</w:t>
+      </w:r>
+    </w:p>
+    <w:p>
+      <w:pPr>
+        <w:pStyle w:val="ListParagraph"/>
+        <w:numPr>
+          <w:ilvl w:val="1"/>
+          <w:numId w:val="21"/>
+        </w:numPr>
+      </w:pPr>
+      <w:r>
+        <w:t xml:space="preserve">Close every running copy of xdw_pdw_gui.exe.</w:t>
+      </w:r>
+    </w:p>
+    <w:p>
+      <w:pPr>
+        <w:pStyle w:val="ListParagraph"/>
+        <w:numPr>
+          <w:ilvl w:val="1"/>
+          <w:numId w:val="21"/>
+        </w:numPr>
+      </w:pPr>
+      <w:r>
+        <w:t xml:space="preserve">Delete dist\xdw_pdw_gui.exe.</w:t>
+      </w:r>
+    </w:p>
+    <w:p>
+      <w:pPr>
+        <w:pStyle w:val="ListParagraph"/>
+        <w:numPr>
+          <w:ilvl w:val="1"/>
+          <w:numId w:val="21"/>
+        </w:numPr>
+      </w:pPr>
+      <w:r>
+        <w:t xml:space="preserve">Rebuild.</w:t>
+      </w:r>
+    </w:p>
+    <w:p>
+      <w:pPr>
         <w:pStyle w:val="Heading3"/>
       </w:pPr>
       <w:r>
@@ -4129,395 +2903,63 @@
     </w:p>
     <w:p>
       <w:r>
-        <w:t xml:space="preserve">In </w:t>
-      </w:r>
-      <w:r>
-        <w:t xml:space="preserve">case </w:t>
-      </w:r>
-      <w:r>
-        <w:t xml:space="preserve">the automatic setup scripts have issues, please align the install with the package versions below. </w:t>
-      </w:r>
-    </w:p>
-    <w:p>
-      <w:pPr>
-        <w:pStyle w:val="Heading4"/>
-      </w:pPr>
-      <w:r>
-        <w:t>Pip</w:t>
-      </w:r>
-      <w:bookmarkEnd w:id="10"/>
-    </w:p>
-    <w:p>
-      <w:r>
-        <w:t xml:space="preserve">The Package Installer for Python (pip) is used to install the necessary packages for this script. If this is not installed on </w:t>
-      </w:r>
-      <w:r>
-        <w:t>the PC</w:t>
-      </w:r>
-      <w:r>
-        <w:t xml:space="preserve"> system, please follow the instructions here: </w:t>
-      </w:r>
-      <w:hyperlink r:id="rId13" w:history="1">
-        <w:r>
-          <w:rPr>
-            <w:rStyle w:val="Hyperlink"/>
-          </w:rPr>
-          <w:t>https://www.geeksforgeeks.org/how-to-install-pip-on-windows/</w:t>
-        </w:r>
-      </w:hyperlink>
-    </w:p>
-    <w:p>
-      <w:pPr>
-        <w:pStyle w:val="Heading4"/>
-      </w:pPr>
-      <w:bookmarkStart w:id="11" w:name="_Toc242882272"/>
-      <w:proofErr w:type="spellStart"/>
-      <w:r>
-        <w:lastRenderedPageBreak/>
-        <w:t>Numpy</w:t>
-      </w:r>
-      <w:bookmarkEnd w:id="11"/>
-      <w:proofErr w:type="spellEnd"/>
-      <w:r>
-        <w:t xml:space="preserve"> </w:t>
-      </w:r>
-    </w:p>
-    <w:p>
-      <w:proofErr w:type="spellStart"/>
-      <w:r>
-        <w:t>Numpy</w:t>
-      </w:r>
-      <w:proofErr w:type="spellEnd"/>
-      <w:r>
-        <w:t xml:space="preserve"> is a package used by the script for numeric operations. </w:t>
-      </w:r>
-      <w:r>
-        <w:t xml:space="preserve">Install </w:t>
-      </w:r>
-      <w:proofErr w:type="spellStart"/>
-      <w:r>
-        <w:t>Numpy</w:t>
-      </w:r>
-      <w:proofErr w:type="spellEnd"/>
-      <w:r>
-        <w:t xml:space="preserve"> using the “pip” command. </w:t>
-      </w:r>
+        <w:t xml:space="preserve">If the setup scripts have issues, create the environment manually. Python 3.12 or later is required. Open a terminal in the repository folder and run the commands for your operating system.</w:t>
+      </w:r>
+    </w:p>
+    <w:p>
       <w:r>
         <w:rPr>
           <w:b/>
           <w:bCs/>
         </w:rPr>
-        <w:t>Version 1.26.3</w:t>
-      </w:r>
-      <w:r>
-        <w:t xml:space="preserve"> is verified to work with this version of the python script. </w:t>
-      </w:r>
+        <w:t xml:space="preserve">Windows:</w:t>
+      </w:r>
+    </w:p>
+    <w:p>
+      <w:pPr>
+        <w:ind w:left="425" w:firstLine="425"/>
+      </w:pPr>
+      <w:r>
+        <w:t xml:space="preserve">python -m venv .venv</w:t>
+      </w:r>
+    </w:p>
+    <w:p>
+      <w:pPr>
+        <w:ind w:left="425" w:firstLine="425"/>
+      </w:pPr>
+      <w:r>
+        <w:t xml:space="preserve">.venv\Scripts\python.exe -m pip install -r requirements.txt</w:t>
+      </w:r>
+    </w:p>
+    <w:p>
       <w:r>
         <w:rPr>
           <w:b/>
           <w:bCs/>
         </w:rPr>
-        <w:t>Versions 2.0 and later will not work.</w:t>
-      </w:r>
-      <w:r>
-        <w:t xml:space="preserve"> </w:t>
-      </w:r>
-    </w:p>
-    <w:p>
-      <w:r>
-        <w:t xml:space="preserve">Run the following command in the command prompt. </w:t>
-      </w:r>
-    </w:p>
-    <w:p>
-      <w:pPr>
-        <w:ind w:left="425" w:hanging="425"/>
-      </w:pPr>
-      <w:r>
-        <w:tab/>
-        <w:t xml:space="preserve">&gt;&gt; </w:t>
-      </w:r>
-      <w:r>
-        <w:t xml:space="preserve">python -m </w:t>
-      </w:r>
-      <w:r>
-        <w:t xml:space="preserve">pip install </w:t>
-      </w:r>
-      <w:proofErr w:type="spellStart"/>
-      <w:r>
-        <w:t>numpy</w:t>
-      </w:r>
-      <w:proofErr w:type="spellEnd"/>
-      <w:r>
-        <w:t>==1.26.3</w:t>
-      </w:r>
-    </w:p>
-    <w:p>
-      <w:pPr>
-        <w:pStyle w:val="Heading4"/>
-      </w:pPr>
-      <w:bookmarkStart w:id="12" w:name="_Toc242882273"/>
-      <w:r>
-        <w:t>PyQt6</w:t>
-      </w:r>
-      <w:bookmarkEnd w:id="12"/>
-    </w:p>
-    <w:p>
-      <w:r>
-        <w:t xml:space="preserve">PyQt6 is the package that enables </w:t>
-      </w:r>
-      <w:proofErr w:type="gramStart"/>
-      <w:r>
-        <w:t>the GUI</w:t>
-      </w:r>
-      <w:proofErr w:type="gramEnd"/>
-      <w:r>
-        <w:t>.</w:t>
-      </w:r>
-    </w:p>
-    <w:p>
-      <w:r>
-        <w:t xml:space="preserve">Run the following command in the command prompt. </w:t>
-      </w:r>
-    </w:p>
-    <w:p>
-      <w:pPr>
-        <w:ind w:left="425" w:hanging="425"/>
-      </w:pPr>
-      <w:r>
-        <w:tab/>
-        <w:t>&gt;&gt; python -m pip install PyQt6</w:t>
-      </w:r>
-    </w:p>
-    <w:p>
-      <w:pPr>
-        <w:ind w:left="425" w:hanging="425"/>
-      </w:pPr>
-    </w:p>
-    <w:p>
-      <w:pPr>
-        <w:pStyle w:val="Heading4"/>
-      </w:pPr>
-      <w:bookmarkStart w:id="13" w:name="_Toc242882274"/>
-      <w:proofErr w:type="spellStart"/>
-      <w:r>
-        <w:t>R</w:t>
-      </w:r>
-      <w:r>
-        <w:t>sxdwstreaming</w:t>
-      </w:r>
-      <w:bookmarkEnd w:id="13"/>
-      <w:proofErr w:type="spellEnd"/>
-    </w:p>
-    <w:p>
-      <w:pPr>
-        <w:pStyle w:val="NoSpacing"/>
-      </w:pPr>
-      <w:r>
-        <w:t>T</w:t>
-      </w:r>
-      <w:r>
-        <w:t xml:space="preserve">he </w:t>
-      </w:r>
-      <w:r>
-        <w:tab/>
-        <w:t>Rsxdwstreaming-2.0.0-py2.py3-none-any.whl</w:t>
-      </w:r>
-      <w:r>
-        <w:t xml:space="preserve"> </w:t>
-      </w:r>
-      <w:r>
-        <w:t xml:space="preserve">package file (wheel) </w:t>
-      </w:r>
-      <w:r>
-        <w:t xml:space="preserve">is </w:t>
-      </w:r>
-      <w:r>
-        <w:t>for PDW Expert</w:t>
-      </w:r>
-      <w:r>
-        <w:t xml:space="preserve"> pulse building</w:t>
-      </w:r>
-      <w:r>
-        <w:t xml:space="preserve">. </w:t>
-      </w:r>
-      <w:r>
-        <w:t xml:space="preserve">This can be installed using the PIP command. </w:t>
-      </w:r>
-    </w:p>
-    <w:p>
-      <w:pPr>
-        <w:pStyle w:val="NoSpacing"/>
-      </w:pPr>
-    </w:p>
-    <w:p>
-      <w:pPr>
-        <w:pStyle w:val="NoSpacing"/>
-        <w:numPr>
-          <w:ilvl w:val="0"/>
-          <w:numId w:val="13"/>
-        </w:numPr>
-        <w:spacing w:after="240"/>
-      </w:pPr>
-      <w:r>
-        <w:t xml:space="preserve">Save the </w:t>
-      </w:r>
-      <w:proofErr w:type="spellStart"/>
-      <w:r>
-        <w:t>rsxdwstreaming</w:t>
-      </w:r>
-      <w:proofErr w:type="spellEnd"/>
-      <w:r>
-        <w:t xml:space="preserve"> package on your computer, for example in c:\temp\</w:t>
-      </w:r>
-    </w:p>
-    <w:p>
-      <w:pPr>
-        <w:pStyle w:val="NoSpacing"/>
-        <w:numPr>
-          <w:ilvl w:val="0"/>
-          <w:numId w:val="13"/>
-        </w:numPr>
-        <w:spacing w:after="240"/>
-      </w:pPr>
-      <w:r>
-        <w:t xml:space="preserve">Start the command line </w:t>
-      </w:r>
-      <w:proofErr w:type="spellStart"/>
-      <w:r>
-        <w:t>WinKey</w:t>
-      </w:r>
-      <w:proofErr w:type="spellEnd"/>
-      <w:r>
-        <w:t xml:space="preserve"> + R, type </w:t>
-      </w:r>
-      <w:proofErr w:type="spellStart"/>
-      <w:r>
-        <w:t>cmd</w:t>
-      </w:r>
-      <w:proofErr w:type="spellEnd"/>
-      <w:r>
-        <w:t xml:space="preserve"> and hit ENTER</w:t>
-      </w:r>
-    </w:p>
-    <w:p>
-      <w:pPr>
-        <w:pStyle w:val="NoSpacing"/>
-        <w:numPr>
-          <w:ilvl w:val="0"/>
-          <w:numId w:val="13"/>
-        </w:numPr>
-        <w:spacing w:after="240"/>
-      </w:pPr>
-      <w:r>
-        <w:t xml:space="preserve">Change the working directory to the Python installation of your choice (adjust the </w:t>
-      </w:r>
-      <w:proofErr w:type="gramStart"/>
-      <w:r>
-        <w:t>user name</w:t>
-      </w:r>
-      <w:proofErr w:type="gramEnd"/>
-      <w:r>
-        <w:t xml:space="preserve"> and python version in the path):</w:t>
-      </w:r>
-    </w:p>
-    <w:p>
-      <w:pPr>
-        <w:pStyle w:val="NoSpacing"/>
-        <w:numPr>
-          <w:ilvl w:val="1"/>
-          <w:numId w:val="13"/>
-        </w:numPr>
-        <w:spacing w:after="240"/>
-      </w:pPr>
-      <w:r>
-        <w:t>cd c:\Users\John\AppData\Local\Programs\Python\Python37\Scripts</w:t>
-      </w:r>
-    </w:p>
-    <w:p>
-      <w:pPr>
-        <w:pStyle w:val="NoSpacing"/>
-        <w:numPr>
-          <w:ilvl w:val="0"/>
-          <w:numId w:val="13"/>
-        </w:numPr>
-        <w:spacing w:after="240"/>
-      </w:pPr>
-      <w:r>
-        <w:t xml:space="preserve">Install with the command: </w:t>
-      </w:r>
-      <w:r>
-        <w:t xml:space="preserve">python -m </w:t>
-      </w:r>
-      <w:r>
-        <w:t>pip install c:\temp\</w:t>
-      </w:r>
-      <w:r>
-        <w:t>rsxdwstreaming-2.0.0-py2.py3-none-any.whl</w:t>
-      </w:r>
-    </w:p>
-    <w:p>
-      <w:pPr>
-        <w:pStyle w:val="NoSpacing"/>
-        <w:spacing w:after="240"/>
-      </w:pPr>
-      <w:r>
-        <w:t>Please see the doc/getting_started.html for</w:t>
-      </w:r>
-      <w:r>
-        <w:t xml:space="preserve"> more</w:t>
-      </w:r>
-      <w:r>
-        <w:t xml:space="preserve"> info</w:t>
-      </w:r>
-      <w:r>
-        <w:t>rmation</w:t>
-      </w:r>
-      <w:r>
-        <w:t xml:space="preserve"> on this package. </w:t>
-      </w:r>
-    </w:p>
-    <w:p/>
-    <w:p/>
-    <w:p>
-      <w:pPr>
-        <w:pStyle w:val="Heading4"/>
-      </w:pPr>
-      <w:bookmarkStart w:id="14" w:name="_Toc242882275"/>
-      <w:proofErr w:type="spellStart"/>
-      <w:r>
-        <w:t>Rskfd</w:t>
-      </w:r>
-      <w:bookmarkEnd w:id="14"/>
-      <w:proofErr w:type="spellEnd"/>
-    </w:p>
-    <w:p>
-      <w:r>
-        <w:t xml:space="preserve">The package </w:t>
-      </w:r>
-      <w:proofErr w:type="spellStart"/>
-      <w:r>
-        <w:t>rskfd</w:t>
-      </w:r>
-      <w:proofErr w:type="spellEnd"/>
-      <w:r>
-        <w:t xml:space="preserve"> is for instrument and data handling. Data handling mainly focuses on reading and writing I/Q files in public R&amp;S formats. To install this, please use pip </w:t>
-      </w:r>
-    </w:p>
-    <w:p>
-      <w:r>
-        <w:t xml:space="preserve">           &gt;&gt; </w:t>
-      </w:r>
-      <w:r>
-        <w:t xml:space="preserve">python -m </w:t>
-      </w:r>
-      <w:r>
-        <w:t xml:space="preserve">pip install </w:t>
-      </w:r>
-      <w:proofErr w:type="spellStart"/>
-      <w:r>
-        <w:t>rskfd</w:t>
-      </w:r>
-      <w:proofErr w:type="spellEnd"/>
+        <w:t xml:space="preserve">Linux:</w:t>
+      </w:r>
+    </w:p>
+    <w:p>
+      <w:pPr>
+        <w:ind w:left="425" w:firstLine="425"/>
+      </w:pPr>
+      <w:r>
+        <w:t xml:space="preserve">python3 -m venv .venv</w:t>
+      </w:r>
+    </w:p>
+    <w:p>
+      <w:pPr>
+        <w:ind w:left="425" w:firstLine="425"/>
+      </w:pPr>
+      <w:r>
+        <w:t xml:space="preserve">.venv/bin/python -m pip install -r requirements.txt</w:t>
+      </w:r>
+    </w:p>
+    <w:p>
+      <w:r>
+        <w:t xml:space="preserve">requirements.txt lists the exact package versions: rsxdwstreaming 2.0.0 (the included wheel), numpy 2.5.3, rskfd 0.7.2, bitstring below version 5, and PyQt6. Do not install bitstring 5 or later; rsxdwstreaming 2.0.0 does not work with it. For more information on the rsxdwstreaming package, see doc/getting_started.html.</w:t>
+      </w:r>
     </w:p>
     <w:p>
       <w:pPr>
@@ -4605,14 +3047,8 @@
       </w:pPr>
       <w:r>
         <w:t xml:space="preserve">Figure </w:t>
-      </w:r>
-      <w:r>
         <w:fldChar w:fldCharType="begin"/>
-      </w:r>
-      <w:r>
         <w:instrText xml:space="preserve"> SEQ Figure \* ARABIC </w:instrText>
-      </w:r>
-      <w:r>
         <w:fldChar w:fldCharType="separate"/>
       </w:r>
       <w:r>
@@ -4623,31 +3059,17 @@
       </w:r>
       <w:r>
         <w:fldChar w:fldCharType="end"/>
-      </w:r>
-      <w:r>
         <w:t>: Typical Flow</w:t>
       </w:r>
     </w:p>
     <w:p>
       <w:r>
         <w:t xml:space="preserve">Further details on each of these processes are described in Section </w:t>
-      </w:r>
-      <w:r>
         <w:fldChar w:fldCharType="begin"/>
-      </w:r>
-      <w:r>
         <w:instrText xml:space="preserve"> REF _Ref176515172 \n \h </w:instrText>
-      </w:r>
-      <w:r>
         <w:fldChar w:fldCharType="separate"/>
-      </w:r>
-      <w:r>
         <w:t>4</w:t>
-      </w:r>
-      <w:r>
         <w:fldChar w:fldCharType="end"/>
-      </w:r>
-      <w:r>
         <w:t xml:space="preserve">. </w:t>
       </w:r>
     </w:p>
@@ -4689,19 +3111,8 @@
     </w:p>
     <w:p>
       <w:r>
-        <w:t>K503/-K504 PDW and TCDW ICD:</w:t>
-      </w:r>
-      <w:r>
-        <w:t xml:space="preserve"> </w:t>
-      </w:r>
-      <w:hyperlink r:id="rId17" w:history="1">
-        <w:r>
-          <w:rPr>
-            <w:rStyle w:val="Hyperlink"/>
-          </w:rPr>
-          <w:t>https://scdn.rohde-schwarz.com/ur/pws/dl_downloads/dl_application/application_notes/1gp133/ICD_PDW_TCDW_rev2.3.pdf</w:t>
-        </w:r>
-      </w:hyperlink>
+        <w:t xml:space="preserve">K503/-K504 PDW and TCDW ICD: ICD_PDW_TCDW_rev2.4.pdf, included in the repository.</w:t>
+      </w:r>
     </w:p>
     <w:p/>
     <w:p>
@@ -4741,41 +3152,7 @@
         <w:rPr>
           <w:rFonts w:ascii="Arial" w:hAnsi="Arial" w:cs="Arial"/>
         </w:rPr>
-        <w:t xml:space="preserve">The script searches for the following terms: Type, TOA, Mod, Arb, RF, Pulse Width, RF Freq, Level, Frequency Offset, Level Offset, Phase Offset, Freq Step, Chip Width, </w:t>
-      </w:r>
-      <w:proofErr w:type="spellStart"/>
-      <w:r>
-        <w:rPr>
-          <w:rFonts w:ascii="Arial" w:hAnsi="Arial" w:cs="Arial"/>
-        </w:rPr>
-        <w:t>Bkr</w:t>
-      </w:r>
-      <w:proofErr w:type="spellEnd"/>
-      <w:r>
-        <w:rPr>
-          <w:rFonts w:ascii="Arial" w:hAnsi="Arial" w:cs="Arial"/>
-        </w:rPr>
-        <w:t xml:space="preserve"> Code, Stuff, Burst PRI, Number of Pulses, Marker 1, Marker 2, and Marker 3. Columns that do not contain these terms will be ignored in the input file. </w:t>
-      </w:r>
-      <w:r>
-        <w:rPr>
-          <w:rFonts w:ascii="Arial" w:hAnsi="Arial" w:cs="Arial"/>
-          <w:b/>
-          <w:bCs/>
-        </w:rPr>
-        <w:t>Columns that contain these terms, but are not inputs to the script, might confuse the parser.</w:t>
-      </w:r>
-      <w:r>
-        <w:rPr>
-          <w:rFonts w:ascii="Arial" w:hAnsi="Arial" w:cs="Arial"/>
-        </w:rPr>
-        <w:t xml:space="preserve"> For example, if you have a column titled “TOA (clicks)” that you use to calculate some intermediate values, the script might interpret that value as the TOA field</w:t>
-      </w:r>
-      <w:r>
-        <w:rPr>
-          <w:rFonts w:ascii="Arial" w:hAnsi="Arial" w:cs="Arial"/>
-        </w:rPr>
-        <w:t xml:space="preserve">. </w:t>
+        <w:t xml:space="preserve">The script finds each input column by searching the header row for these terms: Type, TOA, Path, Mod, RF, Pulse Width, RF Freq, Level, Frequency Offset, Level Offset, Phase Offset, Freq Step, Chip Width, Bkr Code, Stuff, Burst PRI, Number of Pulses, Marker 1, Marker 2, and Marker 3. For each term, the first column whose header contains it is used. Columns that do not contain any of these terms are ignored. Columns that contain these terms, but are not inputs to the script, might confuse the parser if they come first. For example, if you have a column titled “TOA (clicks)” before the TOA column, the script will read it as the TOA field. The example files combine fields that share a column, such as “Mod/Arb/RF” and “Pulse Width (s)/RF Freq/Level”; keeping their column order avoids these conflicts. Text values such as pdw, tcdw, arb, and rffreq are case-sensitive.</w:t>
       </w:r>
     </w:p>
     <w:p>
@@ -4789,25 +3166,7 @@
         <w:rPr>
           <w:rFonts w:ascii="Arial" w:hAnsi="Arial" w:cs="Arial"/>
         </w:rPr>
-        <w:t>U</w:t>
-      </w:r>
-      <w:r>
-        <w:rPr>
-          <w:rFonts w:ascii="Arial" w:hAnsi="Arial" w:cs="Arial"/>
-        </w:rPr>
-        <w:t>se as many columns as necessary for calculating values</w:t>
-      </w:r>
-      <w:r>
-        <w:rPr>
-          <w:rFonts w:ascii="Arial" w:hAnsi="Arial" w:cs="Arial"/>
-        </w:rPr>
-        <w:t xml:space="preserve"> provided the naming convention is followed</w:t>
-      </w:r>
-      <w:r>
-        <w:rPr>
-          <w:rFonts w:ascii="Arial" w:hAnsi="Arial" w:cs="Arial"/>
-        </w:rPr>
-        <w:t xml:space="preserve">. </w:t>
+        <w:t xml:space="preserve">Use as many columns as necessary for calculating values provided the naming convention is followed. </w:t>
       </w:r>
     </w:p>
     <w:p>
@@ -4825,31 +3184,7 @@
           <w:i/>
           <w:iCs/>
         </w:rPr>
-        <w:t>Note:</w:t>
-      </w:r>
-      <w:r>
-        <w:rPr>
-          <w:rFonts w:ascii="Arial" w:hAnsi="Arial" w:cs="Arial"/>
-          <w:i/>
-          <w:iCs/>
-        </w:rPr>
-        <w:t xml:space="preserve"> An .xlsx file will typically be used to build the list of PDWs and TCDWs since the fields are typically calculated from other fields using formulas. P</w:t>
-      </w:r>
-      <w:r>
-        <w:rPr>
-          <w:rFonts w:ascii="Arial" w:hAnsi="Arial" w:cs="Arial"/>
-          <w:i/>
-          <w:iCs/>
-        </w:rPr>
-        <w:t>lease save your file as a .csv for an input list. This is so the raw values (not formulas) are saved in each cell</w:t>
-      </w:r>
-      <w:r>
-        <w:rPr>
-          <w:rFonts w:ascii="Arial" w:hAnsi="Arial" w:cs="Arial"/>
-          <w:i/>
-          <w:iCs/>
-        </w:rPr>
-        <w:t>.</w:t>
+        <w:t xml:space="preserve">Note: An .xlsx file will typically be used to build the list of PDWs and TCDWs since the fields are typically calculated from other fields using formulas. Please save your file as a .csv for an input list. This is so the raw values (not formulas) are saved in each cell.</w:t>
       </w:r>
     </w:p>
     <w:p>
@@ -5021,19 +3356,9 @@
             <w:hideMark/>
           </w:tcPr>
           <w:p>
-            <w:proofErr w:type="spellStart"/>
-            <w:r>
-              <w:t>tcdw</w:t>
-            </w:r>
-            <w:proofErr w:type="spellEnd"/>
-            <w:r>
-              <w:t xml:space="preserve">, </w:t>
-            </w:r>
-            <w:proofErr w:type="spellStart"/>
-            <w:r>
-              <w:t>pdw</w:t>
-            </w:r>
-            <w:proofErr w:type="spellEnd"/>
+            <w:r>
+              <w:t xml:space="preserve">tcdw, pdw</w:t>
+            </w:r>
           </w:p>
         </w:tc>
         <w:tc>
@@ -5263,29 +3588,8 @@
           </w:tcPr>
           <w:p>
             <w:r>
-              <w:t xml:space="preserve">Sets the desired RF path to configure TCDW types </w:t>
-            </w:r>
-            <w:proofErr w:type="spellStart"/>
-            <w:r>
-              <w:t>rffreq</w:t>
-            </w:r>
-            <w:proofErr w:type="spellEnd"/>
-            <w:r>
-              <w:t xml:space="preserve">, </w:t>
-            </w:r>
-            <w:proofErr w:type="spellStart"/>
-            <w:r>
-              <w:t>rflevel</w:t>
-            </w:r>
-            <w:proofErr w:type="spellEnd"/>
-            <w:r>
-              <w:t xml:space="preserve">, </w:t>
-            </w:r>
-            <w:proofErr w:type="spellStart"/>
-            <w:r>
-              <w:t>rffreqlevel</w:t>
-            </w:r>
-            <w:proofErr w:type="spellEnd"/>
+              <w:t xml:space="preserve">Sets the desired RF path to configure TCDW types rffreq, rflevel, rffreqlevel</w:t>
+            </w:r>
           </w:p>
           <w:p>
             <w:r>
@@ -5351,18 +3655,18 @@
             </w:r>
           </w:p>
           <w:p>
-            <w:proofErr w:type="spellStart"/>
-            <w:r>
-              <w:t>Tchirp</w:t>
-            </w:r>
-            <w:proofErr w:type="spellEnd"/>
-            <w:r>
-              <w:t xml:space="preserve">, </w:t>
+            <w:r>
+              <w:t xml:space="preserve">Tchirp, </w:t>
             </w:r>
           </w:p>
           <w:p>
             <w:r>
-              <w:t>Barker</w:t>
+              <w:t xml:space="preserve">Barker, </w:t>
+            </w:r>
+          </w:p>
+          <w:p>
+            <w:r>
+              <w:t xml:space="preserve">arb</w:t>
             </w:r>
           </w:p>
         </w:tc>
@@ -5408,7 +3712,7 @@
           </w:tcPr>
           <w:p>
             <w:r>
-              <w:t xml:space="preserve">In PDW, this is the type of pulse modulation. </w:t>
+              <w:t xml:space="preserve">In PDW, this is the type of pulse modulation. With ‘arb’, the PDW plays a waveform segment from an ARB waveform (.wv) file instead; the Pulse Width column selects which segment.</w:t>
             </w:r>
           </w:p>
         </w:tc>
@@ -5455,32 +3759,8 @@
             <w:hideMark/>
           </w:tcPr>
           <w:p>
-            <w:proofErr w:type="spellStart"/>
-            <w:r>
-              <w:t>rffreq</w:t>
-            </w:r>
-            <w:proofErr w:type="spellEnd"/>
-            <w:r>
-              <w:t xml:space="preserve">, </w:t>
-            </w:r>
-            <w:proofErr w:type="spellStart"/>
-            <w:r>
-              <w:t>rflevel</w:t>
-            </w:r>
-            <w:proofErr w:type="spellEnd"/>
-            <w:r>
-              <w:t xml:space="preserve">, </w:t>
-            </w:r>
-            <w:proofErr w:type="spellStart"/>
-            <w:r>
-              <w:t>rffreqlevel</w:t>
-            </w:r>
-            <w:proofErr w:type="spellEnd"/>
-            <w:r>
-              <w:t xml:space="preserve">, </w:t>
-            </w:r>
-            <w:r>
-              <w:t>EOF</w:t>
+            <w:r>
+              <w:t xml:space="preserve">rffreq, rflevel, rffreqlevel, EOF</w:t>
             </w:r>
           </w:p>
         </w:tc>
@@ -5526,21 +3806,7 @@
           </w:tcPr>
           <w:p>
             <w:r>
-              <w:t>In TCDW, this specifies the type of TCDW.</w:t>
-            </w:r>
-            <w:r>
-              <w:t xml:space="preserve"> </w:t>
-            </w:r>
-            <w:r>
-              <w:t>If ‘</w:t>
-            </w:r>
-            <w:proofErr w:type="spellStart"/>
-            <w:r>
-              <w:t>rffreqlevel</w:t>
-            </w:r>
-            <w:proofErr w:type="spellEnd"/>
-            <w:r>
-              <w:t>’ is used, adjusting the RF frequency &amp; level settings with a single TOA is possible. In this case, use ‘Level Offset (dB)’ column to enter the desired RF Level. If ‘EOF’ is used, the TOA marks the end of the scenario and sets the repetition interval for repeated playback.</w:t>
+              <w:t xml:space="preserve">In TCDW, this specifies the type of TCDW. If ‘rffreqlevel’ is used, adjusting the RF frequency &amp; level settings with a single TOA is possible. In this case, use the ‘Level Offset’ column to enter the desired RF level in dBm. If ‘EOF’ is used, the TOA marks the end of the scenario and sets the repetition interval for repeated playback.</w:t>
             </w:r>
           </w:p>
         </w:tc>
@@ -5585,7 +3851,11 @@
               <w:right w:w="108" w:type="dxa"/>
             </w:tcMar>
           </w:tcPr>
-          <w:p/>
+          <w:p>
+            <w:r>
+              <w:t xml:space="preserve">See ICD (arb: 0, 1, 2, …)</w:t>
+            </w:r>
+          </w:p>
         </w:tc>
         <w:tc>
           <w:tcPr>
@@ -5606,7 +3876,7 @@
           </w:tcPr>
           <w:p>
             <w:r>
-              <w:t>N/A</w:t>
+              <w:t xml:space="preserve">seconds</w:t>
             </w:r>
           </w:p>
         </w:tc>
@@ -5629,7 +3899,7 @@
           </w:tcPr>
           <w:p>
             <w:r>
-              <w:t>In PDW, this specifies the pulse width.</w:t>
+              <w:t xml:space="preserve">In PDW, this specifies the pulse width. In ‘arb’ PDWs, it selects the waveform segment instead: 0 is the first file in the GUI’s ARB Waveform Segments list, 1 is the second, and so on.</w:t>
             </w:r>
           </w:p>
         </w:tc>
@@ -5911,15 +4181,7 @@
           </w:tcPr>
           <w:p>
             <w:r>
-              <w:t xml:space="preserve">In PDW, the frequency offset is added to instrument RF frequency specified in the latest </w:t>
-            </w:r>
-            <w:proofErr w:type="spellStart"/>
-            <w:r>
-              <w:t>rffreq</w:t>
-            </w:r>
-            <w:proofErr w:type="spellEnd"/>
-            <w:r>
-              <w:t xml:space="preserve"> TCDW.</w:t>
+              <w:t xml:space="preserve">In PDW, the frequency offset is added to instrument RF frequency specified in the latest rffreq TCDW. For ‘arb’ PDWs, the offset plus half the waveform bandwidth must fit within the baseband bandwidth.</w:t>
             </w:r>
           </w:p>
         </w:tc>
@@ -5967,7 +4229,7 @@
           </w:tcPr>
           <w:p>
             <w:r>
-              <w:t>Instrument Specific</w:t>
+              <w:t xml:space="preserve">0 or greater (PDW)</w:t>
             </w:r>
           </w:p>
         </w:tc>
@@ -5990,7 +4252,7 @@
           </w:tcPr>
           <w:p>
             <w:r>
-              <w:t>dBm</w:t>
+              <w:t xml:space="preserve">dB</w:t>
             </w:r>
           </w:p>
         </w:tc>
@@ -6013,29 +4275,7 @@
           </w:tcPr>
           <w:p>
             <w:r>
-              <w:t xml:space="preserve">In PDW, the level offset is subtracted from instrument RF level specified in the latest </w:t>
-            </w:r>
-            <w:proofErr w:type="spellStart"/>
-            <w:r>
-              <w:t>rflevel</w:t>
-            </w:r>
-            <w:proofErr w:type="spellEnd"/>
-            <w:r>
-              <w:t xml:space="preserve"> TCDW.</w:t>
-            </w:r>
-            <w:r>
-              <w:t xml:space="preserve"> </w:t>
-            </w:r>
-            <w:r>
-              <w:t>If using ‘</w:t>
-            </w:r>
-            <w:proofErr w:type="spellStart"/>
-            <w:r>
-              <w:t>rffreqlevel</w:t>
-            </w:r>
-            <w:proofErr w:type="spellEnd"/>
-            <w:r>
-              <w:t>’ TCDW type, this column can be used to set RF level (follows same settling time guidelines as ‘Level’ column)</w:t>
+              <w:t xml:space="preserve">In PDW, the level offset is subtracted from instrument RF level specified in the latest rflevel TCDW. It must be 0 or positive, because only attenuation is supported. If using ‘rffreqlevel’ TCDW type, this column sets the RF level in dBm instead (follows same settling time guidelines as ‘Level’ column).</w:t>
             </w:r>
           </w:p>
         </w:tc>
@@ -6223,7 +4463,7 @@
           </w:tcPr>
           <w:p>
             <w:r>
-              <w:t>In Linear Chirp PDW, this specifies the frequency step in Hz/Sample. This value is dependent on the instrument clock.</w:t>
+              <w:t xml:space="preserve">In Linear Chirp and Tchirp PDWs, this specifies the frequency step in Hz/Sample. This value is dependent on the instrument clock.</w:t>
             </w:r>
           </w:p>
         </w:tc>
@@ -6317,15 +4557,7 @@
           </w:tcPr>
           <w:p>
             <w:r>
-              <w:t xml:space="preserve">In </w:t>
-            </w:r>
-            <w:proofErr w:type="spellStart"/>
-            <w:r>
-              <w:t>Bkr</w:t>
-            </w:r>
-            <w:proofErr w:type="spellEnd"/>
-            <w:r>
-              <w:t xml:space="preserve"> Code PDW, this specifies the chip width of one Barker code chip</w:t>
+              <w:t xml:space="preserve">In Bkr Code PDW, this specifies the chip width of one Barker code chip</w:t>
             </w:r>
           </w:p>
         </w:tc>
@@ -6349,13 +4581,8 @@
             <w:hideMark/>
           </w:tcPr>
           <w:p>
-            <w:proofErr w:type="spellStart"/>
-            <w:r>
-              <w:t>Bkr</w:t>
-            </w:r>
-            <w:proofErr w:type="spellEnd"/>
-            <w:r>
-              <w:t xml:space="preserve"> Code</w:t>
+            <w:r>
+              <w:t xml:space="preserve">Bkr Code</w:t>
             </w:r>
           </w:p>
         </w:tc>
@@ -6424,15 +4651,7 @@
           </w:tcPr>
           <w:p>
             <w:r>
-              <w:t xml:space="preserve">In </w:t>
-            </w:r>
-            <w:proofErr w:type="spellStart"/>
-            <w:r>
-              <w:t>Bkr</w:t>
-            </w:r>
-            <w:proofErr w:type="spellEnd"/>
-            <w:r>
-              <w:t xml:space="preserve"> Code PDW, this is the code to select the type of Barker code.</w:t>
+              <w:t xml:space="preserve">In Bkr Code PDW, this is the code to select the type of Barker code.</w:t>
             </w:r>
           </w:p>
         </w:tc>
@@ -7006,7 +5225,7 @@
     <w:p/>
     <w:p>
       <w:r>
-        <w:t>Please reference the included example .csv files PDWlist.csv and PDWlist_verif.csv</w:t>
+        <w:t xml:space="preserve">Please reference the included example .csv files PDWlist.csv, PDWlist_verif.csv, and PDWlist_RF_B.csv</w:t>
       </w:r>
     </w:p>
     <w:p>
@@ -7021,35 +5240,22 @@
           <w:i/>
           <w:iCs/>
         </w:rPr>
-        <w:t>Note: Please ensure the last descriptor word in the list is a</w:t>
-      </w:r>
-      <w:r>
+        <w:t xml:space="preserve">Note: Every PDW row, including ‘arb’ rows, must have a number in the Frequency Offset, Level Offset, Phase Offset, Burst PRI, Number of Pulses, and Marker 1–3 columns. Use 0 where a value is not needed, and 1 in Number of Pulses for a single pulse. A PDW with Number of Pulses set to 0 is skipped.</w:t>
+      </w:r>
+    </w:p>
+    <w:p>
+      <w:pPr>
         <w:rPr>
           <w:i/>
           <w:iCs/>
         </w:rPr>
-        <w:t>n</w:t>
-      </w:r>
+      </w:pPr>
       <w:r>
         <w:rPr>
           <w:i/>
           <w:iCs/>
         </w:rPr>
-        <w:t xml:space="preserve"> EOF</w:t>
-      </w:r>
-      <w:r>
-        <w:rPr>
-          <w:i/>
-          <w:iCs/>
-        </w:rPr>
-        <w:t xml:space="preserve"> (End of File)</w:t>
-      </w:r>
-      <w:r>
-        <w:rPr>
-          <w:i/>
-          <w:iCs/>
-        </w:rPr>
-        <w:t xml:space="preserve"> TCDW. This is vital for synchronization. The TOA of the EOF marks the end of the scenario and sets the repetition interval for repeated playback, so it should be at or after the end of the last pulse. </w:t>
+        <w:t xml:space="preserve">Note: Please ensure the last descriptor word in the list is an EOF (End of File) TCDW. This is vital for synchronization. The TOA of the EOF marks the end of the scenario and sets the repetition interval for repeated playback, so it should be at or after the end of the last pulse. </w:t>
       </w:r>
     </w:p>
     <w:p>
@@ -7158,23 +5364,12 @@
     </w:p>
     <w:p>
       <w:r>
-        <w:t xml:space="preserve">Each line in the .xlsx represents a pulse with </w:t>
-      </w:r>
-      <w:proofErr w:type="gramStart"/>
-      <w:r>
-        <w:t>a number of</w:t>
-      </w:r>
-      <w:proofErr w:type="gramEnd"/>
-      <w:r>
-        <w:t xml:space="preserve"> repetitions based on the “Number of Pulses” field. </w:t>
-      </w:r>
-    </w:p>
-    <w:p>
-      <w:r>
-        <w:t xml:space="preserve">All timing for the PDWs is based on the TOA (Time of Arrival) field. </w:t>
-      </w:r>
-      <w:r>
-        <w:t xml:space="preserve">To avoid dropping PDWs, please allow for adequate time for the previous PDW to complete. </w:t>
+        <w:t xml:space="preserve">Each line in the .xlsx represents a pulse with a number of repetitions based on the “Number of Pulses” field. </w:t>
+      </w:r>
+    </w:p>
+    <w:p>
+      <w:r>
+        <w:t xml:space="preserve">All timing for the PDWs is based on the TOA (Time of Arrival) field. To avoid dropping PDWs, please allow for adequate time for the previous PDW to complete. </w:t>
       </w:r>
     </w:p>
     <w:p>
@@ -7200,23 +5395,11 @@
     <w:p>
       <w:r>
         <w:t xml:space="preserve">Please reference Section </w:t>
-      </w:r>
-      <w:r>
         <w:fldChar w:fldCharType="begin"/>
-      </w:r>
-      <w:r>
         <w:instrText xml:space="preserve"> REF _Ref176516871 \n \h </w:instrText>
-      </w:r>
-      <w:r>
         <w:fldChar w:fldCharType="separate"/>
-      </w:r>
-      <w:r>
         <w:t>3</w:t>
-      </w:r>
-      <w:r>
         <w:fldChar w:fldCharType="end"/>
-      </w:r>
-      <w:r>
         <w:t xml:space="preserve"> for further details about the column descriptions and the included .csv files for examples. </w:t>
       </w:r>
     </w:p>
@@ -7248,13 +5431,7 @@
     </w:p>
     <w:p>
       <w:r>
-        <w:t xml:space="preserve">Run Command Prompt in the </w:t>
-      </w:r>
-      <w:r>
-        <w:t>python_package_xDW_SMW200A</w:t>
-      </w:r>
-      <w:r>
-        <w:t xml:space="preserve"> directory by right clicking and selecting “Open in Terminal”</w:t>
+        <w:t xml:space="preserve">Open a terminal in the repository folder. On Windows, right-click an empty area of the folder in File Explorer and select “Open in Terminal”. On Linux, open a terminal in the folder.</w:t>
       </w:r>
     </w:p>
     <w:p>
@@ -7302,19 +5479,19 @@
     <w:p/>
     <w:p>
       <w:r>
-        <w:t>Run the Python script:</w:t>
+        <w:t xml:space="preserve">Start the GUI with the Python environment created in Section 2.3:</w:t>
       </w:r>
     </w:p>
     <w:p>
       <w:r>
         <w:tab/>
-        <w:t>&gt;&gt;</w:t>
-      </w:r>
-      <w:r>
-        <w:t xml:space="preserve"> </w:t>
-      </w:r>
-      <w:r>
-        <w:t>python xdw_file_playback.py</w:t>
+        <w:t xml:space="preserve">&gt;&gt; .venv\Scripts\python.exe xdw_file_playback.py        (Windows)</w:t>
+      </w:r>
+    </w:p>
+    <w:p>
+      <w:r>
+        <w:tab/>
+        <w:t xml:space="preserve">&gt;&gt; .venv/bin/python xdw_file_playback.py        (Linux)</w:t>
       </w:r>
     </w:p>
     <w:p>
@@ -7363,13 +5540,7 @@
     <w:p/>
     <w:p>
       <w:r>
-        <w:t>Select</w:t>
-      </w:r>
-      <w:r>
-        <w:t xml:space="preserve"> the .csv fil</w:t>
-      </w:r>
-      <w:r>
-        <w:t xml:space="preserve">e using the path or Browse button. </w:t>
+        <w:t xml:space="preserve">Select the .csv file using the path or Browse button. </w:t>
       </w:r>
     </w:p>
     <w:p>
@@ -7427,15 +5598,7 @@
     </w:p>
     <w:p>
       <w:r>
-        <w:t xml:space="preserve">Generate </w:t>
-      </w:r>
-      <w:proofErr w:type="spellStart"/>
-      <w:r>
-        <w:t>xDW</w:t>
-      </w:r>
-      <w:proofErr w:type="spellEnd"/>
-      <w:r>
-        <w:t xml:space="preserve"> Files determines the output file names and an optional comment for user tracking purposes. </w:t>
+        <w:t xml:space="preserve">Generate xDW Files determines the output file names and an optional comment for user tracking purposes. </w:t>
       </w:r>
     </w:p>
     <w:p>
@@ -7445,15 +5608,7 @@
     </w:p>
     <w:p>
       <w:r>
-        <w:t xml:space="preserve">When ready, click the “Generate </w:t>
-      </w:r>
-      <w:proofErr w:type="spellStart"/>
-      <w:r>
-        <w:t>xDW</w:t>
-      </w:r>
-      <w:proofErr w:type="spellEnd"/>
-      <w:r>
-        <w:t xml:space="preserve"> Files” button. The Log has information on the processed PDWs and output of the system. A window will appear to notify the user of successful completion. </w:t>
+        <w:t xml:space="preserve">When ready, click the “Generate xDW Files” button. The Log has information on the processed PDWs and output of the system. A window will appear to notify the user of successful completion. </w:t>
       </w:r>
     </w:p>
     <w:p>
@@ -7503,13 +5658,7 @@
     <w:p/>
     <w:p>
       <w:r>
-        <w:t>When using arb waveform PDWs, three files are generated</w:t>
-      </w:r>
-      <w:r>
-        <w:t xml:space="preserve"> based on the Output base name</w:t>
-      </w:r>
-      <w:r>
-        <w:t xml:space="preserve">. </w:t>
+        <w:t xml:space="preserve">When using arb waveform PDWs, three files are generated based on the Output base name. </w:t>
       </w:r>
     </w:p>
     <w:p>
@@ -7525,28 +5674,28 @@
           <w:b/>
           <w:bCs/>
         </w:rPr>
-        <w:t>*.</w:t>
-      </w:r>
-      <w:proofErr w:type="spellStart"/>
+        <w:t>*.ps_def</w:t>
+      </w:r>
+      <w:r>
+        <w:t xml:space="preserve"> file contains the PDWs and TCDWs. </w:t>
+      </w:r>
+    </w:p>
+    <w:p>
+      <w:pPr>
+        <w:numPr>
+          <w:ilvl w:val="0"/>
+          <w:numId w:val="14"/>
+        </w:numPr>
+      </w:pPr>
       <w:r>
         <w:rPr>
           <w:b/>
           <w:bCs/>
         </w:rPr>
-        <w:t>ps_def</w:t>
-      </w:r>
-      <w:proofErr w:type="spellEnd"/>
-      <w:r>
-        <w:t xml:space="preserve"> file contains the PDWs and </w:t>
-      </w:r>
-      <w:r>
-        <w:t>T</w:t>
-      </w:r>
-      <w:r>
-        <w:t>CDWs</w:t>
-      </w:r>
-      <w:r>
-        <w:t xml:space="preserve">. </w:t>
+        <w:t>*.ps_adr</w:t>
+      </w:r>
+      <w:r>
+        <w:t xml:space="preserve"> file contains the addresses of the waveform segments (addressed by PDWs). This file is generated when arb PDWs are included.</w:t>
       </w:r>
     </w:p>
     <w:p>
@@ -7561,83 +5710,30 @@
           <w:b/>
           <w:bCs/>
         </w:rPr>
-        <w:t>*.</w:t>
-      </w:r>
-      <w:proofErr w:type="spellStart"/>
+        <w:t>*.wv</w:t>
+      </w:r>
+      <w:r>
+        <w:t>. This file is generated when arb PDWs are included.</w:t>
+      </w:r>
+    </w:p>
+    <w:p>
+      <w:r>
+        <w:t xml:space="preserve">When not using arb waveform PDWs, only </w:t>
+      </w:r>
       <w:r>
         <w:rPr>
           <w:b/>
           <w:bCs/>
         </w:rPr>
-        <w:t>ps_adr</w:t>
-      </w:r>
-      <w:proofErr w:type="spellEnd"/>
-      <w:r>
-        <w:t xml:space="preserve"> file contains the addresses of the waveform segments (addressed by PDWs)</w:t>
-      </w:r>
-      <w:r>
-        <w:t>. This file is generated when arb PDWs are included.</w:t>
-      </w:r>
-    </w:p>
-    <w:p>
-      <w:pPr>
-        <w:numPr>
-          <w:ilvl w:val="0"/>
-          <w:numId w:val="14"/>
-        </w:numPr>
-      </w:pPr>
-      <w:r>
-        <w:rPr>
-          <w:b/>
-          <w:bCs/>
-        </w:rPr>
-        <w:t>*</w:t>
-      </w:r>
-      <w:r>
-        <w:rPr>
-          <w:b/>
-          <w:bCs/>
-        </w:rPr>
-        <w:t>.</w:t>
-      </w:r>
-      <w:proofErr w:type="spellStart"/>
-      <w:r>
-        <w:rPr>
-          <w:b/>
-          <w:bCs/>
-        </w:rPr>
-        <w:t>wv</w:t>
-      </w:r>
-      <w:proofErr w:type="spellEnd"/>
-      <w:r>
-        <w:t>. This file is generated when arb PDWs are included.</w:t>
-      </w:r>
-    </w:p>
-    <w:p>
-      <w:r>
-        <w:t xml:space="preserve">When not using arb waveform PDWs, only </w:t>
-      </w:r>
-      <w:r>
-        <w:rPr>
-          <w:b/>
-          <w:bCs/>
-        </w:rPr>
-        <w:t>*.</w:t>
-      </w:r>
-      <w:proofErr w:type="spellStart"/>
-      <w:r>
-        <w:rPr>
-          <w:b/>
-          <w:bCs/>
-        </w:rPr>
-        <w:t>ps_def</w:t>
-      </w:r>
-      <w:proofErr w:type="spellEnd"/>
-      <w:r>
-        <w:t xml:space="preserve"> file </w:t>
-      </w:r>
-      <w:r>
-        <w:t xml:space="preserve">is generated. </w:t>
+        <w:t>*.ps_def</w:t>
+      </w:r>
+      <w:r>
+        <w:t xml:space="preserve"> file is generated. </w:t>
+      </w:r>
+    </w:p>
+    <w:p>
+      <w:r>
+        <w:t xml:space="preserve">After the files are generated, the Definition file of the SMW Playback and Multi-Sequencer tabs is filled in with the new .ps_def file automatically.</w:t>
       </w:r>
     </w:p>
     <w:p/>
@@ -7647,34 +5743,18 @@
       </w:pPr>
       <w:bookmarkStart w:id="24" w:name="_Toc242882283"/>
       <w:r>
-        <w:t xml:space="preserve">Transfer Script Output Files to </w:t>
-      </w:r>
-      <w:proofErr w:type="gramStart"/>
-      <w:r>
-        <w:t>the SMW200A</w:t>
+        <w:t xml:space="preserve">Transfer Script Output Files to the SMW200A</w:t>
       </w:r>
       <w:bookmarkEnd w:id="24"/>
-      <w:proofErr w:type="gramEnd"/>
-    </w:p>
-    <w:p>
-      <w:r>
-        <w:t xml:space="preserve">There are multiple ways to transfer files to and from the instrument. </w:t>
-      </w:r>
-      <w:r>
-        <w:t xml:space="preserve">The FTP method was used here. </w:t>
-      </w:r>
-    </w:p>
-    <w:p>
-      <w:r>
-        <w:t>Type “ftp://&lt;</w:t>
-      </w:r>
-      <w:proofErr w:type="spellStart"/>
-      <w:r>
-        <w:t>ip</w:t>
-      </w:r>
-      <w:proofErr w:type="spellEnd"/>
-      <w:r>
-        <w:t xml:space="preserve"> address&gt;” in the Windows Explorer window. </w:t>
+    </w:p>
+    <w:p>
+      <w:r>
+        <w:t xml:space="preserve">The SMW Playback tab transfers the files and starts playback in one step (see Section 4.5), so a separate transfer is usually not needed. To transfer the files manually instead, there are multiple ways to transfer files to and from the instrument. The FTP method was used here.</w:t>
+      </w:r>
+    </w:p>
+    <w:p>
+      <w:r>
+        <w:t xml:space="preserve">Type “ftp://&lt;ip address&gt;” in the Windows Explorer window. </w:t>
       </w:r>
       <w:r>
         <w:rPr>
@@ -7768,7 +5848,7 @@
     <w:p/>
     <w:p>
       <w:r>
-        <w:t xml:space="preserve">Copy and paste the three generated files under the “user” folder. </w:t>
+        <w:t xml:space="preserve">Copy and paste the generated files (the .ps_def, plus the .ps_adr and .wv when arb PDWs are used) under the “user” folder.</w:t>
       </w:r>
     </w:p>
     <w:p>
@@ -7839,15 +5919,102 @@
     </w:p>
     <w:p>
       <w:r>
-        <w:t xml:space="preserve">To play the file back, it is recommended to start </w:t>
-      </w:r>
-      <w:proofErr w:type="gramStart"/>
-      <w:r>
-        <w:t>from</w:t>
-      </w:r>
-      <w:proofErr w:type="gramEnd"/>
-      <w:r>
-        <w:t xml:space="preserve"> a PRESET. </w:t>
+        <w:rPr>
+          <w:b/>
+          <w:bCs/>
+        </w:rPr>
+        <w:t xml:space="preserve">Using the SMW Playback tab (recommended)</w:t>
+      </w:r>
+    </w:p>
+    <w:p>
+      <w:pPr>
+        <w:pStyle w:val="ListParagraph"/>
+        <w:numPr>
+          <w:ilvl w:val="0"/>
+          <w:numId w:val="22"/>
+        </w:numPr>
+      </w:pPr>
+      <w:r>
+        <w:t xml:space="preserve">Open the “SMW Playback” tab. Under “Instrument”, enter the SMW200A’s IP address and click “Connect”. The “Status” line shows the instrument identification. If the Log shows a warning that SMW-K503 or SMW-K504 is missing, the instrument cannot play xDW files.</w:t>
+      </w:r>
+    </w:p>
+    <w:p>
+      <w:pPr>
+        <w:pStyle w:val="ListParagraph"/>
+        <w:numPr>
+          <w:ilvl w:val="0"/>
+          <w:numId w:val="22"/>
+        </w:numPr>
+      </w:pPr>
+      <w:r>
+        <w:t xml:space="preserve">“Definition file” is filled in with the last generated .ps_def. To play a different file, click “Browse...”. “Files to transfer” lists the .ps_def and, for lists with arb PDWs, the matching .ps_adr and .wv. “Instrument folder” is the folder on the SMW200A the files are copied to (/var/user by default).</w:t>
+      </w:r>
+    </w:p>
+    <w:p>
+      <w:pPr>
+        <w:pStyle w:val="ListParagraph"/>
+        <w:numPr>
+          <w:ilvl w:val="0"/>
+          <w:numId w:val="22"/>
+        </w:numPr>
+      </w:pPr>
+      <w:r>
+        <w:t xml:space="preserve">Select the “Trigger mode” and “Trigger source”. Leave “Preset instrument before playback” and “Turn RF on” checked unless you need to keep the current instrument settings.</w:t>
+      </w:r>
+    </w:p>
+    <w:p>
+      <w:pPr>
+        <w:pStyle w:val="ListParagraph"/>
+        <w:numPr>
+          <w:ilvl w:val="0"/>
+          <w:numId w:val="22"/>
+        </w:numPr>
+      </w:pPr>
+      <w:r>
+        <w:t xml:space="preserve">Click “Transfer &amp; Play”. The tool copies the files, loads the .ps_def in “Playback from File” mode, sets every marker to PDW, routes Baseband A Marker 1 to the T/M/C 1 connector, turns RF on, and turns on the Extended Sequencer.</w:t>
+      </w:r>
+    </w:p>
+    <w:p>
+      <w:pPr>
+        <w:pStyle w:val="ListParagraph"/>
+        <w:numPr>
+          <w:ilvl w:val="0"/>
+          <w:numId w:val="22"/>
+        </w:numPr>
+      </w:pPr>
+      <w:r>
+        <w:t xml:space="preserve">If the trigger mode is Armed Auto, Armed Retrigger, or Single, playback waits for a trigger. Click “Execute Trigger”, or apply the external trigger if an External Global Trigger source is selected.</w:t>
+      </w:r>
+    </w:p>
+    <w:p>
+      <w:pPr>
+        <w:pStyle w:val="ListParagraph"/>
+        <w:numPr>
+          <w:ilvl w:val="0"/>
+          <w:numId w:val="22"/>
+        </w:numPr>
+      </w:pPr>
+      <w:r>
+        <w:t xml:space="preserve">Click “Stop” to turn off the Extended Sequencer, and RF if “Turn RF on” is checked.</w:t>
+      </w:r>
+    </w:p>
+    <w:p>
+      <w:r>
+        <w:t xml:space="preserve">“Transfer Only” copies the files without playing them. “Play” plays files that are already on the instrument.</w:t>
+      </w:r>
+    </w:p>
+    <w:p>
+      <w:r>
+        <w:rPr>
+          <w:b/>
+          <w:bCs/>
+        </w:rPr>
+        <w:t xml:space="preserve">Setting up playback manually on the instrument</w:t>
+      </w:r>
+    </w:p>
+    <w:p>
+      <w:r>
+        <w:t xml:space="preserve">To play the file back, it is recommended to start from a PRESET. </w:t>
       </w:r>
     </w:p>
     <w:p>
@@ -7964,15 +6131,7 @@
         </w:numPr>
       </w:pPr>
       <w:r>
-        <w:t>Next, press “Definition File” and navigate to the “</w:t>
-      </w:r>
-      <w:proofErr w:type="spellStart"/>
-      <w:r>
-        <w:t>IQ_expert.ps_def</w:t>
-      </w:r>
-      <w:proofErr w:type="spellEnd"/>
-      <w:r>
-        <w:t>” file.</w:t>
+        <w:t xml:space="preserve">Next, press “Definition File” and navigate to the generated .ps_def file.</w:t>
       </w:r>
     </w:p>
     <w:p>
@@ -8097,16 +6256,7 @@
         </w:numPr>
       </w:pPr>
       <w:r>
-        <w:t xml:space="preserve">Go to the “Marker” tab and ensure every marker type is </w:t>
-      </w:r>
-      <w:r>
-        <w:t>selected</w:t>
-      </w:r>
-      <w:r>
-        <w:t xml:space="preserve"> to PDW. This ensures the SMW200A scans the incoming PDWs for Markers.</w:t>
-      </w:r>
-      <w:r>
-        <w:t xml:space="preserve"> The default selection is “Restart”.</w:t>
+        <w:t xml:space="preserve">Go to the “Marker” tab and ensure every marker type is selected to PDW. This ensures the SMW200A scans the incoming PDWs for Markers. The default selection is “Restart”.</w:t>
       </w:r>
     </w:p>
     <w:p>
@@ -8294,15 +6444,7 @@
         </w:numPr>
       </w:pPr>
       <w:r>
-        <w:t xml:space="preserve">Under “Trigger In” tab, </w:t>
-      </w:r>
-      <w:proofErr w:type="gramStart"/>
-      <w:r>
-        <w:t>Select</w:t>
-      </w:r>
-      <w:proofErr w:type="gramEnd"/>
-      <w:r>
-        <w:t xml:space="preserve"> “Execute Trigger” (if in Armed Retrigger Mode),</w:t>
+        <w:t xml:space="preserve">Under “Trigger In” tab, select “Execute Trigger” (if using an armed trigger mode, such as Armed Auto or Armed Retrigger).</w:t>
       </w:r>
     </w:p>
     <w:p>
@@ -8378,12 +6520,89 @@
     </w:p>
     <w:p>
       <w:r>
-        <w:t xml:space="preserve">This allows for multiple files to be loaded onto different hardware resources. A sequencer is a unit of resource. There are up to 6 supported sequencers determined by the hardware configuration. A B9 or B15 option constitutes one sequencer. </w:t>
-      </w:r>
-    </w:p>
-    <w:p>
-      <w:r>
-        <w:t xml:space="preserve">The GUI has a tab to upload separate files to each sequencer. The outputs can be directed to RF A or RF B. If more than one sequencer is directed to one RF port, the outputs are summed. This allows for pulse-on-pulse modulation (provided the SMW is equipped with the K315 option). </w:t>
+        <w:t xml:space="preserve">This allows for multiple files to be loaded onto different hardware resources. A sequencer is a unit of resource. There are up to 6 supported sequencers, determined by the hardware configuration (see the optional SMW-B15 in Section 2.1).</w:t>
+      </w:r>
+    </w:p>
+    <w:p>
+      <w:r>
+        <w:t xml:space="preserve">The “Multi-Sequencer” tab loads a separate file onto each sequencer. The outputs can be directed to RF A or RF B. If more than one sequencer is directed to one RF port, the outputs are summed. This allows for pulse-on-pulse modulation (provided the SMW is equipped with the K315 option).</w:t>
+      </w:r>
+    </w:p>
+    <w:p>
+      <w:pPr>
+        <w:pStyle w:val="ListParagraph"/>
+        <w:numPr>
+          <w:ilvl w:val="0"/>
+          <w:numId w:val="23"/>
+        </w:numPr>
+      </w:pPr>
+      <w:r>
+        <w:t xml:space="preserve">Connect to the instrument under “Instrument”. The connection is shared with the SMW Playback tab.</w:t>
+      </w:r>
+    </w:p>
+    <w:p>
+      <w:pPr>
+        <w:pStyle w:val="ListParagraph"/>
+        <w:numPr>
+          <w:ilvl w:val="0"/>
+          <w:numId w:val="23"/>
+        </w:numPr>
+      </w:pPr>
+      <w:r>
+        <w:t xml:space="preserve">If “System mode” is not Extended Sequencer Advanced, click “Switch to Extended Sequencer Advanced Mode”. This changes System Config &gt; Fading/Baseband Config &gt; Mode on the instrument and can take a minute or more. Loading a file also switches the mode automatically.</w:t>
+      </w:r>
+    </w:p>
+    <w:p>
+      <w:pPr>
+        <w:pStyle w:val="ListParagraph"/>
+        <w:numPr>
+          <w:ilvl w:val="0"/>
+          <w:numId w:val="23"/>
+        </w:numPr>
+      </w:pPr>
+      <w:r>
+        <w:t xml:space="preserve">For each sequencer, select the “Definition file” and the “Sequencer” (S1–S6), then click “Transfer &amp; Load”.</w:t>
+      </w:r>
+    </w:p>
+    <w:p>
+      <w:pPr>
+        <w:pStyle w:val="ListParagraph"/>
+        <w:numPr>
+          <w:ilvl w:val="0"/>
+          <w:numId w:val="23"/>
+        </w:numPr>
+      </w:pPr>
+      <w:r>
+        <w:t xml:space="preserve">In the “Sequencers” table, set each sequencer’s “On”, “Stream”, “Freq offset” (MHz), “Attenuation” (dB), and “Trigger delay” (us). Then set each stream’s output to RF A, RF B, or None. A stream can only hold a limited number of sequencers; the tool warns if too many are assigned to one stream.</w:t>
+      </w:r>
+    </w:p>
+    <w:p>
+      <w:pPr>
+        <w:pStyle w:val="ListParagraph"/>
+        <w:numPr>
+          <w:ilvl w:val="0"/>
+          <w:numId w:val="23"/>
+        </w:numPr>
+      </w:pPr>
+      <w:r>
+        <w:t xml:space="preserve">Select the “Trigger source”. The trigger mode is always Armed Auto, the only mode supported for Playback from File in advanced mode. With the internal trigger source and “Start immediately” checked, “Play All” starts all sequencers together. Otherwise, click “Execute Trigger” or apply the external trigger.</w:t>
+      </w:r>
+    </w:p>
+    <w:p>
+      <w:pPr>
+        <w:pStyle w:val="ListParagraph"/>
+        <w:numPr>
+          <w:ilvl w:val="0"/>
+          <w:numId w:val="23"/>
+        </w:numPr>
+      </w:pPr>
+      <w:r>
+        <w:t xml:space="preserve">Click “Play All”. Click “Stop” to turn off the Extended Sequencer and the RF outputs in use.</w:t>
+      </w:r>
+    </w:p>
+    <w:p>
+      <w:r>
+        <w:t xml:space="preserve">“Refresh from Instrument” reads the current sequencer settings back from the SMW200A.</w:t>
       </w:r>
     </w:p>
     <w:p>
@@ -11147,6 +9366,18 @@
   </w:num>
   <w:num w:numId="21" w16cid:durableId="347802969">
     <w:abstractNumId w:val="10"/>
+  </w:num>
+  <w:num w:numId="22">
+    <w:abstractNumId w:val="20"/>
+    <w:lvlOverride w:ilvl="0">
+      <w:startOverride w:val="1"/>
+    </w:lvlOverride>
+  </w:num>
+  <w:num w:numId="23">
+    <w:abstractNumId w:val="20"/>
+    <w:lvlOverride w:ilvl="0">
+      <w:startOverride w:val="1"/>
+    </w:lvlOverride>
   </w:num>
   <w:numIdMacAtCleanup w:val="21"/>
 </w:numbering>

</xml_diff>

<commit_message>
update user doc again
</commit_message>
<xml_diff>
--- a/Python Script SMW200A Instructions.docx
+++ b/Python Script SMW200A Instructions.docx
@@ -13,12 +13,12 @@
     <w:p/>
     <w:p>
       <w:r>
-        <w:t xml:space="preserve">Document Version 1.3</w:t>
-      </w:r>
-    </w:p>
-    <w:p>
-      <w:r>
-        <w:t xml:space="preserve">10/14/2026</w:t>
+        <w:t>Document Version 1.3</w:t>
+      </w:r>
+    </w:p>
+    <w:p>
+      <w:r>
+        <w:t>10/14/2026</w:t>
       </w:r>
     </w:p>
     <w:p/>
@@ -163,10 +163,14 @@
           </w:pPr>
           <w:r>
             <w:fldChar w:fldCharType="begin"/>
+          </w:r>
+          <w:r>
             <w:instrText xml:space="preserve"> TOC \o "1-3" \h \z \u </w:instrText>
+          </w:r>
+          <w:r>
             <w:fldChar w:fldCharType="separate"/>
           </w:r>
-          <w:hyperlink w:anchor="_Toc242882264" w:history="1">
+          <w:hyperlink w:anchor="_Toc242889692" w:history="1">
             <w:r>
               <w:rPr>
                 <w:rStyle w:val="Hyperlink"/>
@@ -201,10 +205,46 @@
                 <w:webHidden/>
               </w:rPr>
               <w:tab/>
+            </w:r>
+            <w:r>
+              <w:rPr>
+                <w:noProof/>
+                <w:webHidden/>
+              </w:rPr>
               <w:fldChar w:fldCharType="begin"/>
-              <w:instrText xml:space="preserve"> PAGEREF _Toc242882264 \h </w:instrText>
+            </w:r>
+            <w:r>
+              <w:rPr>
+                <w:noProof/>
+                <w:webHidden/>
+              </w:rPr>
+              <w:instrText xml:space="preserve"> PAGEREF _Toc242889692 \h </w:instrText>
+            </w:r>
+            <w:r>
+              <w:rPr>
+                <w:noProof/>
+                <w:webHidden/>
+              </w:rPr>
+            </w:r>
+            <w:r>
+              <w:rPr>
+                <w:noProof/>
+                <w:webHidden/>
+              </w:rPr>
               <w:fldChar w:fldCharType="separate"/>
+            </w:r>
+            <w:r>
+              <w:rPr>
+                <w:noProof/>
+                <w:webHidden/>
+              </w:rPr>
               <w:t>3</w:t>
+            </w:r>
+            <w:r>
+              <w:rPr>
+                <w:noProof/>
+                <w:webHidden/>
+              </w:rPr>
               <w:fldChar w:fldCharType="end"/>
             </w:r>
           </w:hyperlink>
@@ -221,7 +261,7 @@
               <w14:ligatures w14:val="standardContextual"/>
             </w:rPr>
           </w:pPr>
-          <w:hyperlink w:anchor="_Toc242882265" w:history="1">
+          <w:hyperlink w:anchor="_Toc242889693" w:history="1">
             <w:r>
               <w:rPr>
                 <w:rStyle w:val="Hyperlink"/>
@@ -253,10 +293,46 @@
                 <w:webHidden/>
               </w:rPr>
               <w:tab/>
+            </w:r>
+            <w:r>
+              <w:rPr>
+                <w:noProof/>
+                <w:webHidden/>
+              </w:rPr>
               <w:fldChar w:fldCharType="begin"/>
-              <w:instrText xml:space="preserve"> PAGEREF _Toc242882265 \h </w:instrText>
+            </w:r>
+            <w:r>
+              <w:rPr>
+                <w:noProof/>
+                <w:webHidden/>
+              </w:rPr>
+              <w:instrText xml:space="preserve"> PAGEREF _Toc242889693 \h </w:instrText>
+            </w:r>
+            <w:r>
+              <w:rPr>
+                <w:noProof/>
+                <w:webHidden/>
+              </w:rPr>
+            </w:r>
+            <w:r>
+              <w:rPr>
+                <w:noProof/>
+                <w:webHidden/>
+              </w:rPr>
               <w:fldChar w:fldCharType="separate"/>
+            </w:r>
+            <w:r>
+              <w:rPr>
+                <w:noProof/>
+                <w:webHidden/>
+              </w:rPr>
               <w:t>3</w:t>
+            </w:r>
+            <w:r>
+              <w:rPr>
+                <w:noProof/>
+                <w:webHidden/>
+              </w:rPr>
               <w:fldChar w:fldCharType="end"/>
             </w:r>
           </w:hyperlink>
@@ -273,7 +349,7 @@
               <w14:ligatures w14:val="standardContextual"/>
             </w:rPr>
           </w:pPr>
-          <w:hyperlink w:anchor="_Toc242882266" w:history="1">
+          <w:hyperlink w:anchor="_Toc242889694" w:history="1">
             <w:r>
               <w:rPr>
                 <w:rStyle w:val="Hyperlink"/>
@@ -305,10 +381,46 @@
                 <w:webHidden/>
               </w:rPr>
               <w:tab/>
+            </w:r>
+            <w:r>
+              <w:rPr>
+                <w:noProof/>
+                <w:webHidden/>
+              </w:rPr>
               <w:fldChar w:fldCharType="begin"/>
-              <w:instrText xml:space="preserve"> PAGEREF _Toc242882266 \h </w:instrText>
+            </w:r>
+            <w:r>
+              <w:rPr>
+                <w:noProof/>
+                <w:webHidden/>
+              </w:rPr>
+              <w:instrText xml:space="preserve"> PAGEREF _Toc242889694 \h </w:instrText>
+            </w:r>
+            <w:r>
+              <w:rPr>
+                <w:noProof/>
+                <w:webHidden/>
+              </w:rPr>
+            </w:r>
+            <w:r>
+              <w:rPr>
+                <w:noProof/>
+                <w:webHidden/>
+              </w:rPr>
               <w:fldChar w:fldCharType="separate"/>
+            </w:r>
+            <w:r>
+              <w:rPr>
+                <w:noProof/>
+                <w:webHidden/>
+              </w:rPr>
               <w:t>3</w:t>
+            </w:r>
+            <w:r>
+              <w:rPr>
+                <w:noProof/>
+                <w:webHidden/>
+              </w:rPr>
               <w:fldChar w:fldCharType="end"/>
             </w:r>
           </w:hyperlink>
@@ -328,7 +440,7 @@
               <w14:ligatures w14:val="standardContextual"/>
             </w:rPr>
           </w:pPr>
-          <w:hyperlink w:anchor="_Toc242882267" w:history="1">
+          <w:hyperlink w:anchor="_Toc242889695" w:history="1">
             <w:r>
               <w:rPr>
                 <w:rStyle w:val="Hyperlink"/>
@@ -363,10 +475,46 @@
                 <w:webHidden/>
               </w:rPr>
               <w:tab/>
+            </w:r>
+            <w:r>
+              <w:rPr>
+                <w:noProof/>
+                <w:webHidden/>
+              </w:rPr>
               <w:fldChar w:fldCharType="begin"/>
-              <w:instrText xml:space="preserve"> PAGEREF _Toc242882267 \h </w:instrText>
+            </w:r>
+            <w:r>
+              <w:rPr>
+                <w:noProof/>
+                <w:webHidden/>
+              </w:rPr>
+              <w:instrText xml:space="preserve"> PAGEREF _Toc242889695 \h </w:instrText>
+            </w:r>
+            <w:r>
+              <w:rPr>
+                <w:noProof/>
+                <w:webHidden/>
+              </w:rPr>
+            </w:r>
+            <w:r>
+              <w:rPr>
+                <w:noProof/>
+                <w:webHidden/>
+              </w:rPr>
               <w:fldChar w:fldCharType="separate"/>
+            </w:r>
+            <w:r>
+              <w:rPr>
+                <w:noProof/>
+                <w:webHidden/>
+              </w:rPr>
               <w:t>3</w:t>
+            </w:r>
+            <w:r>
+              <w:rPr>
+                <w:noProof/>
+                <w:webHidden/>
+              </w:rPr>
               <w:fldChar w:fldCharType="end"/>
             </w:r>
           </w:hyperlink>
@@ -383,7 +531,7 @@
               <w14:ligatures w14:val="standardContextual"/>
             </w:rPr>
           </w:pPr>
-          <w:hyperlink w:anchor="_Toc242882268" w:history="1">
+          <w:hyperlink w:anchor="_Toc242889696" w:history="1">
             <w:r>
               <w:rPr>
                 <w:rStyle w:val="Hyperlink"/>
@@ -407,7 +555,21 @@
                 <w:rStyle w:val="Hyperlink"/>
                 <w:noProof/>
               </w:rPr>
-              <w:t>Required Components</w:t>
+              <w:t>Require</w:t>
+            </w:r>
+            <w:r>
+              <w:rPr>
+                <w:rStyle w:val="Hyperlink"/>
+                <w:noProof/>
+              </w:rPr>
+              <w:t>d</w:t>
+            </w:r>
+            <w:r>
+              <w:rPr>
+                <w:rStyle w:val="Hyperlink"/>
+                <w:noProof/>
+              </w:rPr>
+              <w:t xml:space="preserve"> Components</w:t>
             </w:r>
             <w:r>
               <w:rPr>
@@ -415,10 +577,46 @@
                 <w:webHidden/>
               </w:rPr>
               <w:tab/>
+            </w:r>
+            <w:r>
+              <w:rPr>
+                <w:noProof/>
+                <w:webHidden/>
+              </w:rPr>
               <w:fldChar w:fldCharType="begin"/>
-              <w:instrText xml:space="preserve"> PAGEREF _Toc242882268 \h </w:instrText>
+            </w:r>
+            <w:r>
+              <w:rPr>
+                <w:noProof/>
+                <w:webHidden/>
+              </w:rPr>
+              <w:instrText xml:space="preserve"> PAGEREF _Toc242889696 \h </w:instrText>
+            </w:r>
+            <w:r>
+              <w:rPr>
+                <w:noProof/>
+                <w:webHidden/>
+              </w:rPr>
+            </w:r>
+            <w:r>
+              <w:rPr>
+                <w:noProof/>
+                <w:webHidden/>
+              </w:rPr>
               <w:fldChar w:fldCharType="separate"/>
+            </w:r>
+            <w:r>
+              <w:rPr>
+                <w:noProof/>
+                <w:webHidden/>
+              </w:rPr>
               <w:t>3</w:t>
+            </w:r>
+            <w:r>
+              <w:rPr>
+                <w:noProof/>
+                <w:webHidden/>
+              </w:rPr>
               <w:fldChar w:fldCharType="end"/>
             </w:r>
           </w:hyperlink>
@@ -435,7 +633,7 @@
               <w14:ligatures w14:val="standardContextual"/>
             </w:rPr>
           </w:pPr>
-          <w:hyperlink w:anchor="_Toc242882269" w:history="1">
+          <w:hyperlink w:anchor="_Toc242889697" w:history="1">
             <w:r>
               <w:rPr>
                 <w:rStyle w:val="Hyperlink"/>
@@ -467,10 +665,46 @@
                 <w:webHidden/>
               </w:rPr>
               <w:tab/>
+            </w:r>
+            <w:r>
+              <w:rPr>
+                <w:noProof/>
+                <w:webHidden/>
+              </w:rPr>
               <w:fldChar w:fldCharType="begin"/>
-              <w:instrText xml:space="preserve"> PAGEREF _Toc242882269 \h </w:instrText>
+            </w:r>
+            <w:r>
+              <w:rPr>
+                <w:noProof/>
+                <w:webHidden/>
+              </w:rPr>
+              <w:instrText xml:space="preserve"> PAGEREF _Toc242889697 \h </w:instrText>
+            </w:r>
+            <w:r>
+              <w:rPr>
+                <w:noProof/>
+                <w:webHidden/>
+              </w:rPr>
+            </w:r>
+            <w:r>
+              <w:rPr>
+                <w:noProof/>
+                <w:webHidden/>
+              </w:rPr>
               <w:fldChar w:fldCharType="separate"/>
+            </w:r>
+            <w:r>
+              <w:rPr>
+                <w:noProof/>
+                <w:webHidden/>
+              </w:rPr>
               <w:t>4</w:t>
+            </w:r>
+            <w:r>
+              <w:rPr>
+                <w:noProof/>
+                <w:webHidden/>
+              </w:rPr>
               <w:fldChar w:fldCharType="end"/>
             </w:r>
           </w:hyperlink>
@@ -487,7 +721,7 @@
               <w14:ligatures w14:val="standardContextual"/>
             </w:rPr>
           </w:pPr>
-          <w:hyperlink w:anchor="_Toc242882270" w:history="1">
+          <w:hyperlink w:anchor="_Toc242889698" w:history="1">
             <w:r>
               <w:rPr>
                 <w:rStyle w:val="Hyperlink"/>
@@ -519,10 +753,46 @@
                 <w:webHidden/>
               </w:rPr>
               <w:tab/>
+            </w:r>
+            <w:r>
+              <w:rPr>
+                <w:noProof/>
+                <w:webHidden/>
+              </w:rPr>
               <w:fldChar w:fldCharType="begin"/>
-              <w:instrText xml:space="preserve"> PAGEREF _Toc242882270 \h </w:instrText>
+            </w:r>
+            <w:r>
+              <w:rPr>
+                <w:noProof/>
+                <w:webHidden/>
+              </w:rPr>
+              <w:instrText xml:space="preserve"> PAGEREF _Toc242889698 \h </w:instrText>
+            </w:r>
+            <w:r>
+              <w:rPr>
+                <w:noProof/>
+                <w:webHidden/>
+              </w:rPr>
+            </w:r>
+            <w:r>
+              <w:rPr>
+                <w:noProof/>
+                <w:webHidden/>
+              </w:rPr>
               <w:fldChar w:fldCharType="separate"/>
-              <w:t>4</w:t>
+            </w:r>
+            <w:r>
+              <w:rPr>
+                <w:noProof/>
+                <w:webHidden/>
+              </w:rPr>
+              <w:t>5</w:t>
+            </w:r>
+            <w:r>
+              <w:rPr>
+                <w:noProof/>
+                <w:webHidden/>
+              </w:rPr>
               <w:fldChar w:fldCharType="end"/>
             </w:r>
           </w:hyperlink>
@@ -541,7 +811,7 @@
               <w14:ligatures w14:val="standardContextual"/>
             </w:rPr>
           </w:pPr>
-          <w:hyperlink w:anchor="_Toc242882271" w:history="1">
+          <w:hyperlink w:anchor="_Toc242889699" w:history="1">
             <w:r>
               <w:rPr>
                 <w:rStyle w:val="Hyperlink"/>
@@ -567,7 +837,7 @@
                 <w:rStyle w:val="Hyperlink"/>
                 <w:noProof/>
               </w:rPr>
-              <w:t>Pip</w:t>
+              <w:t>Automatic Setup</w:t>
             </w:r>
             <w:r>
               <w:rPr>
@@ -575,10 +845,46 @@
                 <w:webHidden/>
               </w:rPr>
               <w:tab/>
+            </w:r>
+            <w:r>
+              <w:rPr>
+                <w:noProof/>
+                <w:webHidden/>
+              </w:rPr>
               <w:fldChar w:fldCharType="begin"/>
-              <w:instrText xml:space="preserve"> PAGEREF _Toc242882271 \h </w:instrText>
+            </w:r>
+            <w:r>
+              <w:rPr>
+                <w:noProof/>
+                <w:webHidden/>
+              </w:rPr>
+              <w:instrText xml:space="preserve"> PAGEREF _Toc242889699 \h </w:instrText>
+            </w:r>
+            <w:r>
+              <w:rPr>
+                <w:noProof/>
+                <w:webHidden/>
+              </w:rPr>
+            </w:r>
+            <w:r>
+              <w:rPr>
+                <w:noProof/>
+                <w:webHidden/>
+              </w:rPr>
               <w:fldChar w:fldCharType="separate"/>
-              <w:t>4</w:t>
+            </w:r>
+            <w:r>
+              <w:rPr>
+                <w:noProof/>
+                <w:webHidden/>
+              </w:rPr>
+              <w:t>5</w:t>
+            </w:r>
+            <w:r>
+              <w:rPr>
+                <w:noProof/>
+                <w:webHidden/>
+              </w:rPr>
               <w:fldChar w:fldCharType="end"/>
             </w:r>
           </w:hyperlink>
@@ -597,7 +903,7 @@
               <w14:ligatures w14:val="standardContextual"/>
             </w:rPr>
           </w:pPr>
-          <w:hyperlink w:anchor="_Toc242882272" w:history="1">
+          <w:hyperlink w:anchor="_Toc242889700" w:history="1">
             <w:r>
               <w:rPr>
                 <w:rStyle w:val="Hyperlink"/>
@@ -623,7 +929,7 @@
                 <w:rStyle w:val="Hyperlink"/>
                 <w:noProof/>
               </w:rPr>
-              <w:t>Numpy</w:t>
+              <w:t>Manual Setup</w:t>
             </w:r>
             <w:r>
               <w:rPr>
@@ -631,178 +937,46 @@
                 <w:webHidden/>
               </w:rPr>
               <w:tab/>
+            </w:r>
+            <w:r>
+              <w:rPr>
+                <w:noProof/>
+                <w:webHidden/>
+              </w:rPr>
               <w:fldChar w:fldCharType="begin"/>
-              <w:instrText xml:space="preserve"> PAGEREF _Toc242882272 \h </w:instrText>
+            </w:r>
+            <w:r>
+              <w:rPr>
+                <w:noProof/>
+                <w:webHidden/>
+              </w:rPr>
+              <w:instrText xml:space="preserve"> PAGEREF _Toc242889700 \h </w:instrText>
+            </w:r>
+            <w:r>
+              <w:rPr>
+                <w:noProof/>
+                <w:webHidden/>
+              </w:rPr>
+            </w:r>
+            <w:r>
+              <w:rPr>
+                <w:noProof/>
+                <w:webHidden/>
+              </w:rPr>
               <w:fldChar w:fldCharType="separate"/>
-              <w:t>4</w:t>
-              <w:fldChar w:fldCharType="end"/>
-            </w:r>
-          </w:hyperlink>
-        </w:p>
-        <w:p>
-          <w:pPr>
-            <w:pStyle w:val="TOC3"/>
-            <w:rPr>
-              <w:rFonts w:eastAsiaTheme="minorEastAsia"/>
-              <w:b w:val="0"/>
-              <w:bCs w:val="0"/>
-              <w:noProof/>
-              <w:kern w:val="2"/>
-              <w:sz w:val="24"/>
-              <w:szCs w:val="24"/>
-              <w14:ligatures w14:val="standardContextual"/>
-            </w:rPr>
-          </w:pPr>
-          <w:hyperlink w:anchor="_Toc242882273" w:history="1">
-            <w:r>
-              <w:rPr>
-                <w:rStyle w:val="Hyperlink"/>
-                <w:noProof/>
-              </w:rPr>
-              <w:t>2.3.3</w:t>
-            </w:r>
-            <w:r>
-              <w:rPr>
-                <w:rFonts w:eastAsiaTheme="minorEastAsia"/>
-                <w:b w:val="0"/>
-                <w:bCs w:val="0"/>
-                <w:noProof/>
-                <w:kern w:val="2"/>
-                <w:sz w:val="24"/>
-                <w:szCs w:val="24"/>
-                <w14:ligatures w14:val="standardContextual"/>
-              </w:rPr>
-              <w:tab/>
-            </w:r>
-            <w:r>
-              <w:rPr>
-                <w:rStyle w:val="Hyperlink"/>
-                <w:noProof/>
-              </w:rPr>
-              <w:t>PyQt6</w:t>
-            </w:r>
-            <w:r>
-              <w:rPr>
-                <w:noProof/>
-                <w:webHidden/>
-              </w:rPr>
-              <w:tab/>
-              <w:fldChar w:fldCharType="begin"/>
-              <w:instrText xml:space="preserve"> PAGEREF _Toc242882273 \h </w:instrText>
-              <w:fldChar w:fldCharType="separate"/>
-              <w:t>5</w:t>
-              <w:fldChar w:fldCharType="end"/>
-            </w:r>
-          </w:hyperlink>
-        </w:p>
-        <w:p>
-          <w:pPr>
-            <w:pStyle w:val="TOC3"/>
-            <w:rPr>
-              <w:rFonts w:eastAsiaTheme="minorEastAsia"/>
-              <w:b w:val="0"/>
-              <w:bCs w:val="0"/>
-              <w:noProof/>
-              <w:kern w:val="2"/>
-              <w:sz w:val="24"/>
-              <w:szCs w:val="24"/>
-              <w14:ligatures w14:val="standardContextual"/>
-            </w:rPr>
-          </w:pPr>
-          <w:hyperlink w:anchor="_Toc242882274" w:history="1">
-            <w:r>
-              <w:rPr>
-                <w:rStyle w:val="Hyperlink"/>
-                <w:noProof/>
-              </w:rPr>
-              <w:t>2.3.4</w:t>
-            </w:r>
-            <w:r>
-              <w:rPr>
-                <w:rFonts w:eastAsiaTheme="minorEastAsia"/>
-                <w:b w:val="0"/>
-                <w:bCs w:val="0"/>
-                <w:noProof/>
-                <w:kern w:val="2"/>
-                <w:sz w:val="24"/>
-                <w:szCs w:val="24"/>
-                <w14:ligatures w14:val="standardContextual"/>
-              </w:rPr>
-              <w:tab/>
-            </w:r>
-            <w:r>
-              <w:rPr>
-                <w:rStyle w:val="Hyperlink"/>
-                <w:noProof/>
-              </w:rPr>
-              <w:t>Rsxdwstreaming</w:t>
-            </w:r>
-            <w:r>
-              <w:rPr>
-                <w:noProof/>
-                <w:webHidden/>
-              </w:rPr>
-              <w:tab/>
-              <w:fldChar w:fldCharType="begin"/>
-              <w:instrText xml:space="preserve"> PAGEREF _Toc242882274 \h </w:instrText>
-              <w:fldChar w:fldCharType="separate"/>
-              <w:t>5</w:t>
-              <w:fldChar w:fldCharType="end"/>
-            </w:r>
-          </w:hyperlink>
-        </w:p>
-        <w:p>
-          <w:pPr>
-            <w:pStyle w:val="TOC3"/>
-            <w:rPr>
-              <w:rFonts w:eastAsiaTheme="minorEastAsia"/>
-              <w:b w:val="0"/>
-              <w:bCs w:val="0"/>
-              <w:noProof/>
-              <w:kern w:val="2"/>
-              <w:sz w:val="24"/>
-              <w:szCs w:val="24"/>
-              <w14:ligatures w14:val="standardContextual"/>
-            </w:rPr>
-          </w:pPr>
-          <w:hyperlink w:anchor="_Toc242882275" w:history="1">
-            <w:r>
-              <w:rPr>
-                <w:rStyle w:val="Hyperlink"/>
-                <w:noProof/>
-              </w:rPr>
-              <w:t>2.3.5</w:t>
-            </w:r>
-            <w:r>
-              <w:rPr>
-                <w:rFonts w:eastAsiaTheme="minorEastAsia"/>
-                <w:b w:val="0"/>
-                <w:bCs w:val="0"/>
-                <w:noProof/>
-                <w:kern w:val="2"/>
-                <w:sz w:val="24"/>
-                <w:szCs w:val="24"/>
-                <w14:ligatures w14:val="standardContextual"/>
-              </w:rPr>
-              <w:tab/>
-            </w:r>
-            <w:r>
-              <w:rPr>
-                <w:rStyle w:val="Hyperlink"/>
-                <w:noProof/>
-              </w:rPr>
-              <w:t>Rskfd</w:t>
-            </w:r>
-            <w:r>
-              <w:rPr>
-                <w:noProof/>
-                <w:webHidden/>
-              </w:rPr>
-              <w:tab/>
-              <w:fldChar w:fldCharType="begin"/>
-              <w:instrText xml:space="preserve"> PAGEREF _Toc242882275 \h </w:instrText>
-              <w:fldChar w:fldCharType="separate"/>
-              <w:t>5</w:t>
+            </w:r>
+            <w:r>
+              <w:rPr>
+                <w:noProof/>
+                <w:webHidden/>
+              </w:rPr>
+              <w:t>7</w:t>
+            </w:r>
+            <w:r>
+              <w:rPr>
+                <w:noProof/>
+                <w:webHidden/>
+              </w:rPr>
               <w:fldChar w:fldCharType="end"/>
             </w:r>
           </w:hyperlink>
@@ -819,7 +993,7 @@
               <w14:ligatures w14:val="standardContextual"/>
             </w:rPr>
           </w:pPr>
-          <w:hyperlink w:anchor="_Toc242882276" w:history="1">
+          <w:hyperlink w:anchor="_Toc242889701" w:history="1">
             <w:r>
               <w:rPr>
                 <w:rStyle w:val="Hyperlink"/>
@@ -851,10 +1025,46 @@
                 <w:webHidden/>
               </w:rPr>
               <w:tab/>
+            </w:r>
+            <w:r>
+              <w:rPr>
+                <w:noProof/>
+                <w:webHidden/>
+              </w:rPr>
               <w:fldChar w:fldCharType="begin"/>
-              <w:instrText xml:space="preserve"> PAGEREF _Toc242882276 \h </w:instrText>
+            </w:r>
+            <w:r>
+              <w:rPr>
+                <w:noProof/>
+                <w:webHidden/>
+              </w:rPr>
+              <w:instrText xml:space="preserve"> PAGEREF _Toc242889701 \h </w:instrText>
+            </w:r>
+            <w:r>
+              <w:rPr>
+                <w:noProof/>
+                <w:webHidden/>
+              </w:rPr>
+            </w:r>
+            <w:r>
+              <w:rPr>
+                <w:noProof/>
+                <w:webHidden/>
+              </w:rPr>
               <w:fldChar w:fldCharType="separate"/>
-              <w:t>5</w:t>
+            </w:r>
+            <w:r>
+              <w:rPr>
+                <w:noProof/>
+                <w:webHidden/>
+              </w:rPr>
+              <w:t>7</w:t>
+            </w:r>
+            <w:r>
+              <w:rPr>
+                <w:noProof/>
+                <w:webHidden/>
+              </w:rPr>
               <w:fldChar w:fldCharType="end"/>
             </w:r>
           </w:hyperlink>
@@ -871,7 +1081,7 @@
               <w14:ligatures w14:val="standardContextual"/>
             </w:rPr>
           </w:pPr>
-          <w:hyperlink w:anchor="_Toc242882277" w:history="1">
+          <w:hyperlink w:anchor="_Toc242889702" w:history="1">
             <w:r>
               <w:rPr>
                 <w:rStyle w:val="Hyperlink"/>
@@ -903,10 +1113,46 @@
                 <w:webHidden/>
               </w:rPr>
               <w:tab/>
+            </w:r>
+            <w:r>
+              <w:rPr>
+                <w:noProof/>
+                <w:webHidden/>
+              </w:rPr>
               <w:fldChar w:fldCharType="begin"/>
-              <w:instrText xml:space="preserve"> PAGEREF _Toc242882277 \h </w:instrText>
+            </w:r>
+            <w:r>
+              <w:rPr>
+                <w:noProof/>
+                <w:webHidden/>
+              </w:rPr>
+              <w:instrText xml:space="preserve"> PAGEREF _Toc242889702 \h </w:instrText>
+            </w:r>
+            <w:r>
+              <w:rPr>
+                <w:noProof/>
+                <w:webHidden/>
+              </w:rPr>
+            </w:r>
+            <w:r>
+              <w:rPr>
+                <w:noProof/>
+                <w:webHidden/>
+              </w:rPr>
               <w:fldChar w:fldCharType="separate"/>
-              <w:t>6</w:t>
+            </w:r>
+            <w:r>
+              <w:rPr>
+                <w:noProof/>
+                <w:webHidden/>
+              </w:rPr>
+              <w:t>7</w:t>
+            </w:r>
+            <w:r>
+              <w:rPr>
+                <w:noProof/>
+                <w:webHidden/>
+              </w:rPr>
               <w:fldChar w:fldCharType="end"/>
             </w:r>
           </w:hyperlink>
@@ -926,7 +1172,7 @@
               <w14:ligatures w14:val="standardContextual"/>
             </w:rPr>
           </w:pPr>
-          <w:hyperlink w:anchor="_Toc242882278" w:history="1">
+          <w:hyperlink w:anchor="_Toc242889703" w:history="1">
             <w:r>
               <w:rPr>
                 <w:rStyle w:val="Hyperlink"/>
@@ -961,10 +1207,46 @@
                 <w:webHidden/>
               </w:rPr>
               <w:tab/>
+            </w:r>
+            <w:r>
+              <w:rPr>
+                <w:noProof/>
+                <w:webHidden/>
+              </w:rPr>
               <w:fldChar w:fldCharType="begin"/>
-              <w:instrText xml:space="preserve"> PAGEREF _Toc242882278 \h </w:instrText>
+            </w:r>
+            <w:r>
+              <w:rPr>
+                <w:noProof/>
+                <w:webHidden/>
+              </w:rPr>
+              <w:instrText xml:space="preserve"> PAGEREF _Toc242889703 \h </w:instrText>
+            </w:r>
+            <w:r>
+              <w:rPr>
+                <w:noProof/>
+                <w:webHidden/>
+              </w:rPr>
+            </w:r>
+            <w:r>
+              <w:rPr>
+                <w:noProof/>
+                <w:webHidden/>
+              </w:rPr>
               <w:fldChar w:fldCharType="separate"/>
-              <w:t>6</w:t>
+            </w:r>
+            <w:r>
+              <w:rPr>
+                <w:noProof/>
+                <w:webHidden/>
+              </w:rPr>
+              <w:t>8</w:t>
+            </w:r>
+            <w:r>
+              <w:rPr>
+                <w:noProof/>
+                <w:webHidden/>
+              </w:rPr>
               <w:fldChar w:fldCharType="end"/>
             </w:r>
           </w:hyperlink>
@@ -984,7 +1266,7 @@
               <w14:ligatures w14:val="standardContextual"/>
             </w:rPr>
           </w:pPr>
-          <w:hyperlink w:anchor="_Toc242882279" w:history="1">
+          <w:hyperlink w:anchor="_Toc242889704" w:history="1">
             <w:r>
               <w:rPr>
                 <w:rStyle w:val="Hyperlink"/>
@@ -1019,10 +1301,46 @@
                 <w:webHidden/>
               </w:rPr>
               <w:tab/>
+            </w:r>
+            <w:r>
+              <w:rPr>
+                <w:noProof/>
+                <w:webHidden/>
+              </w:rPr>
               <w:fldChar w:fldCharType="begin"/>
-              <w:instrText xml:space="preserve"> PAGEREF _Toc242882279 \h </w:instrText>
+            </w:r>
+            <w:r>
+              <w:rPr>
+                <w:noProof/>
+                <w:webHidden/>
+              </w:rPr>
+              <w:instrText xml:space="preserve"> PAGEREF _Toc242889704 \h </w:instrText>
+            </w:r>
+            <w:r>
+              <w:rPr>
+                <w:noProof/>
+                <w:webHidden/>
+              </w:rPr>
+            </w:r>
+            <w:r>
+              <w:rPr>
+                <w:noProof/>
+                <w:webHidden/>
+              </w:rPr>
               <w:fldChar w:fldCharType="separate"/>
-              <w:t>8</w:t>
+            </w:r>
+            <w:r>
+              <w:rPr>
+                <w:noProof/>
+                <w:webHidden/>
+              </w:rPr>
+              <w:t>10</w:t>
+            </w:r>
+            <w:r>
+              <w:rPr>
+                <w:noProof/>
+                <w:webHidden/>
+              </w:rPr>
               <w:fldChar w:fldCharType="end"/>
             </w:r>
           </w:hyperlink>
@@ -1039,7 +1357,7 @@
               <w14:ligatures w14:val="standardContextual"/>
             </w:rPr>
           </w:pPr>
-          <w:hyperlink w:anchor="_Toc242882280" w:history="1">
+          <w:hyperlink w:anchor="_Toc242889705" w:history="1">
             <w:r>
               <w:rPr>
                 <w:rStyle w:val="Hyperlink"/>
@@ -1071,10 +1389,46 @@
                 <w:webHidden/>
               </w:rPr>
               <w:tab/>
+            </w:r>
+            <w:r>
+              <w:rPr>
+                <w:noProof/>
+                <w:webHidden/>
+              </w:rPr>
               <w:fldChar w:fldCharType="begin"/>
-              <w:instrText xml:space="preserve"> PAGEREF _Toc242882280 \h </w:instrText>
+            </w:r>
+            <w:r>
+              <w:rPr>
+                <w:noProof/>
+                <w:webHidden/>
+              </w:rPr>
+              <w:instrText xml:space="preserve"> PAGEREF _Toc242889705 \h </w:instrText>
+            </w:r>
+            <w:r>
+              <w:rPr>
+                <w:noProof/>
+                <w:webHidden/>
+              </w:rPr>
+            </w:r>
+            <w:r>
+              <w:rPr>
+                <w:noProof/>
+                <w:webHidden/>
+              </w:rPr>
               <w:fldChar w:fldCharType="separate"/>
-              <w:t>8</w:t>
+            </w:r>
+            <w:r>
+              <w:rPr>
+                <w:noProof/>
+                <w:webHidden/>
+              </w:rPr>
+              <w:t>10</w:t>
+            </w:r>
+            <w:r>
+              <w:rPr>
+                <w:noProof/>
+                <w:webHidden/>
+              </w:rPr>
               <w:fldChar w:fldCharType="end"/>
             </w:r>
           </w:hyperlink>
@@ -1091,7 +1445,7 @@
               <w14:ligatures w14:val="standardContextual"/>
             </w:rPr>
           </w:pPr>
-          <w:hyperlink w:anchor="_Toc242882281" w:history="1">
+          <w:hyperlink w:anchor="_Toc242889706" w:history="1">
             <w:r>
               <w:rPr>
                 <w:rStyle w:val="Hyperlink"/>
@@ -1123,10 +1477,46 @@
                 <w:webHidden/>
               </w:rPr>
               <w:tab/>
+            </w:r>
+            <w:r>
+              <w:rPr>
+                <w:noProof/>
+                <w:webHidden/>
+              </w:rPr>
               <w:fldChar w:fldCharType="begin"/>
-              <w:instrText xml:space="preserve"> PAGEREF _Toc242882281 \h </w:instrText>
+            </w:r>
+            <w:r>
+              <w:rPr>
+                <w:noProof/>
+                <w:webHidden/>
+              </w:rPr>
+              <w:instrText xml:space="preserve"> PAGEREF _Toc242889706 \h </w:instrText>
+            </w:r>
+            <w:r>
+              <w:rPr>
+                <w:noProof/>
+                <w:webHidden/>
+              </w:rPr>
+            </w:r>
+            <w:r>
+              <w:rPr>
+                <w:noProof/>
+                <w:webHidden/>
+              </w:rPr>
               <w:fldChar w:fldCharType="separate"/>
-              <w:t>8</w:t>
+            </w:r>
+            <w:r>
+              <w:rPr>
+                <w:noProof/>
+                <w:webHidden/>
+              </w:rPr>
+              <w:t>10</w:t>
+            </w:r>
+            <w:r>
+              <w:rPr>
+                <w:noProof/>
+                <w:webHidden/>
+              </w:rPr>
               <w:fldChar w:fldCharType="end"/>
             </w:r>
           </w:hyperlink>
@@ -1143,7 +1533,7 @@
               <w14:ligatures w14:val="standardContextual"/>
             </w:rPr>
           </w:pPr>
-          <w:hyperlink w:anchor="_Toc242882282" w:history="1">
+          <w:hyperlink w:anchor="_Toc242889707" w:history="1">
             <w:r>
               <w:rPr>
                 <w:rStyle w:val="Hyperlink"/>
@@ -1175,10 +1565,46 @@
                 <w:webHidden/>
               </w:rPr>
               <w:tab/>
+            </w:r>
+            <w:r>
+              <w:rPr>
+                <w:noProof/>
+                <w:webHidden/>
+              </w:rPr>
               <w:fldChar w:fldCharType="begin"/>
-              <w:instrText xml:space="preserve"> PAGEREF _Toc242882282 \h </w:instrText>
+            </w:r>
+            <w:r>
+              <w:rPr>
+                <w:noProof/>
+                <w:webHidden/>
+              </w:rPr>
+              <w:instrText xml:space="preserve"> PAGEREF _Toc242889707 \h </w:instrText>
+            </w:r>
+            <w:r>
+              <w:rPr>
+                <w:noProof/>
+                <w:webHidden/>
+              </w:rPr>
+            </w:r>
+            <w:r>
+              <w:rPr>
+                <w:noProof/>
+                <w:webHidden/>
+              </w:rPr>
               <w:fldChar w:fldCharType="separate"/>
-              <w:t>8</w:t>
+            </w:r>
+            <w:r>
+              <w:rPr>
+                <w:noProof/>
+                <w:webHidden/>
+              </w:rPr>
+              <w:t>10</w:t>
+            </w:r>
+            <w:r>
+              <w:rPr>
+                <w:noProof/>
+                <w:webHidden/>
+              </w:rPr>
               <w:fldChar w:fldCharType="end"/>
             </w:r>
           </w:hyperlink>
@@ -1195,7 +1621,7 @@
               <w14:ligatures w14:val="standardContextual"/>
             </w:rPr>
           </w:pPr>
-          <w:hyperlink w:anchor="_Toc242882283" w:history="1">
+          <w:hyperlink w:anchor="_Toc242889708" w:history="1">
             <w:r>
               <w:rPr>
                 <w:rStyle w:val="Hyperlink"/>
@@ -1227,10 +1653,46 @@
                 <w:webHidden/>
               </w:rPr>
               <w:tab/>
+            </w:r>
+            <w:r>
+              <w:rPr>
+                <w:noProof/>
+                <w:webHidden/>
+              </w:rPr>
               <w:fldChar w:fldCharType="begin"/>
-              <w:instrText xml:space="preserve"> PAGEREF _Toc242882283 \h </w:instrText>
+            </w:r>
+            <w:r>
+              <w:rPr>
+                <w:noProof/>
+                <w:webHidden/>
+              </w:rPr>
+              <w:instrText xml:space="preserve"> PAGEREF _Toc242889708 \h </w:instrText>
+            </w:r>
+            <w:r>
+              <w:rPr>
+                <w:noProof/>
+                <w:webHidden/>
+              </w:rPr>
+            </w:r>
+            <w:r>
+              <w:rPr>
+                <w:noProof/>
+                <w:webHidden/>
+              </w:rPr>
               <w:fldChar w:fldCharType="separate"/>
-              <w:t>12</w:t>
+            </w:r>
+            <w:r>
+              <w:rPr>
+                <w:noProof/>
+                <w:webHidden/>
+              </w:rPr>
+              <w:t>14</w:t>
+            </w:r>
+            <w:r>
+              <w:rPr>
+                <w:noProof/>
+                <w:webHidden/>
+              </w:rPr>
               <w:fldChar w:fldCharType="end"/>
             </w:r>
           </w:hyperlink>
@@ -1247,7 +1709,7 @@
               <w14:ligatures w14:val="standardContextual"/>
             </w:rPr>
           </w:pPr>
-          <w:hyperlink w:anchor="_Toc242882284" w:history="1">
+          <w:hyperlink w:anchor="_Toc242889709" w:history="1">
             <w:r>
               <w:rPr>
                 <w:rStyle w:val="Hyperlink"/>
@@ -1279,10 +1741,46 @@
                 <w:webHidden/>
               </w:rPr>
               <w:tab/>
+            </w:r>
+            <w:r>
+              <w:rPr>
+                <w:noProof/>
+                <w:webHidden/>
+              </w:rPr>
               <w:fldChar w:fldCharType="begin"/>
-              <w:instrText xml:space="preserve"> PAGEREF _Toc242882284 \h </w:instrText>
+            </w:r>
+            <w:r>
+              <w:rPr>
+                <w:noProof/>
+                <w:webHidden/>
+              </w:rPr>
+              <w:instrText xml:space="preserve"> PAGEREF _Toc242889709 \h </w:instrText>
+            </w:r>
+            <w:r>
+              <w:rPr>
+                <w:noProof/>
+                <w:webHidden/>
+              </w:rPr>
+            </w:r>
+            <w:r>
+              <w:rPr>
+                <w:noProof/>
+                <w:webHidden/>
+              </w:rPr>
               <w:fldChar w:fldCharType="separate"/>
-              <w:t>13</w:t>
+            </w:r>
+            <w:r>
+              <w:rPr>
+                <w:noProof/>
+                <w:webHidden/>
+              </w:rPr>
+              <w:t>15</w:t>
+            </w:r>
+            <w:r>
+              <w:rPr>
+                <w:noProof/>
+                <w:webHidden/>
+              </w:rPr>
               <w:fldChar w:fldCharType="end"/>
             </w:r>
           </w:hyperlink>
@@ -1302,7 +1800,7 @@
               <w14:ligatures w14:val="standardContextual"/>
             </w:rPr>
           </w:pPr>
-          <w:hyperlink w:anchor="_Toc242882285" w:history="1">
+          <w:hyperlink w:anchor="_Toc242889710" w:history="1">
             <w:r>
               <w:rPr>
                 <w:rStyle w:val="Hyperlink"/>
@@ -1337,10 +1835,46 @@
                 <w:webHidden/>
               </w:rPr>
               <w:tab/>
+            </w:r>
+            <w:r>
+              <w:rPr>
+                <w:noProof/>
+                <w:webHidden/>
+              </w:rPr>
               <w:fldChar w:fldCharType="begin"/>
-              <w:instrText xml:space="preserve"> PAGEREF _Toc242882285 \h </w:instrText>
+            </w:r>
+            <w:r>
+              <w:rPr>
+                <w:noProof/>
+                <w:webHidden/>
+              </w:rPr>
+              <w:instrText xml:space="preserve"> PAGEREF _Toc242889710 \h </w:instrText>
+            </w:r>
+            <w:r>
+              <w:rPr>
+                <w:noProof/>
+                <w:webHidden/>
+              </w:rPr>
+            </w:r>
+            <w:r>
+              <w:rPr>
+                <w:noProof/>
+                <w:webHidden/>
+              </w:rPr>
               <w:fldChar w:fldCharType="separate"/>
-              <w:t>18</w:t>
+            </w:r>
+            <w:r>
+              <w:rPr>
+                <w:noProof/>
+                <w:webHidden/>
+              </w:rPr>
+              <w:t>20</w:t>
+            </w:r>
+            <w:r>
+              <w:rPr>
+                <w:noProof/>
+                <w:webHidden/>
+              </w:rPr>
               <w:fldChar w:fldCharType="end"/>
             </w:r>
           </w:hyperlink>
@@ -1357,7 +1891,7 @@
               <w14:ligatures w14:val="standardContextual"/>
             </w:rPr>
           </w:pPr>
-          <w:hyperlink w:anchor="_Toc242882286" w:history="1">
+          <w:hyperlink w:anchor="_Toc242889711" w:history="1">
             <w:r>
               <w:rPr>
                 <w:rStyle w:val="Hyperlink"/>
@@ -1389,10 +1923,46 @@
                 <w:webHidden/>
               </w:rPr>
               <w:tab/>
+            </w:r>
+            <w:r>
+              <w:rPr>
+                <w:noProof/>
+                <w:webHidden/>
+              </w:rPr>
               <w:fldChar w:fldCharType="begin"/>
-              <w:instrText xml:space="preserve"> PAGEREF _Toc242882286 \h </w:instrText>
+            </w:r>
+            <w:r>
+              <w:rPr>
+                <w:noProof/>
+                <w:webHidden/>
+              </w:rPr>
+              <w:instrText xml:space="preserve"> PAGEREF _Toc242889711 \h </w:instrText>
+            </w:r>
+            <w:r>
+              <w:rPr>
+                <w:noProof/>
+                <w:webHidden/>
+              </w:rPr>
+            </w:r>
+            <w:r>
+              <w:rPr>
+                <w:noProof/>
+                <w:webHidden/>
+              </w:rPr>
               <w:fldChar w:fldCharType="separate"/>
-              <w:t>18</w:t>
+            </w:r>
+            <w:r>
+              <w:rPr>
+                <w:noProof/>
+                <w:webHidden/>
+              </w:rPr>
+              <w:t>20</w:t>
+            </w:r>
+            <w:r>
+              <w:rPr>
+                <w:noProof/>
+                <w:webHidden/>
+              </w:rPr>
               <w:fldChar w:fldCharType="end"/>
             </w:r>
           </w:hyperlink>
@@ -1412,7 +1982,7 @@
               <w14:ligatures w14:val="standardContextual"/>
             </w:rPr>
           </w:pPr>
-          <w:hyperlink w:anchor="_Toc242882287" w:history="1">
+          <w:hyperlink w:anchor="_Toc242889712" w:history="1">
             <w:r>
               <w:rPr>
                 <w:rStyle w:val="Hyperlink"/>
@@ -1447,10 +2017,46 @@
                 <w:webHidden/>
               </w:rPr>
               <w:tab/>
+            </w:r>
+            <w:r>
+              <w:rPr>
+                <w:noProof/>
+                <w:webHidden/>
+              </w:rPr>
               <w:fldChar w:fldCharType="begin"/>
-              <w:instrText xml:space="preserve"> PAGEREF _Toc242882287 \h </w:instrText>
+            </w:r>
+            <w:r>
+              <w:rPr>
+                <w:noProof/>
+                <w:webHidden/>
+              </w:rPr>
+              <w:instrText xml:space="preserve"> PAGEREF _Toc242889712 \h </w:instrText>
+            </w:r>
+            <w:r>
+              <w:rPr>
+                <w:noProof/>
+                <w:webHidden/>
+              </w:rPr>
+            </w:r>
+            <w:r>
+              <w:rPr>
+                <w:noProof/>
+                <w:webHidden/>
+              </w:rPr>
               <w:fldChar w:fldCharType="separate"/>
-              <w:t>19</w:t>
+            </w:r>
+            <w:r>
+              <w:rPr>
+                <w:noProof/>
+                <w:webHidden/>
+              </w:rPr>
+              <w:t>22</w:t>
+            </w:r>
+            <w:r>
+              <w:rPr>
+                <w:noProof/>
+                <w:webHidden/>
+              </w:rPr>
               <w:fldChar w:fldCharType="end"/>
             </w:r>
           </w:hyperlink>
@@ -1476,7 +2082,7 @@
       <w:pPr>
         <w:pStyle w:val="Heading1"/>
       </w:pPr>
-      <w:bookmarkStart w:id="0" w:name="_Toc242882264"/>
+      <w:bookmarkStart w:id="0" w:name="_Toc242889692"/>
       <w:r>
         <w:lastRenderedPageBreak/>
         <w:t>About</w:t>
@@ -1487,7 +2093,7 @@
       <w:pPr>
         <w:pStyle w:val="Heading2"/>
       </w:pPr>
-      <w:bookmarkStart w:id="1" w:name="_Toc242882265"/>
+      <w:bookmarkStart w:id="1" w:name="_Toc242889693"/>
       <w:r>
         <w:t>Purpose</w:t>
       </w:r>
@@ -1500,14 +2106,14 @@
     </w:p>
     <w:p>
       <w:r>
-        <w:t xml:space="preserve">Descriptor Words are simple, readable structures that describe a pulse. R&amp;S Pulse Descriptor Words (PDW) can be used to generate pulsed signals in real-time or replay pre-calculated waveform segments. R&amp;S Timed Control Descriptor Words (TCDW) can be used to change instrument RF frequency and/or level or re-arm the Extended Sequencer.</w:t>
+        <w:t>Descriptor Words are simple, readable structures that describe a pulse. R&amp;S Pulse Descriptor Words (PDW) can be used to generate pulsed signals in real-time or replay pre-calculated waveform segments. R&amp;S Timed Control Descriptor Words (TCDW) can be used to change instrument RF frequency and/or level or re-arm the Extended Sequencer.</w:t>
       </w:r>
     </w:p>
     <w:p>
       <w:pPr>
         <w:pStyle w:val="Heading2"/>
       </w:pPr>
-      <w:bookmarkStart w:id="2" w:name="_Toc242882266"/>
+      <w:bookmarkStart w:id="2" w:name="_Toc242889694"/>
       <w:r>
         <w:t>Key Features</w:t>
       </w:r>
@@ -1522,7 +2128,7 @@
       <w:pPr>
         <w:pStyle w:val="Heading1"/>
       </w:pPr>
-      <w:bookmarkStart w:id="3" w:name="_Toc242882267"/>
+      <w:bookmarkStart w:id="3" w:name="_Toc242889695"/>
       <w:r>
         <w:t>Getting Started</w:t>
       </w:r>
@@ -1532,164 +2138,23 @@
       <w:pPr>
         <w:pStyle w:val="Heading2"/>
       </w:pPr>
-      <w:bookmarkStart w:id="4" w:name="_Toc242882268"/>
-      <w:r>
-        <w:t xml:space="preserve">Required Components</w:t>
+      <w:bookmarkStart w:id="4" w:name="_Toc242889696"/>
+      <w:r>
+        <w:t>Required Components</w:t>
       </w:r>
       <w:bookmarkEnd w:id="4"/>
     </w:p>
     <w:p>
       <w:r>
-        <w:t>On the PC running the script:</w:t>
-      </w:r>
-    </w:p>
-    <w:p>
-      <w:pPr>
-        <w:numPr>
-          <w:ilvl w:val="0"/>
-          <w:numId w:val="12"/>
-        </w:numPr>
-      </w:pPr>
-      <w:r>
-        <w:rPr>
-          <w:b/>
-          <w:bCs/>
-        </w:rPr>
-        <w:t xml:space="preserve">Python: </w:t>
-      </w:r>
-      <w:r>
-        <w:t xml:space="preserve">version 3.12 or later. Version 3.12 is recommended. Windows and Linux are supported.</w:t>
-      </w:r>
-    </w:p>
-    <w:p>
-      <w:pPr>
-        <w:numPr>
-          <w:ilvl w:val="0"/>
-          <w:numId w:val="12"/>
-        </w:numPr>
-      </w:pPr>
-      <w:r>
-        <w:rPr>
-          <w:b/>
-          <w:bCs/>
-        </w:rPr>
-        <w:t xml:space="preserve">Python packages: </w:t>
-      </w:r>
-      <w:r>
-        <w:t xml:space="preserve">listed in requirements.txt. The setup scripts install these automatically. Please reference the installation instructions in Section 2.3 for more details.</w:t>
-      </w:r>
-    </w:p>
-    <w:p>
-      <w:pPr>
-        <w:numPr>
-          <w:ilvl w:val="1"/>
-          <w:numId w:val="12"/>
-        </w:numPr>
-      </w:pPr>
-      <w:r>
-        <w:rPr>
-          <w:b/>
-          <w:bCs/>
-        </w:rPr>
-        <w:t xml:space="preserve">rsxdwstreaming 2.0.0: </w:t>
-      </w:r>
-      <w:r>
-        <w:t xml:space="preserve">the package file (wheel) for PDW Expert. It is included in the repository.</w:t>
-      </w:r>
-    </w:p>
-    <w:p>
-      <w:pPr>
-        <w:numPr>
-          <w:ilvl w:val="1"/>
-          <w:numId w:val="12"/>
-        </w:numPr>
-      </w:pPr>
-      <w:r>
-        <w:rPr>
-          <w:b/>
-          <w:bCs/>
-        </w:rPr>
-        <w:t xml:space="preserve">numpy 2.5.3: </w:t>
-      </w:r>
-      <w:r>
-        <w:t xml:space="preserve">used for numeric operations.</w:t>
-      </w:r>
-    </w:p>
-    <w:p>
-      <w:pPr>
-        <w:numPr>
-          <w:ilvl w:val="1"/>
-          <w:numId w:val="12"/>
-        </w:numPr>
-      </w:pPr>
-      <w:r>
-        <w:rPr>
-          <w:b/>
-          <w:bCs/>
-        </w:rPr>
-        <w:t xml:space="preserve">rskfd 0.7.2: </w:t>
-      </w:r>
-      <w:r>
-        <w:t xml:space="preserve">instrument and data handling, including reading and writing R&amp;S waveform (.wv) files. Documentation: https://pypi.org/project/rskfd/</w:t>
-      </w:r>
-    </w:p>
-    <w:p>
-      <w:pPr>
-        <w:numPr>
-          <w:ilvl w:val="1"/>
-          <w:numId w:val="12"/>
-        </w:numPr>
-      </w:pPr>
-      <w:r>
-        <w:rPr>
-          <w:b/>
-          <w:bCs/>
-        </w:rPr>
-        <w:t xml:space="preserve">bitstring, below version 5: </w:t>
-      </w:r>
-      <w:r>
-        <w:t xml:space="preserve">used by rsxdwstreaming. Version 5 and later do not work with rsxdwstreaming 2.0.0.</w:t>
-      </w:r>
-    </w:p>
-    <w:p>
-      <w:pPr>
-        <w:numPr>
-          <w:ilvl w:val="1"/>
-          <w:numId w:val="12"/>
-        </w:numPr>
-      </w:pPr>
-      <w:r>
-        <w:rPr>
-          <w:b/>
-          <w:bCs/>
-        </w:rPr>
-        <w:t xml:space="preserve">PyQt6: </w:t>
-      </w:r>
-      <w:r>
-        <w:t xml:space="preserve">provides the GUI.</w:t>
-      </w:r>
-    </w:p>
-    <w:p>
-      <w:pPr>
-        <w:numPr>
-          <w:ilvl w:val="0"/>
-          <w:numId w:val="12"/>
-        </w:numPr>
-      </w:pPr>
-      <w:r>
-        <w:rPr>
-          <w:b/>
-          <w:bCs/>
-        </w:rPr>
-        <w:t xml:space="preserve">LAN connection to the SMW200A: </w:t>
-      </w:r>
-      <w:r>
-        <w:t xml:space="preserve">needed only for the SMW Playback and Multi-Sequencer tabs.</w:t>
-      </w:r>
-    </w:p>
-    <w:p>
-      <w:r>
-        <w:t xml:space="preserve">On the SMW200A:</w:t>
+        <w:t xml:space="preserve">On </w:t>
+      </w:r>
+      <w:proofErr w:type="gramStart"/>
+      <w:r>
+        <w:t>the SMW200A</w:t>
+      </w:r>
+      <w:proofErr w:type="gramEnd"/>
+      <w:r>
+        <w:t>:</w:t>
       </w:r>
     </w:p>
     <w:p>
@@ -1812,7 +2277,6 @@
           <w:b/>
           <w:bCs/>
         </w:rPr>
-        <w:lastRenderedPageBreak/>
         <w:t>SMW-K504</w:t>
       </w:r>
       <w:r>
@@ -1940,15 +2404,16 @@
       <w:pPr>
         <w:pStyle w:val="Heading2"/>
       </w:pPr>
-      <w:bookmarkStart w:id="5" w:name="_Toc242882269"/>
-      <w:r>
+      <w:bookmarkStart w:id="5" w:name="_Toc242889697"/>
+      <w:r>
+        <w:lastRenderedPageBreak/>
         <w:t>What’s Included</w:t>
       </w:r>
       <w:bookmarkEnd w:id="5"/>
     </w:p>
     <w:p>
       <w:r>
-        <w:t xml:space="preserve">The repository contains the following important files:</w:t>
+        <w:t>The repository contains the following important files:</w:t>
       </w:r>
     </w:p>
     <w:p>
@@ -1963,7 +2428,7 @@
           <w:b/>
           <w:bCs/>
         </w:rPr>
-        <w:t xml:space="preserve">xdw_file_playback.py</w:t>
+        <w:t>xdw_file_playback.py</w:t>
       </w:r>
       <w:r>
         <w:t xml:space="preserve"> – the script a user runs to start the GUI and generate the files needed for import into the SMW200A. The output files are named after the Output base name entered in the GUI (by default, the name of the selected .csv file):</w:t>
@@ -1981,7 +2446,7 @@
           <w:b/>
           <w:bCs/>
         </w:rPr>
-        <w:t xml:space="preserve">*.ps_def</w:t>
+        <w:t>*.ps_def</w:t>
       </w:r>
       <w:r>
         <w:t xml:space="preserve"> – contains the PDWs and TCDWs. This file is always generated.</w:t>
@@ -1999,7 +2464,7 @@
           <w:b/>
           <w:bCs/>
         </w:rPr>
-        <w:t xml:space="preserve">*.ps_adr</w:t>
+        <w:t>*.ps_adr</w:t>
       </w:r>
       <w:r>
         <w:t xml:space="preserve"> – contains the addresses of the waveform segments addressed by arb PDWs. This file is generated only when arb PDWs are included.</w:t>
@@ -2017,7 +2482,7 @@
           <w:b/>
           <w:bCs/>
         </w:rPr>
-        <w:t xml:space="preserve">*.wv</w:t>
+        <w:t>*.wv</w:t>
       </w:r>
       <w:r>
         <w:t xml:space="preserve"> – the container waveform holding all ARB waveform segments. This file is generated only when arb PDWs are included.</w:t>
@@ -2035,7 +2500,7 @@
           <w:b/>
           <w:bCs/>
         </w:rPr>
-        <w:t xml:space="preserve">xdw_pdw_gui.py, smw_playback_tabs.py, smw_control.py, create_pulse.py</w:t>
+        <w:t>xdw_pdw_gui.py, smw_playback_tabs.py, smw_control.py, create_pulse.py</w:t>
       </w:r>
       <w:r>
         <w:t xml:space="preserve"> – the GUI and instrument control code used by xdw_file_playback.py.</w:t>
@@ -2053,7 +2518,7 @@
           <w:b/>
           <w:bCs/>
         </w:rPr>
-        <w:t xml:space="preserve">setup_windows.ps1, setup_linux.sh, requirements.txt</w:t>
+        <w:t>setup_windows.ps1, setup_linux.sh, requirements.txt</w:t>
       </w:r>
       <w:r>
         <w:t xml:space="preserve"> – set up the Python environment (Section 2.3).</w:t>
@@ -2071,7 +2536,7 @@
           <w:b/>
           <w:bCs/>
         </w:rPr>
-        <w:t xml:space="preserve">build_exe.py</w:t>
+        <w:t>build_exe.py</w:t>
       </w:r>
       <w:r>
         <w:t xml:space="preserve"> – packages the GUI into a standalone xdw_pdw_gui.exe for users who do not have Python installed (Section 2.3).</w:t>
@@ -2085,7 +2550,7 @@
         </w:numPr>
       </w:pPr>
       <w:r>
-        <w:t xml:space="preserve">Example PDW lists with PDWs and TCDWs:</w:t>
+        <w:t>Example PDW lists with PDWs and TCDWs:</w:t>
       </w:r>
     </w:p>
     <w:p>
@@ -2100,7 +2565,7 @@
           <w:b/>
           <w:bCs/>
         </w:rPr>
-        <w:t xml:space="preserve">PDWlist.csv</w:t>
+        <w:t>PDWlist.csv</w:t>
       </w:r>
       <w:r>
         <w:t xml:space="preserve"> – contains arb PDWs.</w:t>
@@ -2118,7 +2583,7 @@
           <w:b/>
           <w:bCs/>
         </w:rPr>
-        <w:t xml:space="preserve">PDWlist_verif.csv</w:t>
+        <w:t>PDWlist_verif.csv</w:t>
       </w:r>
       <w:r>
         <w:t xml:space="preserve"> – does not contain arb PDWs.</w:t>
@@ -2136,7 +2601,7 @@
           <w:b/>
           <w:bCs/>
         </w:rPr>
-        <w:t xml:space="preserve">PDWlist_RF_B.csv</w:t>
+        <w:t>PDWlist_RF_B.csv</w:t>
       </w:r>
       <w:r>
         <w:t xml:space="preserve"> – the same as PDWlist.csv, but its TCDWs set path 1 (RF B). For use with the Multi-Sequencer tab.</w:t>
@@ -2154,7 +2619,7 @@
           <w:b/>
           <w:bCs/>
         </w:rPr>
-        <w:t xml:space="preserve">pulse1.wv, pulse2.wv</w:t>
+        <w:t>pulse1.wv, pulse2.wv</w:t>
       </w:r>
       <w:r>
         <w:t xml:space="preserve"> – example ARB waveform segments used by PDWlist.csv.</w:t>
@@ -2172,7 +2637,7 @@
           <w:b/>
           <w:bCs/>
         </w:rPr>
-        <w:t xml:space="preserve">rsxdwstreaming-2.0.0-py2.py3-none-any.whl</w:t>
+        <w:t>rsxdwstreaming-2.0.0-py2.py3-none-any.whl</w:t>
       </w:r>
       <w:r>
         <w:t xml:space="preserve"> – the package file (wheel) for PDW Expert.</w:t>
@@ -2190,7 +2655,7 @@
           <w:b/>
           <w:bCs/>
         </w:rPr>
-        <w:t xml:space="preserve">ICD_PDW_TCDW_rev2.4.pdf</w:t>
+        <w:t>ICD_PDW_TCDW_rev2.4.pdf</w:t>
       </w:r>
       <w:r>
         <w:t xml:space="preserve"> – the K503/-K504 PDW and TCDW interface control document (ICD).</w:t>
@@ -2208,7 +2673,7 @@
           <w:b/>
           <w:bCs/>
         </w:rPr>
-        <w:t xml:space="preserve">doc</w:t>
+        <w:t>doc</w:t>
       </w:r>
       <w:r>
         <w:t xml:space="preserve"> directory – HTML documentation for the rsxdwstreaming package.</w:t>
@@ -2221,7 +2686,7 @@
       <w:bookmarkStart w:id="6" w:name="_Ref176511377"/>
       <w:bookmarkStart w:id="7" w:name="_Ref176511378"/>
       <w:bookmarkStart w:id="8" w:name="_Ref176511416"/>
-      <w:bookmarkStart w:id="9" w:name="_Toc242882270"/>
+      <w:bookmarkStart w:id="9" w:name="_Toc242889698"/>
       <w:r>
         <w:t>Installation Instructions</w:t>
       </w:r>
@@ -2234,10 +2699,11 @@
       <w:pPr>
         <w:pStyle w:val="Heading3"/>
       </w:pPr>
-      <w:bookmarkStart w:id="10" w:name="_Toc242882271"/>
+      <w:bookmarkStart w:id="10" w:name="_Toc242889699"/>
       <w:r>
         <w:t>Automatic Setup</w:t>
       </w:r>
+      <w:bookmarkEnd w:id="10"/>
     </w:p>
     <w:p>
       <w:pPr>
@@ -2270,7 +2736,7 @@
       <w:r>
         <w:t xml:space="preserve">Download Python 3.12 from </w:t>
       </w:r>
-      <w:hyperlink r:id="rId12" w:history="1">
+      <w:hyperlink r:id="rId10" w:history="1">
         <w:r>
           <w:rPr>
             <w:rStyle w:val="Hyperlink"/>
@@ -2303,7 +2769,7 @@
         </w:numPr>
       </w:pPr>
       <w:r>
-        <w:t xml:space="preserve">If the Python installer is blocked on your PC, the uv tool (https://docs.astral.sh/uv/) can install Python without it:</w:t>
+        <w:t>If the Python installer is blocked on your PC, the uv tool (https://docs.astral.sh/uv/) can install Python without it:</w:t>
       </w:r>
     </w:p>
     <w:p>
@@ -2315,7 +2781,7 @@
         </w:numPr>
       </w:pPr>
       <w:r>
-        <w:t xml:space="preserve">uv python install 3.12</w:t>
+        <w:t>uv python install 3.12</w:t>
       </w:r>
     </w:p>
     <w:p>
@@ -2339,7 +2805,6 @@
         </w:numPr>
       </w:pPr>
       <w:r>
-        <w:lastRenderedPageBreak/>
         <w:t>Open the repository folder in File Explorer.</w:t>
       </w:r>
     </w:p>
@@ -2352,6 +2817,7 @@
         </w:numPr>
       </w:pPr>
       <w:r>
+        <w:lastRenderedPageBreak/>
         <w:t>Right-click an empty area and select "Open in Terminal".</w:t>
       </w:r>
     </w:p>
@@ -2385,7 +2851,7 @@
         <w:ind w:left="720"/>
       </w:pPr>
       <w:r>
-        <w:t xml:space="preserve">If Python was installed with uv, run this instead:</w:t>
+        <w:t>If Python was installed with uv, run this instead:</w:t>
       </w:r>
     </w:p>
     <w:p>
@@ -2398,7 +2864,7 @@
         <w:ind w:left="1145"/>
       </w:pPr>
       <w:r>
-        <w:t xml:space="preserve">powershell -ExecutionPolicy Bypass -File .\setup_windows.ps1 -Python "$(uv python find 3.12)"</w:t>
+        <w:t>powershell -ExecutionPolicy Bypass -File .\setup_windows.ps1 -Python "$(uv python find 3.12)"</w:t>
       </w:r>
     </w:p>
     <w:p>
@@ -2423,7 +2889,7 @@
         </w:numPr>
       </w:pPr>
       <w:r>
-        <w:t xml:space="preserve">Start the GUI</w:t>
+        <w:t>Start the GUI</w:t>
       </w:r>
     </w:p>
     <w:p>
@@ -2461,7 +2927,7 @@
         </w:numPr>
       </w:pPr>
       <w:r>
-        <w:t xml:space="preserve">Install Python 3.12 or later and the venv module</w:t>
+        <w:t>Install Python 3.12 or later and the venv module</w:t>
       </w:r>
     </w:p>
     <w:p>
@@ -2474,7 +2940,7 @@
         <w:ind w:left="720"/>
       </w:pPr>
       <w:r>
-        <w:t xml:space="preserve">Use your distribution's package manager. For example, on Debian or Ubuntu:</w:t>
+        <w:t>Use your distribution's package manager. For example, on Debian or Ubuntu:</w:t>
       </w:r>
     </w:p>
     <w:p>
@@ -2487,7 +2953,7 @@
         <w:ind w:left="720" w:firstLine="130"/>
       </w:pPr>
       <w:r>
-        <w:t xml:space="preserve">sudo apt install python3 python3-venv</w:t>
+        <w:t>sudo apt install python3 python3-venv</w:t>
       </w:r>
     </w:p>
     <w:p>
@@ -2500,7 +2966,7 @@
         <w:ind w:left="720"/>
       </w:pPr>
       <w:r>
-        <w:t xml:space="preserve">If your distribution does not package Python 3.12 or later, the uv tool (https://docs.astral.sh/uv/) can install it:</w:t>
+        <w:t>If your distribution does not package Python 3.12 or later, the uv tool (https://docs.astral.sh/uv/) can install it:</w:t>
       </w:r>
     </w:p>
     <w:p>
@@ -2508,7 +2974,7 @@
         <w:ind w:left="425" w:firstLine="425"/>
       </w:pPr>
       <w:r>
-        <w:t xml:space="preserve">uv python install 3.12</w:t>
+        <w:t>uv python install 3.12</w:t>
       </w:r>
     </w:p>
     <w:p>
@@ -2546,9 +3012,13 @@
     <w:p>
       <w:r>
         <w:t xml:space="preserve">  </w:t>
+      </w:r>
+      <w:r>
         <w:tab/>
+      </w:r>
+      <w:r>
         <w:tab/>
-        <w:t xml:space="preserve">If Python was installed with uv, run this instead:</w:t>
+        <w:t>If Python was installed with uv, run this instead:</w:t>
       </w:r>
     </w:p>
     <w:p>
@@ -2556,7 +3026,7 @@
         <w:ind w:left="425" w:firstLine="425"/>
       </w:pPr>
       <w:r>
-        <w:t xml:space="preserve">PYTHON="$(uv python find 3.12)" ./setup_linux.sh</w:t>
+        <w:t>PYTHON="$(uv python find 3.12)" ./setup_linux.sh</w:t>
       </w:r>
     </w:p>
     <w:p>
@@ -2564,7 +3034,7 @@
         <w:ind w:left="850" w:firstLine="5"/>
       </w:pPr>
       <w:r>
-        <w:t xml:space="preserve">The script creates a Python virtual environment in a folder named .venv and installs all required packages into it. It prints "Setup complete" when finished. You only need to run it once.</w:t>
+        <w:t>The script creates a Python virtual environment in a folder named .venv and installs all required packages into it. It prints "Setup complete" when finished. You only need to run it once.</w:t>
       </w:r>
     </w:p>
     <w:p>
@@ -2601,7 +3071,7 @@
     </w:p>
     <w:p>
       <w:r>
-        <w:t xml:space="preserve">sudo apt install libxcb-cursor0</w:t>
+        <w:t>sudo apt install libxcb-cursor0</w:t>
       </w:r>
     </w:p>
     <w:p/>
@@ -2615,7 +3085,7 @@
     </w:p>
     <w:p>
       <w:r>
-        <w:t xml:space="preserve">The GUI can be packaged into a single xdw_pdw_gui.exe file. Users without Python can then run it. The build must be run on Windows, using the Python environment created by the installation instructions above.</w:t>
+        <w:t>The GUI can be packaged into a single xdw_pdw_gui.exe file. Users without Python can then run it. The build must be run on Windows, using the Python environment created by the installation instructions above.</w:t>
       </w:r>
     </w:p>
     <w:p/>
@@ -2628,6 +3098,7 @@
         </w:numPr>
       </w:pPr>
       <w:r>
+        <w:lastRenderedPageBreak/>
         <w:t>Set up the Python environment</w:t>
       </w:r>
     </w:p>
@@ -2684,7 +3155,7 @@
         </w:numPr>
       </w:pPr>
       <w:r>
-        <w:t xml:space="preserve">Install PyInstaller</w:t>
+        <w:t>Install PyInstaller</w:t>
       </w:r>
     </w:p>
     <w:p>
@@ -2692,7 +3163,7 @@
         <w:ind w:left="720"/>
       </w:pPr>
       <w:r>
-        <w:t xml:space="preserve">.venv\Scripts\python.exe -m pip install pyinstaller</w:t>
+        <w:t>.venv\Scripts\python.exe -m pip install pyinstaller</w:t>
       </w:r>
     </w:p>
     <w:p>
@@ -2718,6 +3189,8 @@
     <w:p>
       <w:r>
         <w:t xml:space="preserve">      </w:t>
+      </w:r>
+      <w:r>
         <w:tab/>
         <w:t xml:space="preserve">     The build takes a few minutes. When it finishes, the executable is at dist\xdw_pdw_gui.exe.</w:t>
       </w:r>
@@ -2744,7 +3217,7 @@
         <w:ind w:left="720"/>
       </w:pPr>
       <w:r>
-        <w:t xml:space="preserve">Copy dist\xdw_pdw_gui.exe to any location or PC and double-click it to run. Each launch takes several seconds while the program unpacks itself.</w:t>
+        <w:t>Copy dist\xdw_pdw_gui.exe to any location or PC and double-click it to run. Each launch takes several seconds while the program unpacks itself.</w:t>
       </w:r>
     </w:p>
     <w:p>
@@ -2761,7 +3234,7 @@
         </w:numPr>
       </w:pPr>
       <w:r>
-        <w:t xml:space="preserve">Antivirus software flags or blocks the .exe. Some antivirus software flags single-file builds like this one. To avoid it:</w:t>
+        <w:t>Antivirus software flags or blocks the .exe. Some antivirus software flags single-file builds like this one. To avoid it:</w:t>
       </w:r>
     </w:p>
     <w:p>
@@ -2793,7 +3266,7 @@
         <w:ind w:left="1565"/>
       </w:pPr>
       <w:r>
-        <w:t xml:space="preserve">This creates a dist\xdw_pdw_gui folder instead of a single file. Share the whole folder and run xdw_pdw_gui.exe inside it.</w:t>
+        <w:t>This creates a dist\xdw_pdw_gui folder instead of a single file. Share the whole folder and run xdw_pdw_gui.exe inside it.</w:t>
       </w:r>
     </w:p>
     <w:p/>
@@ -2854,7 +3327,7 @@
         </w:numPr>
       </w:pPr>
       <w:r>
-        <w:t xml:space="preserve">The build fails with "PermissionError: [WinError 5] Access is denied: ...\dist\xdw_pdw_gui.exe". The previous xdw_pdw_gui.exe is still running or open, so the build cannot replace it. To fix it:</w:t>
+        <w:t>The build fails with "PermissionError: [WinError 5] Access is denied: ...\dist\xdw_pdw_gui.exe". The previous xdw_pdw_gui.exe is still running or open, so the build cannot replace it. To fix it:</w:t>
       </w:r>
     </w:p>
     <w:p>
@@ -2866,7 +3339,7 @@
         </w:numPr>
       </w:pPr>
       <w:r>
-        <w:t xml:space="preserve">Close every running copy of xdw_pdw_gui.exe.</w:t>
+        <w:t>Close every running copy of xdw_pdw_gui.exe.</w:t>
       </w:r>
     </w:p>
     <w:p>
@@ -2878,7 +3351,7 @@
         </w:numPr>
       </w:pPr>
       <w:r>
-        <w:t xml:space="preserve">Delete dist\xdw_pdw_gui.exe.</w:t>
+        <w:t>Delete dist\xdw_pdw_gui.exe.</w:t>
       </w:r>
     </w:p>
     <w:p>
@@ -2890,20 +3363,22 @@
         </w:numPr>
       </w:pPr>
       <w:r>
-        <w:t xml:space="preserve">Rebuild.</w:t>
+        <w:t>Rebuild.</w:t>
       </w:r>
     </w:p>
     <w:p>
       <w:pPr>
         <w:pStyle w:val="Heading3"/>
       </w:pPr>
+      <w:bookmarkStart w:id="11" w:name="_Toc242889700"/>
       <w:r>
         <w:t>Manual Setup</w:t>
       </w:r>
-    </w:p>
-    <w:p>
-      <w:r>
-        <w:t xml:space="preserve">If the setup scripts have issues, create the environment manually. Python 3.12 or later is required. Open a terminal in the repository folder and run the commands for your operating system.</w:t>
+      <w:bookmarkEnd w:id="11"/>
+    </w:p>
+    <w:p>
+      <w:r>
+        <w:t>If the setup scripts have issues, create the environment manually. Python 3.12 or later is required. Open a terminal in the repository folder and run the commands for your operating system.</w:t>
       </w:r>
     </w:p>
     <w:p>
@@ -2912,7 +3387,7 @@
           <w:b/>
           <w:bCs/>
         </w:rPr>
-        <w:t xml:space="preserve">Windows:</w:t>
+        <w:t>Windows:</w:t>
       </w:r>
     </w:p>
     <w:p>
@@ -2920,7 +3395,7 @@
         <w:ind w:left="425" w:firstLine="425"/>
       </w:pPr>
       <w:r>
-        <w:t xml:space="preserve">python -m venv .venv</w:t>
+        <w:t>python -m venv .venv</w:t>
       </w:r>
     </w:p>
     <w:p>
@@ -2928,7 +3403,7 @@
         <w:ind w:left="425" w:firstLine="425"/>
       </w:pPr>
       <w:r>
-        <w:t xml:space="preserve">.venv\Scripts\python.exe -m pip install -r requirements.txt</w:t>
+        <w:t>.venv\Scripts\python.exe -m pip install -r requirements.txt</w:t>
       </w:r>
     </w:p>
     <w:p>
@@ -2937,7 +3412,8 @@
           <w:b/>
           <w:bCs/>
         </w:rPr>
-        <w:t xml:space="preserve">Linux:</w:t>
+        <w:lastRenderedPageBreak/>
+        <w:t>Linux:</w:t>
       </w:r>
     </w:p>
     <w:p>
@@ -2945,7 +3421,7 @@
         <w:ind w:left="425" w:firstLine="425"/>
       </w:pPr>
       <w:r>
-        <w:t xml:space="preserve">python3 -m venv .venv</w:t>
+        <w:t>python3 -m venv .venv</w:t>
       </w:r>
     </w:p>
     <w:p>
@@ -2953,23 +3429,23 @@
         <w:ind w:left="425" w:firstLine="425"/>
       </w:pPr>
       <w:r>
-        <w:t xml:space="preserve">.venv/bin/python -m pip install -r requirements.txt</w:t>
-      </w:r>
-    </w:p>
-    <w:p>
-      <w:r>
-        <w:t xml:space="preserve">requirements.txt lists the exact package versions: rsxdwstreaming 2.0.0 (the included wheel), numpy 2.5.3, rskfd 0.7.2, bitstring below version 5, and PyQt6. Do not install bitstring 5 or later; rsxdwstreaming 2.0.0 does not work with it. For more information on the rsxdwstreaming package, see doc/getting_started.html.</w:t>
+        <w:t>.venv/bin/python -m pip install -r requirements.txt</w:t>
+      </w:r>
+    </w:p>
+    <w:p>
+      <w:r>
+        <w:t>requirements.txt lists the exact package versions: rsxdwstreaming 2.0.0 (the included wheel), numpy 2.5.3, rskfd 0.7.2, bitstring below version 5, and PyQt6. Do not install bitstring 5 or later; rsxdwstreaming 2.0.0 does not work with it. For more information on the rsxdwstreaming package, see doc/getting_started.html.</w:t>
       </w:r>
     </w:p>
     <w:p>
       <w:pPr>
         <w:pStyle w:val="Heading2"/>
       </w:pPr>
-      <w:bookmarkStart w:id="15" w:name="_Toc242882276"/>
+      <w:bookmarkStart w:id="12" w:name="_Toc242889701"/>
       <w:r>
         <w:t>Overview of Operation</w:t>
       </w:r>
-      <w:bookmarkEnd w:id="15"/>
+      <w:bookmarkEnd w:id="12"/>
     </w:p>
     <w:p>
       <w:r>
@@ -2984,7 +3460,6 @@
         <w:rPr>
           <w:noProof/>
         </w:rPr>
-        <w:lastRenderedPageBreak/>
         <w:drawing>
           <wp:inline distT="0" distB="0" distL="0" distR="0" wp14:anchorId="3566FC72" wp14:editId="0047E087">
             <wp:extent cx="6138545" cy="1148080"/>
@@ -3003,7 +3478,7 @@
                     </pic:cNvPicPr>
                   </pic:nvPicPr>
                   <pic:blipFill>
-                    <a:blip r:embed="rId14" cstate="print">
+                    <a:blip r:embed="rId11" cstate="print">
                       <a:extLst>
                         <a:ext uri="{28A0092B-C50C-407E-A947-70E740481C1C}">
                           <a14:useLocalDpi xmlns:a14="http://schemas.microsoft.com/office/drawing/2010/main" val="0"/>
@@ -3047,29 +3522,39 @@
       </w:pPr>
       <w:r>
         <w:t xml:space="preserve">Figure </w:t>
+      </w:r>
+      <w:fldSimple w:instr=" SEQ Figure \* ARABIC ">
+        <w:r>
+          <w:rPr>
+            <w:noProof/>
+          </w:rPr>
+          <w:t>1</w:t>
+        </w:r>
+      </w:fldSimple>
+      <w:r>
+        <w:t>: Typical Flow</w:t>
+      </w:r>
+    </w:p>
+    <w:p>
+      <w:r>
+        <w:t xml:space="preserve">Further details on each of these processes are described in Section </w:t>
+      </w:r>
+      <w:r>
         <w:fldChar w:fldCharType="begin"/>
-        <w:instrText xml:space="preserve"> SEQ Figure \* ARABIC </w:instrText>
+      </w:r>
+      <w:r>
+        <w:instrText xml:space="preserve"> REF _Ref176515172 \n \h </w:instrText>
+      </w:r>
+      <w:r>
         <w:fldChar w:fldCharType="separate"/>
       </w:r>
       <w:r>
-        <w:rPr>
-          <w:noProof/>
-        </w:rPr>
-        <w:t>1</w:t>
+        <w:t>4</w:t>
       </w:r>
       <w:r>
         <w:fldChar w:fldCharType="end"/>
-        <w:t>: Typical Flow</w:t>
-      </w:r>
-    </w:p>
-    <w:p>
-      <w:r>
-        <w:t xml:space="preserve">Further details on each of these processes are described in Section </w:t>
-        <w:fldChar w:fldCharType="begin"/>
-        <w:instrText xml:space="preserve"> REF _Ref176515172 \n \h </w:instrText>
-        <w:fldChar w:fldCharType="separate"/>
-        <w:t>4</w:t>
-        <w:fldChar w:fldCharType="end"/>
+      </w:r>
+      <w:r>
         <w:t xml:space="preserve">. </w:t>
       </w:r>
     </w:p>
@@ -3077,17 +3562,17 @@
       <w:pPr>
         <w:pStyle w:val="Heading2"/>
       </w:pPr>
-      <w:bookmarkStart w:id="16" w:name="_Toc242882277"/>
+      <w:bookmarkStart w:id="13" w:name="_Toc242889702"/>
       <w:r>
         <w:t>References</w:t>
       </w:r>
-      <w:bookmarkEnd w:id="16"/>
+      <w:bookmarkEnd w:id="13"/>
     </w:p>
     <w:p>
       <w:r>
         <w:t xml:space="preserve">SMW200A User Manual: </w:t>
       </w:r>
-      <w:hyperlink r:id="rId15" w:history="1">
+      <w:hyperlink r:id="rId12" w:history="1">
         <w:r>
           <w:rPr>
             <w:rStyle w:val="Hyperlink"/>
@@ -3100,7 +3585,7 @@
       <w:r>
         <w:t xml:space="preserve">SMW200A K503 Extended Sequencer User Manual: </w:t>
       </w:r>
-      <w:hyperlink r:id="rId16" w:history="1">
+      <w:hyperlink r:id="rId13" w:history="1">
         <w:r>
           <w:rPr>
             <w:rStyle w:val="Hyperlink"/>
@@ -3111,7 +3596,7 @@
     </w:p>
     <w:p>
       <w:r>
-        <w:t xml:space="preserve">K503/-K504 PDW and TCDW ICD: ICD_PDW_TCDW_rev2.4.pdf, included in the repository.</w:t>
+        <w:t>K503/-K504 PDW and TCDW ICD: ICD_PDW_TCDW_rev2.4.pdf, included in the repository.</w:t>
       </w:r>
     </w:p>
     <w:p/>
@@ -3119,13 +3604,13 @@
       <w:pPr>
         <w:pStyle w:val="Heading1"/>
       </w:pPr>
-      <w:bookmarkStart w:id="17" w:name="_Ref176516871"/>
-      <w:bookmarkStart w:id="18" w:name="_Toc242882278"/>
+      <w:bookmarkStart w:id="14" w:name="_Ref176516871"/>
+      <w:bookmarkStart w:id="15" w:name="_Toc242889703"/>
       <w:r>
         <w:t>CSV Structure</w:t>
       </w:r>
-      <w:bookmarkEnd w:id="17"/>
-      <w:bookmarkEnd w:id="18"/>
+      <w:bookmarkEnd w:id="14"/>
+      <w:bookmarkEnd w:id="15"/>
     </w:p>
     <w:p>
       <w:pPr>
@@ -3152,7 +3637,7 @@
         <w:rPr>
           <w:rFonts w:ascii="Arial" w:hAnsi="Arial" w:cs="Arial"/>
         </w:rPr>
-        <w:t xml:space="preserve">The script finds each input column by searching the header row for these terms: Type, TOA, Path, Mod, RF, Pulse Width, RF Freq, Level, Frequency Offset, Level Offset, Phase Offset, Freq Step, Chip Width, Bkr Code, Stuff, Burst PRI, Number of Pulses, Marker 1, Marker 2, and Marker 3. For each term, the first column whose header contains it is used. Columns that do not contain any of these terms are ignored. Columns that contain these terms, but are not inputs to the script, might confuse the parser if they come first. For example, if you have a column titled “TOA (clicks)” before the TOA column, the script will read it as the TOA field. The example files combine fields that share a column, such as “Mod/Arb/RF” and “Pulse Width (s)/RF Freq/Level”; keeping their column order avoids these conflicts. Text values such as pdw, tcdw, arb, and rffreq are case-sensitive.</w:t>
+        <w:t>The script finds each input column by searching the header row for these terms: Type, TOA, Path, Mod, RF, Pulse Width, RF Freq, Level, Frequency Offset, Level Offset, Phase Offset, Freq Step, Chip Width, Bkr Code, Stuff, Burst PRI, Number of Pulses, Marker 1, Marker 2, and Marker 3. For each term, the first column whose header contains it is used. Columns that do not contain any of these terms are ignored. Columns that contain these terms, but are not inputs to the script, might confuse the parser if they come first. For example, if you have a column titled “TOA (clicks)” before the TOA column, the script will read it as the TOA field. The example files combine fields that share a column, such as “Mod/Arb/RF” and “Pulse Width (s)/RF Freq/Level”; keeping their column order avoids these conflicts. Text values such as pdw, tcdw, arb, and rffreq are case-sensitive.</w:t>
       </w:r>
     </w:p>
     <w:p>
@@ -3166,6 +3651,7 @@
         <w:rPr>
           <w:rFonts w:ascii="Arial" w:hAnsi="Arial" w:cs="Arial"/>
         </w:rPr>
+        <w:lastRenderedPageBreak/>
         <w:t xml:space="preserve">Use as many columns as necessary for calculating values provided the naming convention is followed. </w:t>
       </w:r>
     </w:p>
@@ -3184,7 +3670,7 @@
           <w:i/>
           <w:iCs/>
         </w:rPr>
-        <w:t xml:space="preserve">Note: An .xlsx file will typically be used to build the list of PDWs and TCDWs since the fields are typically calculated from other fields using formulas. Please save your file as a .csv for an input list. This is so the raw values (not formulas) are saved in each cell.</w:t>
+        <w:t>Note: An .xlsx file will typically be used to build the list of PDWs and TCDWs since the fields are typically calculated from other fields using formulas. Please save your file as a .csv for an input list. This is so the raw values (not formulas) are saved in each cell.</w:t>
       </w:r>
     </w:p>
     <w:p>
@@ -3357,7 +3843,7 @@
           </w:tcPr>
           <w:p>
             <w:r>
-              <w:t xml:space="preserve">tcdw, pdw</w:t>
+              <w:t>tcdw, pdw</w:t>
             </w:r>
           </w:p>
         </w:tc>
@@ -3521,7 +4007,6 @@
           </w:tcPr>
           <w:p>
             <w:r>
-              <w:lastRenderedPageBreak/>
               <w:t>Path</w:t>
             </w:r>
           </w:p>
@@ -3588,7 +4073,7 @@
           </w:tcPr>
           <w:p>
             <w:r>
-              <w:t xml:space="preserve">Sets the desired RF path to configure TCDW types rffreq, rflevel, rffreqlevel</w:t>
+              <w:t>Sets the desired RF path to configure TCDW types rffreq, rflevel, rffreqlevel</w:t>
             </w:r>
           </w:p>
           <w:p>
@@ -3666,7 +4151,7 @@
           </w:p>
           <w:p>
             <w:r>
-              <w:t xml:space="preserve">arb</w:t>
+              <w:t>arb</w:t>
             </w:r>
           </w:p>
         </w:tc>
@@ -3712,7 +4197,7 @@
           </w:tcPr>
           <w:p>
             <w:r>
-              <w:t xml:space="preserve">In PDW, this is the type of pulse modulation. With ‘arb’, the PDW plays a waveform segment from an ARB waveform (.wv) file instead; the Pulse Width column selects which segment.</w:t>
+              <w:t>In PDW, this is the type of pulse modulation. With ‘arb’, the PDW plays a waveform segment from an ARB waveform (.wv) file instead; the Pulse Width column selects which segment.</w:t>
             </w:r>
           </w:p>
         </w:tc>
@@ -3760,7 +4245,7 @@
           </w:tcPr>
           <w:p>
             <w:r>
-              <w:t xml:space="preserve">rffreq, rflevel, rffreqlevel, EOF</w:t>
+              <w:t>rffreq, rflevel, rffreqlevel, EOF</w:t>
             </w:r>
           </w:p>
         </w:tc>
@@ -3806,7 +4291,7 @@
           </w:tcPr>
           <w:p>
             <w:r>
-              <w:t xml:space="preserve">In TCDW, this specifies the type of TCDW. If ‘rffreqlevel’ is used, adjusting the RF frequency &amp; level settings with a single TOA is possible. In this case, use the ‘Level Offset’ column to enter the desired RF level in dBm. If ‘EOF’ is used, the TOA marks the end of the scenario and sets the repetition interval for repeated playback.</w:t>
+              <w:t>In TCDW, this specifies the type of TCDW. If ‘rffreqlevel’ is used, adjusting the RF frequency &amp; level settings with a single TOA is possible. In this case, use the ‘Level Offset’ column to enter the desired RF level in dBm. If ‘EOF’ is used, the TOA marks the end of the scenario and sets the repetition interval for repeated playback.</w:t>
             </w:r>
           </w:p>
         </w:tc>
@@ -3853,7 +4338,7 @@
           </w:tcPr>
           <w:p>
             <w:r>
-              <w:t xml:space="preserve">See ICD (arb: 0, 1, 2, …)</w:t>
+              <w:t>See ICD (arb: 0, 1, 2, …)</w:t>
             </w:r>
           </w:p>
         </w:tc>
@@ -3876,7 +4361,7 @@
           </w:tcPr>
           <w:p>
             <w:r>
-              <w:t xml:space="preserve">seconds</w:t>
+              <w:t>seconds</w:t>
             </w:r>
           </w:p>
         </w:tc>
@@ -3899,7 +4384,7 @@
           </w:tcPr>
           <w:p>
             <w:r>
-              <w:t xml:space="preserve">In PDW, this specifies the pulse width. In ‘arb’ PDWs, it selects the waveform segment instead: 0 is the first file in the GUI’s ARB Waveform Segments list, 1 is the second, and so on.</w:t>
+              <w:t>In PDW, this specifies the pulse width. In ‘arb’ PDWs, it selects the waveform segment instead: 0 is the first file in the GUI’s ARB Waveform Segments list, 1 is the second, and so on.</w:t>
             </w:r>
           </w:p>
         </w:tc>
@@ -4181,7 +4666,7 @@
           </w:tcPr>
           <w:p>
             <w:r>
-              <w:t xml:space="preserve">In PDW, the frequency offset is added to instrument RF frequency specified in the latest rffreq TCDW. For ‘arb’ PDWs, the offset plus half the waveform bandwidth must fit within the baseband bandwidth.</w:t>
+              <w:t>In PDW, the frequency offset is added to instrument RF frequency specified in the latest rffreq TCDW. For ‘arb’ PDWs, the offset plus half the waveform bandwidth must fit within the baseband bandwidth.</w:t>
             </w:r>
           </w:p>
         </w:tc>
@@ -4206,6 +4691,7 @@
           </w:tcPr>
           <w:p>
             <w:r>
+              <w:lastRenderedPageBreak/>
               <w:t>Level Offset</w:t>
             </w:r>
           </w:p>
@@ -4229,7 +4715,7 @@
           </w:tcPr>
           <w:p>
             <w:r>
-              <w:t xml:space="preserve">0 or greater (PDW)</w:t>
+              <w:t>0 or greater (PDW)</w:t>
             </w:r>
           </w:p>
         </w:tc>
@@ -4252,7 +4738,7 @@
           </w:tcPr>
           <w:p>
             <w:r>
-              <w:t xml:space="preserve">dB</w:t>
+              <w:t>dB</w:t>
             </w:r>
           </w:p>
         </w:tc>
@@ -4275,7 +4761,7 @@
           </w:tcPr>
           <w:p>
             <w:r>
-              <w:t xml:space="preserve">In PDW, the level offset is subtracted from instrument RF level specified in the latest rflevel TCDW. It must be 0 or positive, because only attenuation is supported. If using ‘rffreqlevel’ TCDW type, this column sets the RF level in dBm instead (follows same settling time guidelines as ‘Level’ column).</w:t>
+              <w:t>In PDW, the level offset is subtracted from instrument RF level specified in the latest rflevel TCDW. It must be 0 or positive, because only attenuation is supported. If using ‘rffreqlevel’ TCDW type, this column sets the RF level in dBm instead (follows same settling time guidelines as ‘Level’ column).</w:t>
             </w:r>
           </w:p>
         </w:tc>
@@ -4463,7 +4949,7 @@
           </w:tcPr>
           <w:p>
             <w:r>
-              <w:t xml:space="preserve">In Linear Chirp and Tchirp PDWs, this specifies the frequency step in Hz/Sample. This value is dependent on the instrument clock.</w:t>
+              <w:t>In Linear Chirp and Tchirp PDWs, this specifies the frequency step in Hz/Sample. This value is dependent on the instrument clock.</w:t>
             </w:r>
           </w:p>
         </w:tc>
@@ -4557,7 +5043,7 @@
           </w:tcPr>
           <w:p>
             <w:r>
-              <w:t xml:space="preserve">In Bkr Code PDW, this specifies the chip width of one Barker code chip</w:t>
+              <w:t>In Bkr Code PDW, this specifies the chip width of one Barker code chip</w:t>
             </w:r>
           </w:p>
         </w:tc>
@@ -4582,7 +5068,7 @@
           </w:tcPr>
           <w:p>
             <w:r>
-              <w:t xml:space="preserve">Bkr Code</w:t>
+              <w:t>Bkr Code</w:t>
             </w:r>
           </w:p>
         </w:tc>
@@ -4651,7 +5137,7 @@
           </w:tcPr>
           <w:p>
             <w:r>
-              <w:t xml:space="preserve">In Bkr Code PDW, this is the code to select the type of Barker code.</w:t>
+              <w:t>In Bkr Code PDW, this is the code to select the type of Barker code.</w:t>
             </w:r>
           </w:p>
         </w:tc>
@@ -4864,7 +5350,6 @@
           </w:tcPr>
           <w:p>
             <w:r>
-              <w:lastRenderedPageBreak/>
               <w:t>Number of Pulses</w:t>
             </w:r>
           </w:p>
@@ -5225,7 +5710,7 @@
     <w:p/>
     <w:p>
       <w:r>
-        <w:t xml:space="preserve">Please reference the included example .csv files PDWlist.csv, PDWlist_verif.csv, and PDWlist_RF_B.csv</w:t>
+        <w:t>Please reference the included example .csv files PDWlist.csv, PDWlist_verif.csv, and PDWlist_RF_B.csv</w:t>
       </w:r>
     </w:p>
     <w:p>
@@ -5240,7 +5725,7 @@
           <w:i/>
           <w:iCs/>
         </w:rPr>
-        <w:t xml:space="preserve">Note: Every PDW row, including ‘arb’ rows, must have a number in the Frequency Offset, Level Offset, Phase Offset, Burst PRI, Number of Pulses, and Marker 1–3 columns. Use 0 where a value is not needed, and 1 in Number of Pulses for a single pulse. A PDW with Number of Pulses set to 0 is skipped.</w:t>
+        <w:t>Note: Every PDW row, including ‘arb’ rows, must have a number in the Frequency Offset, Level Offset, Phase Offset, Burst PRI, Number of Pulses, and Marker 1–3 columns. Use 0 where a value is not needed, and 1 in Number of Pulses for a single pulse. A PDW with Number of Pulses set to 0 is skipped.</w:t>
       </w:r>
     </w:p>
     <w:p>
@@ -5262,13 +5747,13 @@
       <w:pPr>
         <w:pStyle w:val="Heading1"/>
       </w:pPr>
-      <w:bookmarkStart w:id="19" w:name="_Ref176515172"/>
-      <w:bookmarkStart w:id="20" w:name="_Toc242882279"/>
+      <w:bookmarkStart w:id="16" w:name="_Ref176515172"/>
+      <w:bookmarkStart w:id="17" w:name="_Toc242889704"/>
       <w:r>
         <w:t>Workflow</w:t>
       </w:r>
-      <w:bookmarkEnd w:id="19"/>
-      <w:bookmarkEnd w:id="20"/>
+      <w:bookmarkEnd w:id="16"/>
+      <w:bookmarkEnd w:id="17"/>
     </w:p>
     <w:p>
       <w:pPr>
@@ -5304,7 +5789,7 @@
                     </pic:cNvPicPr>
                   </pic:nvPicPr>
                   <pic:blipFill>
-                    <a:blip r:embed="rId14" cstate="print">
+                    <a:blip r:embed="rId11" cstate="print">
                       <a:extLst>
                         <a:ext uri="{28A0092B-C50C-407E-A947-70E740481C1C}">
                           <a14:useLocalDpi xmlns:a14="http://schemas.microsoft.com/office/drawing/2010/main" val="0"/>
@@ -5351,11 +5836,12 @@
       <w:pPr>
         <w:pStyle w:val="Heading2"/>
       </w:pPr>
-      <w:bookmarkStart w:id="21" w:name="_Toc242882280"/>
-      <w:r>
+      <w:bookmarkStart w:id="18" w:name="_Toc242889705"/>
+      <w:r>
+        <w:lastRenderedPageBreak/>
         <w:t>Build a list of PDWs and TCDWs in .xlsx Format</w:t>
       </w:r>
-      <w:bookmarkEnd w:id="21"/>
+      <w:bookmarkEnd w:id="18"/>
     </w:p>
     <w:p>
       <w:r>
@@ -5395,11 +5881,23 @@
     <w:p>
       <w:r>
         <w:t xml:space="preserve">Please reference Section </w:t>
+      </w:r>
+      <w:r>
         <w:fldChar w:fldCharType="begin"/>
+      </w:r>
+      <w:r>
         <w:instrText xml:space="preserve"> REF _Ref176516871 \n \h </w:instrText>
+      </w:r>
+      <w:r>
         <w:fldChar w:fldCharType="separate"/>
+      </w:r>
+      <w:r>
         <w:t>3</w:t>
+      </w:r>
+      <w:r>
         <w:fldChar w:fldCharType="end"/>
+      </w:r>
+      <w:r>
         <w:t xml:space="preserve"> for further details about the column descriptions and the included .csv files for examples. </w:t>
       </w:r>
     </w:p>
@@ -5407,11 +5905,11 @@
       <w:pPr>
         <w:pStyle w:val="Heading2"/>
       </w:pPr>
-      <w:bookmarkStart w:id="22" w:name="_Toc242882281"/>
+      <w:bookmarkStart w:id="19" w:name="_Toc242889706"/>
       <w:r>
         <w:t>Save to .csv</w:t>
       </w:r>
-      <w:bookmarkEnd w:id="22"/>
+      <w:bookmarkEnd w:id="19"/>
     </w:p>
     <w:p>
       <w:r>
@@ -5422,16 +5920,15 @@
       <w:pPr>
         <w:pStyle w:val="Heading2"/>
       </w:pPr>
-      <w:bookmarkStart w:id="23" w:name="_Toc242882282"/>
-      <w:r>
-        <w:lastRenderedPageBreak/>
+      <w:bookmarkStart w:id="20" w:name="_Toc242889707"/>
+      <w:r>
         <w:t>Run Python Script</w:t>
       </w:r>
-      <w:bookmarkEnd w:id="23"/>
-    </w:p>
-    <w:p>
-      <w:r>
-        <w:t xml:space="preserve">Open a terminal in the repository folder. On Windows, right-click an empty area of the folder in File Explorer and select “Open in Terminal”. On Linux, open a terminal in the folder.</w:t>
+      <w:bookmarkEnd w:id="20"/>
+    </w:p>
+    <w:p>
+      <w:r>
+        <w:t>Open a terminal in the repository folder. On Windows, right-click an empty area of the folder in File Explorer and select “Open in Terminal”. On Linux, open a terminal in the folder.</w:t>
       </w:r>
     </w:p>
     <w:p>
@@ -5439,6 +5936,7 @@
         <w:rPr>
           <w:noProof/>
         </w:rPr>
+        <w:lastRenderedPageBreak/>
         <w:drawing>
           <wp:inline distT="0" distB="0" distL="0" distR="0" wp14:anchorId="486D27F1" wp14:editId="2ABD1F41">
             <wp:extent cx="5810250" cy="4790286"/>
@@ -5455,7 +5953,7 @@
                     <pic:cNvPicPr/>
                   </pic:nvPicPr>
                   <pic:blipFill>
-                    <a:blip r:embed="rId18"/>
+                    <a:blip r:embed="rId14"/>
                     <a:stretch>
                       <a:fillRect/>
                     </a:stretch>
@@ -5479,19 +5977,19 @@
     <w:p/>
     <w:p>
       <w:r>
-        <w:t xml:space="preserve">Start the GUI with the Python environment created in Section 2.3:</w:t>
+        <w:t>Start the GUI with the Python environment created in Section 2.3:</w:t>
       </w:r>
     </w:p>
     <w:p>
       <w:r>
         <w:tab/>
-        <w:t xml:space="preserve">&gt;&gt; .venv\Scripts\python.exe xdw_file_playback.py        (Windows)</w:t>
+        <w:t>&gt;&gt; .venv\Scripts\python.exe xdw_file_playback.py        (Windows)</w:t>
       </w:r>
     </w:p>
     <w:p>
       <w:r>
         <w:tab/>
-        <w:t xml:space="preserve">&gt;&gt; .venv/bin/python xdw_file_playback.py        (Linux)</w:t>
+        <w:t>&gt;&gt; .venv/bin/python xdw_file_playback.py        (Linux)</w:t>
       </w:r>
     </w:p>
     <w:p>
@@ -5516,7 +6014,7 @@
                     <pic:cNvPicPr/>
                   </pic:nvPicPr>
                   <pic:blipFill>
-                    <a:blip r:embed="rId19"/>
+                    <a:blip r:embed="rId15"/>
                     <a:stretch>
                       <a:fillRect/>
                     </a:stretch>
@@ -5565,7 +6063,7 @@
                     <pic:cNvPicPr/>
                   </pic:nvPicPr>
                   <pic:blipFill>
-                    <a:blip r:embed="rId20"/>
+                    <a:blip r:embed="rId16"/>
                     <a:stretch>
                       <a:fillRect/>
                     </a:stretch>
@@ -5633,7 +6131,7 @@
                     <pic:cNvPicPr/>
                   </pic:nvPicPr>
                   <pic:blipFill>
-                    <a:blip r:embed="rId21"/>
+                    <a:blip r:embed="rId17"/>
                     <a:stretch>
                       <a:fillRect/>
                     </a:stretch>
@@ -5733,7 +6231,7 @@
     </w:p>
     <w:p>
       <w:r>
-        <w:t xml:space="preserve">After the files are generated, the Definition file of the SMW Playback and Multi-Sequencer tabs is filled in with the new .ps_def file automatically.</w:t>
+        <w:t>After the files are generated, the Definition file of the SMW Playback and Multi-Sequencer tabs is filled in with the new .ps_def file automatically.</w:t>
       </w:r>
     </w:p>
     <w:p/>
@@ -5741,15 +6239,15 @@
       <w:pPr>
         <w:pStyle w:val="Heading2"/>
       </w:pPr>
-      <w:bookmarkStart w:id="24" w:name="_Toc242882283"/>
-      <w:r>
-        <w:t xml:space="preserve">Transfer Script Output Files to the SMW200A</w:t>
-      </w:r>
-      <w:bookmarkEnd w:id="24"/>
-    </w:p>
-    <w:p>
-      <w:r>
-        <w:t xml:space="preserve">The SMW Playback tab transfers the files and starts playback in one step (see Section 4.5), so a separate transfer is usually not needed. To transfer the files manually instead, there are multiple ways to transfer files to and from the instrument. The FTP method was used here.</w:t>
+      <w:bookmarkStart w:id="21" w:name="_Toc242889708"/>
+      <w:r>
+        <w:t>Transfer Script Output Files to the SMW200A</w:t>
+      </w:r>
+      <w:bookmarkEnd w:id="21"/>
+    </w:p>
+    <w:p>
+      <w:r>
+        <w:t>The SMW Playback tab transfers the files and starts playback in one step (see Section 4.5), so a separate transfer is usually not needed. To transfer the files manually instead, there are multiple ways to transfer files to and from the instrument. The FTP method was used here.</w:t>
       </w:r>
     </w:p>
     <w:p>
@@ -5776,7 +6274,7 @@
                     <pic:cNvPicPr/>
                   </pic:nvPicPr>
                   <pic:blipFill>
-                    <a:blip r:embed="rId22"/>
+                    <a:blip r:embed="rId18"/>
                     <a:stretch>
                       <a:fillRect/>
                     </a:stretch>
@@ -5824,7 +6322,7 @@
                     <pic:cNvPicPr/>
                   </pic:nvPicPr>
                   <pic:blipFill>
-                    <a:blip r:embed="rId23"/>
+                    <a:blip r:embed="rId19"/>
                     <a:stretch>
                       <a:fillRect/>
                     </a:stretch>
@@ -5848,7 +6346,7 @@
     <w:p/>
     <w:p>
       <w:r>
-        <w:t xml:space="preserve">Copy and paste the generated files (the .ps_def, plus the .ps_adr and .wv when arb PDWs are used) under the “user” folder.</w:t>
+        <w:t>Copy and paste the generated files (the .ps_def, plus the .ps_adr and .wv when arb PDWs are used) under the “user” folder.</w:t>
       </w:r>
     </w:p>
     <w:p>
@@ -5872,7 +6370,7 @@
                     <pic:cNvPicPr/>
                   </pic:nvPicPr>
                   <pic:blipFill>
-                    <a:blip r:embed="rId24"/>
+                    <a:blip r:embed="rId20"/>
                     <a:stretch>
                       <a:fillRect/>
                     </a:stretch>
@@ -5897,7 +6395,7 @@
       <w:r>
         <w:t xml:space="preserve">More methods and information can be found in the SMW200A User Manual </w:t>
       </w:r>
-      <w:hyperlink r:id="rId25" w:history="1">
+      <w:hyperlink r:id="rId21" w:history="1">
         <w:r>
           <w:rPr>
             <w:rStyle w:val="Hyperlink"/>
@@ -5911,11 +6409,11 @@
       <w:pPr>
         <w:pStyle w:val="Heading2"/>
       </w:pPr>
-      <w:bookmarkStart w:id="25" w:name="_Toc242882284"/>
+      <w:bookmarkStart w:id="22" w:name="_Toc242889709"/>
       <w:r>
         <w:t>Play the Files Using the Extended Sequencer</w:t>
       </w:r>
-      <w:bookmarkEnd w:id="25"/>
+      <w:bookmarkEnd w:id="22"/>
     </w:p>
     <w:p>
       <w:r>
@@ -5923,7 +6421,7 @@
           <w:b/>
           <w:bCs/>
         </w:rPr>
-        <w:t xml:space="preserve">Using the SMW Playback tab (recommended)</w:t>
+        <w:t>Using the SMW Playback tab (recommended)</w:t>
       </w:r>
     </w:p>
     <w:p>
@@ -5935,7 +6433,7 @@
         </w:numPr>
       </w:pPr>
       <w:r>
-        <w:t xml:space="preserve">Open the “SMW Playback” tab. Under “Instrument”, enter the SMW200A’s IP address and click “Connect”. The “Status” line shows the instrument identification. If the Log shows a warning that SMW-K503 or SMW-K504 is missing, the instrument cannot play xDW files.</w:t>
+        <w:t>Open the “SMW Playback” tab. Under “Instrument”, enter the SMW200A’s IP address and click “Connect”. The “Status” line shows the instrument identification. If the Log shows a warning that SMW-K503 or SMW-K504 is missing, the instrument cannot play xDW files.</w:t>
       </w:r>
     </w:p>
     <w:p>
@@ -5947,7 +6445,8 @@
         </w:numPr>
       </w:pPr>
       <w:r>
-        <w:t xml:space="preserve">“Definition file” is filled in with the last generated .ps_def. To play a different file, click “Browse...”. “Files to transfer” lists the .ps_def and, for lists with arb PDWs, the matching .ps_adr and .wv. “Instrument folder” is the folder on the SMW200A the files are copied to (/var/user by default).</w:t>
+        <w:lastRenderedPageBreak/>
+        <w:t>“Definition file” is filled in with the last generated .ps_def. To play a different file, click “Browse...”. “Files to transfer” lists the .ps_def and, for lists with arb PDWs, the matching .ps_adr and .wv. “Instrument folder” is the folder on the SMW200A the files are copied to (/var/user by default).</w:t>
       </w:r>
     </w:p>
     <w:p>
@@ -5959,7 +6458,7 @@
         </w:numPr>
       </w:pPr>
       <w:r>
-        <w:t xml:space="preserve">Select the “Trigger mode” and “Trigger source”. Leave “Preset instrument before playback” and “Turn RF on” checked unless you need to keep the current instrument settings.</w:t>
+        <w:t>Select the “Trigger mode” and “Trigger source”. Leave “Preset instrument before playback” and “Turn RF on” checked unless you need to keep the current instrument settings.</w:t>
       </w:r>
     </w:p>
     <w:p>
@@ -5971,7 +6470,7 @@
         </w:numPr>
       </w:pPr>
       <w:r>
-        <w:t xml:space="preserve">Click “Transfer &amp; Play”. The tool copies the files, loads the .ps_def in “Playback from File” mode, sets every marker to PDW, routes Baseband A Marker 1 to the T/M/C 1 connector, turns RF on, and turns on the Extended Sequencer.</w:t>
+        <w:t>Click “Transfer &amp; Play”. The tool copies the files, loads the .ps_def in “Playback from File” mode, sets every marker to PDW, routes Baseband A Marker 1 to the T/M/C 1 connector, turns RF on, and turns on the Extended Sequencer.</w:t>
       </w:r>
     </w:p>
     <w:p>
@@ -5983,7 +6482,7 @@
         </w:numPr>
       </w:pPr>
       <w:r>
-        <w:t xml:space="preserve">If the trigger mode is Armed Auto, Armed Retrigger, or Single, playback waits for a trigger. Click “Execute Trigger”, or apply the external trigger if an External Global Trigger source is selected.</w:t>
+        <w:t>If the trigger mode is Armed Auto, Armed Retrigger, or Single, playback waits for a trigger. Click “Execute Trigger”, or apply the external trigger if an External Global Trigger source is selected.</w:t>
       </w:r>
     </w:p>
     <w:p>
@@ -5995,12 +6494,12 @@
         </w:numPr>
       </w:pPr>
       <w:r>
-        <w:t xml:space="preserve">Click “Stop” to turn off the Extended Sequencer, and RF if “Turn RF on” is checked.</w:t>
-      </w:r>
-    </w:p>
-    <w:p>
-      <w:r>
-        <w:t xml:space="preserve">“Transfer Only” copies the files without playing them. “Play” plays files that are already on the instrument.</w:t>
+        <w:t>Click “Stop” to turn off the Extended Sequencer, and RF if “Turn RF on” is checked.</w:t>
+      </w:r>
+    </w:p>
+    <w:p>
+      <w:r>
+        <w:t>“Transfer Only” copies the files without playing them. “Play” plays files that are already on the instrument.</w:t>
       </w:r>
     </w:p>
     <w:p>
@@ -6009,7 +6508,7 @@
           <w:b/>
           <w:bCs/>
         </w:rPr>
-        <w:t xml:space="preserve">Setting up playback manually on the instrument</w:t>
+        <w:t>Setting up playback manually on the instrument</w:t>
       </w:r>
     </w:p>
     <w:p>
@@ -6026,7 +6525,6 @@
         </w:numPr>
       </w:pPr>
       <w:r>
-        <w:lastRenderedPageBreak/>
         <w:t>Navigate to the “Baseband” -&gt; “Extended Sequencer”</w:t>
       </w:r>
       <w:r>
@@ -6049,7 +6547,7 @@
                     <pic:cNvPicPr/>
                   </pic:nvPicPr>
                   <pic:blipFill>
-                    <a:blip r:embed="rId26"/>
+                    <a:blip r:embed="rId22"/>
                     <a:stretch>
                       <a:fillRect/>
                     </a:stretch>
@@ -6079,6 +6577,7 @@
         </w:numPr>
       </w:pPr>
       <w:r>
+        <w:lastRenderedPageBreak/>
         <w:t>Under “Mode”, select “Playback from File”</w:t>
       </w:r>
       <w:r>
@@ -6101,7 +6600,7 @@
                     <pic:cNvPicPr/>
                   </pic:nvPicPr>
                   <pic:blipFill>
-                    <a:blip r:embed="rId27"/>
+                    <a:blip r:embed="rId23"/>
                     <a:stretch>
                       <a:fillRect/>
                     </a:stretch>
@@ -6131,7 +6630,7 @@
         </w:numPr>
       </w:pPr>
       <w:r>
-        <w:t xml:space="preserve">Next, press “Definition File” and navigate to the generated .ps_def file.</w:t>
+        <w:t>Next, press “Definition File” and navigate to the generated .ps_def file.</w:t>
       </w:r>
     </w:p>
     <w:p>
@@ -6147,7 +6646,6 @@
         <w:rPr>
           <w:noProof/>
         </w:rPr>
-        <w:lastRenderedPageBreak/>
         <w:drawing>
           <wp:inline distT="0" distB="0" distL="0" distR="0" wp14:anchorId="676AEA9B" wp14:editId="5494D2E3">
             <wp:extent cx="4994989" cy="3686175"/>
@@ -6164,7 +6662,7 @@
                     <pic:cNvPicPr/>
                   </pic:nvPicPr>
                   <pic:blipFill>
-                    <a:blip r:embed="rId28"/>
+                    <a:blip r:embed="rId24"/>
                     <a:stretch>
                       <a:fillRect/>
                     </a:stretch>
@@ -6210,6 +6708,7 @@
         <w:rPr>
           <w:noProof/>
         </w:rPr>
+        <w:lastRenderedPageBreak/>
         <w:drawing>
           <wp:inline distT="0" distB="0" distL="0" distR="0" wp14:anchorId="23C3AD19" wp14:editId="2263E83B">
             <wp:extent cx="5076481" cy="3790950"/>
@@ -6226,7 +6725,7 @@
                     <pic:cNvPicPr/>
                   </pic:nvPicPr>
                   <pic:blipFill>
-                    <a:blip r:embed="rId29"/>
+                    <a:blip r:embed="rId25"/>
                     <a:stretch>
                       <a:fillRect/>
                     </a:stretch>
@@ -6256,7 +6755,7 @@
         </w:numPr>
       </w:pPr>
       <w:r>
-        <w:t xml:space="preserve">Go to the “Marker” tab and ensure every marker type is selected to PDW. This ensures the SMW200A scans the incoming PDWs for Markers. The default selection is “Restart”.</w:t>
+        <w:t>Go to the “Marker” tab and ensure every marker type is selected to PDW. This ensures the SMW200A scans the incoming PDWs for Markers. The default selection is “Restart”.</w:t>
       </w:r>
     </w:p>
     <w:p>
@@ -6272,7 +6771,6 @@
         <w:rPr>
           <w:noProof/>
         </w:rPr>
-        <w:lastRenderedPageBreak/>
         <w:drawing>
           <wp:inline distT="0" distB="0" distL="0" distR="0" wp14:anchorId="4762C173" wp14:editId="49539809">
             <wp:extent cx="4813300" cy="3626779"/>
@@ -6289,7 +6787,7 @@
                     <pic:cNvPicPr/>
                   </pic:nvPicPr>
                   <pic:blipFill>
-                    <a:blip r:embed="rId30"/>
+                    <a:blip r:embed="rId26"/>
                     <a:stretch>
                       <a:fillRect/>
                     </a:stretch>
@@ -6335,6 +6833,7 @@
         <w:rPr>
           <w:noProof/>
         </w:rPr>
+        <w:lastRenderedPageBreak/>
         <w:drawing>
           <wp:inline distT="0" distB="0" distL="0" distR="0" wp14:anchorId="4A7970B2" wp14:editId="79282B00">
             <wp:extent cx="4886325" cy="3635806"/>
@@ -6351,7 +6850,7 @@
                     <pic:cNvPicPr/>
                   </pic:nvPicPr>
                   <pic:blipFill>
-                    <a:blip r:embed="rId31"/>
+                    <a:blip r:embed="rId27"/>
                     <a:stretch>
                       <a:fillRect/>
                     </a:stretch>
@@ -6397,7 +6896,6 @@
         <w:rPr>
           <w:noProof/>
         </w:rPr>
-        <w:lastRenderedPageBreak/>
         <w:drawing>
           <wp:inline distT="0" distB="0" distL="0" distR="0" wp14:anchorId="6E9D441F" wp14:editId="4065CDDF">
             <wp:extent cx="4953000" cy="3623934"/>
@@ -6414,7 +6912,7 @@
                     <pic:cNvPicPr/>
                   </pic:nvPicPr>
                   <pic:blipFill>
-                    <a:blip r:embed="rId32"/>
+                    <a:blip r:embed="rId28"/>
                     <a:stretch>
                       <a:fillRect/>
                     </a:stretch>
@@ -6444,7 +6942,7 @@
         </w:numPr>
       </w:pPr>
       <w:r>
-        <w:t xml:space="preserve">Under “Trigger In” tab, select “Execute Trigger” (if using an armed trigger mode, such as Armed Auto or Armed Retrigger).</w:t>
+        <w:t>Under “Trigger In” tab, select “Execute Trigger” (if using an armed trigger mode, such as Armed Auto or Armed Retrigger).</w:t>
       </w:r>
     </w:p>
     <w:p>
@@ -6460,6 +6958,7 @@
         <w:rPr>
           <w:noProof/>
         </w:rPr>
+        <w:lastRenderedPageBreak/>
         <w:drawing>
           <wp:inline distT="0" distB="0" distL="0" distR="0" wp14:anchorId="75D7616C" wp14:editId="24972EFE">
             <wp:extent cx="4924425" cy="3627478"/>
@@ -6476,7 +6975,7 @@
                     <pic:cNvPicPr/>
                   </pic:nvPicPr>
                   <pic:blipFill>
-                    <a:blip r:embed="rId33"/>
+                    <a:blip r:embed="rId29"/>
                     <a:stretch>
                       <a:fillRect/>
                     </a:stretch>
@@ -6501,31 +7000,30 @@
       <w:pPr>
         <w:pStyle w:val="Heading1"/>
       </w:pPr>
-      <w:bookmarkStart w:id="26" w:name="_Toc242882285"/>
-      <w:r>
-        <w:lastRenderedPageBreak/>
+      <w:bookmarkStart w:id="23" w:name="_Toc242889710"/>
+      <w:r>
         <w:t>Optional Capabilities</w:t>
       </w:r>
-      <w:bookmarkEnd w:id="26"/>
+      <w:bookmarkEnd w:id="23"/>
     </w:p>
     <w:p>
       <w:pPr>
         <w:pStyle w:val="Heading2"/>
       </w:pPr>
-      <w:bookmarkStart w:id="27" w:name="_Toc242882286"/>
+      <w:bookmarkStart w:id="24" w:name="_Toc242889711"/>
       <w:r>
         <w:t>Extended Sequencer Advanced</w:t>
       </w:r>
-      <w:bookmarkEnd w:id="27"/>
-    </w:p>
-    <w:p>
-      <w:r>
-        <w:t xml:space="preserve">This allows for multiple files to be loaded onto different hardware resources. A sequencer is a unit of resource. There are up to 6 supported sequencers, determined by the hardware configuration (see the optional SMW-B15 in Section 2.1).</w:t>
-      </w:r>
-    </w:p>
-    <w:p>
-      <w:r>
-        <w:t xml:space="preserve">The “Multi-Sequencer” tab loads a separate file onto each sequencer. The outputs can be directed to RF A or RF B. If more than one sequencer is directed to one RF port, the outputs are summed. This allows for pulse-on-pulse modulation (provided the SMW is equipped with the K315 option).</w:t>
+      <w:bookmarkEnd w:id="24"/>
+    </w:p>
+    <w:p>
+      <w:r>
+        <w:t>This allows for multiple files to be loaded onto different hardware resources. A sequencer is a unit of resource. There are up to 6 supported sequencers, determined by the hardware configuration (see the optional SMW-B15 in Section 2.1).</w:t>
+      </w:r>
+    </w:p>
+    <w:p>
+      <w:r>
+        <w:t>The “Multi-Sequencer” tab loads a separate file onto each sequencer. The outputs can be directed to RF A or RF B. If more than one sequencer is directed to one RF port, the outputs are summed. This allows for pulse-on-pulse modulation (provided the SMW is equipped with the K315 option).</w:t>
       </w:r>
     </w:p>
     <w:p>
@@ -6537,7 +7035,7 @@
         </w:numPr>
       </w:pPr>
       <w:r>
-        <w:t xml:space="preserve">Connect to the instrument under “Instrument”. The connection is shared with the SMW Playback tab.</w:t>
+        <w:t>Connect to the instrument under “Instrument”. The connection is shared with the SMW Playback tab.</w:t>
       </w:r>
     </w:p>
     <w:p>
@@ -6549,7 +7047,7 @@
         </w:numPr>
       </w:pPr>
       <w:r>
-        <w:t xml:space="preserve">If “System mode” is not Extended Sequencer Advanced, click “Switch to Extended Sequencer Advanced Mode”. This changes System Config &gt; Fading/Baseband Config &gt; Mode on the instrument and can take a minute or more. Loading a file also switches the mode automatically.</w:t>
+        <w:t>If “System mode” is not Extended Sequencer Advanced, click “Switch to Extended Sequencer Advanced Mode”. This changes System Config &gt; Fading/Baseband Config &gt; Mode on the instrument and can take a minute or more. Loading a file also switches the mode automatically.</w:t>
       </w:r>
     </w:p>
     <w:p>
@@ -6561,7 +7059,7 @@
         </w:numPr>
       </w:pPr>
       <w:r>
-        <w:t xml:space="preserve">For each sequencer, select the “Definition file” and the “Sequencer” (S1–S6), then click “Transfer &amp; Load”.</w:t>
+        <w:t>For each sequencer, select the “Definition file” and the “Sequencer” (S1–S6), then click “Transfer &amp; Load”.</w:t>
       </w:r>
     </w:p>
     <w:p>
@@ -6573,7 +7071,7 @@
         </w:numPr>
       </w:pPr>
       <w:r>
-        <w:t xml:space="preserve">In the “Sequencers” table, set each sequencer’s “On”, “Stream”, “Freq offset” (MHz), “Attenuation” (dB), and “Trigger delay” (us). Then set each stream’s output to RF A, RF B, or None. A stream can only hold a limited number of sequencers; the tool warns if too many are assigned to one stream.</w:t>
+        <w:t>In the “Sequencers” table, set each sequencer’s “On”, “Stream”, “Freq offset” (MHz), “Attenuation” (dB), and “Trigger delay” (us). Then set each stream’s output to RF A, RF B, or None. A stream can only hold a limited number of sequencers; the tool warns if too many are assigned to one stream.</w:t>
       </w:r>
     </w:p>
     <w:p>
@@ -6585,7 +7083,7 @@
         </w:numPr>
       </w:pPr>
       <w:r>
-        <w:t xml:space="preserve">Select the “Trigger source”. The trigger mode is always Armed Auto, the only mode supported for Playback from File in advanced mode. With the internal trigger source and “Start immediately” checked, “Play All” starts all sequencers together. Otherwise, click “Execute Trigger” or apply the external trigger.</w:t>
+        <w:t>Select the “Trigger source”. The trigger mode is always Armed Auto, the only mode supported for Playback from File in advanced mode. With the internal trigger source and “Start immediately” checked, “Play All” starts all sequencers together. Otherwise, click “Execute Trigger” or apply the external trigger.</w:t>
       </w:r>
     </w:p>
     <w:p>
@@ -6597,12 +7095,13 @@
         </w:numPr>
       </w:pPr>
       <w:r>
-        <w:t xml:space="preserve">Click “Play All”. Click “Stop” to turn off the Extended Sequencer and the RF outputs in use.</w:t>
-      </w:r>
-    </w:p>
-    <w:p>
-      <w:r>
-        <w:t xml:space="preserve">“Refresh from Instrument” reads the current sequencer settings back from the SMW200A.</w:t>
+        <w:lastRenderedPageBreak/>
+        <w:t>Click “Play All”. Click “Stop” to turn off the Extended Sequencer and the RF outputs in use.</w:t>
+      </w:r>
+    </w:p>
+    <w:p>
+      <w:r>
+        <w:t>“Refresh from Instrument” reads the current sequencer settings back from the SMW200A.</w:t>
       </w:r>
     </w:p>
     <w:p>
@@ -6626,7 +7125,7 @@
                     <pic:cNvPicPr/>
                   </pic:nvPicPr>
                   <pic:blipFill>
-                    <a:blip r:embed="rId34"/>
+                    <a:blip r:embed="rId30"/>
                     <a:stretch>
                       <a:fillRect/>
                     </a:stretch>
@@ -6669,7 +7168,7 @@
                     <pic:cNvPicPr/>
                   </pic:nvPicPr>
                   <pic:blipFill>
-                    <a:blip r:embed="rId35"/>
+                    <a:blip r:embed="rId31"/>
                     <a:stretch>
                       <a:fillRect/>
                     </a:stretch>
@@ -6711,7 +7210,7 @@
                     <pic:cNvPicPr/>
                   </pic:nvPicPr>
                   <pic:blipFill>
-                    <a:blip r:embed="rId36"/>
+                    <a:blip r:embed="rId32"/>
                     <a:stretch>
                       <a:fillRect/>
                     </a:stretch>
@@ -6736,11 +7235,11 @@
       <w:pPr>
         <w:pStyle w:val="Heading1"/>
       </w:pPr>
-      <w:bookmarkStart w:id="28" w:name="_Toc242882287"/>
+      <w:bookmarkStart w:id="25" w:name="_Toc242889712"/>
       <w:r>
         <w:t>Q&amp;A</w:t>
       </w:r>
-      <w:bookmarkEnd w:id="28"/>
+      <w:bookmarkEnd w:id="25"/>
     </w:p>
     <w:p>
       <w:r>
@@ -6750,12 +7249,12 @@
     <w:p/>
     <w:p/>
     <w:sectPr>
-      <w:headerReference w:type="even" r:id="rId37"/>
-      <w:headerReference w:type="default" r:id="rId38"/>
-      <w:footerReference w:type="even" r:id="rId39"/>
-      <w:footerReference w:type="default" r:id="rId40"/>
-      <w:headerReference w:type="first" r:id="rId41"/>
-      <w:footerReference w:type="first" r:id="rId42"/>
+      <w:headerReference w:type="even" r:id="rId33"/>
+      <w:headerReference w:type="default" r:id="rId34"/>
+      <w:footerReference w:type="even" r:id="rId35"/>
+      <w:footerReference w:type="default" r:id="rId36"/>
+      <w:headerReference w:type="first" r:id="rId37"/>
+      <w:footerReference w:type="first" r:id="rId38"/>
       <w:pgSz w:w="11906" w:h="16838"/>
       <w:pgMar w:top="1701" w:right="992" w:bottom="1134" w:left="1247" w:header="709" w:footer="709" w:gutter="0"/>
       <w:cols w:space="708"/>
@@ -9367,13 +9866,13 @@
   <w:num w:numId="21" w16cid:durableId="347802969">
     <w:abstractNumId w:val="10"/>
   </w:num>
-  <w:num w:numId="22">
+  <w:num w:numId="22" w16cid:durableId="317225336">
     <w:abstractNumId w:val="20"/>
     <w:lvlOverride w:ilvl="0">
       <w:startOverride w:val="1"/>
     </w:lvlOverride>
   </w:num>
-  <w:num w:numId="23">
+  <w:num w:numId="23" w16cid:durableId="2144150498">
     <w:abstractNumId w:val="20"/>
     <w:lvlOverride w:ilvl="0">
       <w:startOverride w:val="1"/>
@@ -9958,6 +10457,7 @@
   <w:style w:type="character" w:default="1" w:styleId="DefaultParagraphFont">
     <w:name w:val="Default Paragraph Font"/>
     <w:uiPriority w:val="1"/>
+    <w:semiHidden/>
     <w:unhideWhenUsed/>
   </w:style>
   <w:style w:type="table" w:default="1" w:styleId="TableNormal">

</xml_diff>